<commit_message>
feat(database): enforce 100% full multi-table Neon PostgreSQL DB integration across all 10 schema tables
</commit_message>
<xml_diff>
--- a/Proposal_Satria Alba Pramasha.docx
+++ b/Proposal_Satria Alba Pramasha.docx
@@ -295,247 +295,78 @@
           <w:szCs w:val="36"/>
         </w:rPr>
       </w:pPr>
-      <w:proofErr w:type="spellStart"/>
-      <w:r>
-        <w:rPr>
-          <w:rFonts w:ascii="Times New Roman" w:hAnsi="Times New Roman" w:cs="Times New Roman"/>
+      <w:r/>
+      <w:r>
+        <w:rPr>
+          <w:rFonts w:ascii="Times New Roman" w:hAnsi="Times New Roman"/>
           <w:b/>
-          <w:bCs/>
+          <w:i/>
           <w:sz w:val="32"/>
-          <w:szCs w:val="32"/>
-        </w:rPr>
-        <w:t>Rancang</w:t>
-      </w:r>
-      <w:proofErr w:type="spellEnd"/>
-      <w:r>
-        <w:rPr>
-          <w:rFonts w:ascii="Times New Roman" w:hAnsi="Times New Roman" w:cs="Times New Roman"/>
+        </w:rPr>
+        <w:t>SecSent</w:t>
+      </w:r>
+      <w:r>
+        <w:rPr>
+          <w:rFonts w:ascii="Times New Roman" w:hAnsi="Times New Roman"/>
           <w:b/>
-          <w:bCs/>
+          <w:i w:val="0"/>
           <w:sz w:val="32"/>
-          <w:szCs w:val="32"/>
-        </w:rPr>
-        <w:t xml:space="preserve"> </w:t>
-      </w:r>
-      <w:proofErr w:type="spellStart"/>
-      <w:r>
-        <w:rPr>
-          <w:rFonts w:ascii="Times New Roman" w:hAnsi="Times New Roman" w:cs="Times New Roman"/>
+        </w:rPr>
+        <w:t xml:space="preserve">: Rancang Bangun Sistem Persuratan Digital Berarsitektur </w:t>
+      </w:r>
+      <w:r>
+        <w:rPr>
+          <w:rFonts w:ascii="Times New Roman" w:hAnsi="Times New Roman"/>
           <w:b/>
-          <w:bCs/>
+          <w:i/>
           <w:sz w:val="32"/>
-          <w:szCs w:val="32"/>
-        </w:rPr>
-        <w:t>Bangun</w:t>
-      </w:r>
-      <w:proofErr w:type="spellEnd"/>
-      <w:r>
-        <w:rPr>
-          <w:rFonts w:ascii="Times New Roman" w:hAnsi="Times New Roman" w:cs="Times New Roman"/>
+        </w:rPr>
+        <w:t>Zero-Trust</w:t>
+      </w:r>
+      <w:r>
+        <w:rPr>
+          <w:rFonts w:ascii="Times New Roman" w:hAnsi="Times New Roman"/>
           <w:b/>
-          <w:bCs/>
+          <w:i w:val="0"/>
           <w:sz w:val="32"/>
-          <w:szCs w:val="32"/>
-        </w:rPr>
-        <w:t xml:space="preserve"> </w:t>
-      </w:r>
-      <w:proofErr w:type="spellStart"/>
-      <w:r>
-        <w:rPr>
-          <w:rFonts w:ascii="Times New Roman" w:hAnsi="Times New Roman" w:cs="Times New Roman"/>
+        </w:rPr>
+        <w:t xml:space="preserve"> dengan Kriptografi Hibrida dan </w:t>
+      </w:r>
+      <w:r>
+        <w:rPr>
+          <w:rFonts w:ascii="Times New Roman" w:hAnsi="Times New Roman"/>
           <w:b/>
-          <w:bCs/>
+          <w:i/>
           <w:sz w:val="32"/>
-          <w:szCs w:val="32"/>
-        </w:rPr>
-        <w:t>Sistem</w:t>
-      </w:r>
-      <w:proofErr w:type="spellEnd"/>
-      <w:r>
-        <w:rPr>
-          <w:rFonts w:ascii="Times New Roman" w:hAnsi="Times New Roman" w:cs="Times New Roman"/>
+        </w:rPr>
+        <w:t>Multi-Agentic AI</w:t>
+      </w:r>
+      <w:r>
+        <w:rPr>
+          <w:rFonts w:ascii="Times New Roman" w:hAnsi="Times New Roman"/>
           <w:b/>
-          <w:bCs/>
+          <w:i w:val="0"/>
           <w:sz w:val="32"/>
-          <w:szCs w:val="32"/>
-        </w:rPr>
-        <w:t xml:space="preserve"> </w:t>
-      </w:r>
-      <w:proofErr w:type="spellStart"/>
-      <w:r>
-        <w:rPr>
-          <w:rFonts w:ascii="Times New Roman" w:hAnsi="Times New Roman" w:cs="Times New Roman"/>
+        </w:rPr>
+        <w:t xml:space="preserve"> untuk Mitigasi </w:t>
+      </w:r>
+      <w:r>
+        <w:rPr>
+          <w:rFonts w:ascii="Times New Roman" w:hAnsi="Times New Roman"/>
           <w:b/>
-          <w:bCs/>
+          <w:i/>
           <w:sz w:val="32"/>
-          <w:szCs w:val="32"/>
-        </w:rPr>
-        <w:t>Informasi</w:t>
-      </w:r>
-      <w:proofErr w:type="spellEnd"/>
-      <w:r>
-        <w:rPr>
-          <w:rFonts w:ascii="Times New Roman" w:hAnsi="Times New Roman" w:cs="Times New Roman"/>
+        </w:rPr>
+        <w:t>Insider Threat</w:t>
+      </w:r>
+      <w:r>
+        <w:rPr>
+          <w:rFonts w:ascii="Times New Roman" w:hAnsi="Times New Roman"/>
           <w:b/>
-          <w:bCs/>
+          <w:i w:val="0"/>
           <w:sz w:val="32"/>
-          <w:szCs w:val="32"/>
-        </w:rPr>
-        <w:t xml:space="preserve"> </w:t>
-      </w:r>
-      <w:proofErr w:type="spellStart"/>
-      <w:r>
-        <w:rPr>
-          <w:rFonts w:ascii="Times New Roman" w:hAnsi="Times New Roman" w:cs="Times New Roman"/>
-          <w:b/>
-          <w:bCs/>
-          <w:sz w:val="32"/>
-          <w:szCs w:val="32"/>
-        </w:rPr>
-        <w:t>Persuratan</w:t>
-      </w:r>
-      <w:proofErr w:type="spellEnd"/>
-      <w:r>
-        <w:rPr>
-          <w:rFonts w:ascii="Times New Roman" w:hAnsi="Times New Roman" w:cs="Times New Roman"/>
-          <w:b/>
-          <w:bCs/>
-          <w:sz w:val="32"/>
-          <w:szCs w:val="32"/>
-        </w:rPr>
-        <w:t xml:space="preserve"> Digital </w:t>
-      </w:r>
-      <w:r>
-        <w:rPr>
-          <w:rFonts w:ascii="Times New Roman" w:hAnsi="Times New Roman" w:cs="Times New Roman"/>
-          <w:b/>
-          <w:bCs/>
-          <w:i/>
-          <w:iCs/>
-          <w:sz w:val="32"/>
-          <w:szCs w:val="32"/>
-        </w:rPr>
-        <w:t>Zero-Trust</w:t>
-      </w:r>
-      <w:r>
-        <w:rPr>
-          <w:rFonts w:ascii="Times New Roman" w:hAnsi="Times New Roman" w:cs="Times New Roman"/>
-          <w:b/>
-          <w:bCs/>
-          <w:sz w:val="32"/>
-          <w:szCs w:val="32"/>
-        </w:rPr>
-        <w:t xml:space="preserve"> (</w:t>
-      </w:r>
-      <w:proofErr w:type="spellStart"/>
-      <w:r>
-        <w:rPr>
-          <w:rFonts w:ascii="Times New Roman" w:hAnsi="Times New Roman" w:cs="Times New Roman"/>
-          <w:b/>
-          <w:bCs/>
-          <w:sz w:val="32"/>
-          <w:szCs w:val="32"/>
-        </w:rPr>
-        <w:t>SecureOffice</w:t>
-      </w:r>
-      <w:proofErr w:type="spellEnd"/>
-      <w:r>
-        <w:rPr>
-          <w:rFonts w:ascii="Times New Roman" w:hAnsi="Times New Roman" w:cs="Times New Roman"/>
-          <w:b/>
-          <w:bCs/>
-          <w:sz w:val="32"/>
-          <w:szCs w:val="32"/>
-        </w:rPr>
-        <w:t xml:space="preserve">-AI) </w:t>
-      </w:r>
-      <w:proofErr w:type="spellStart"/>
-      <w:r>
-        <w:rPr>
-          <w:rFonts w:ascii="Times New Roman" w:hAnsi="Times New Roman" w:cs="Times New Roman"/>
-          <w:b/>
-          <w:bCs/>
-          <w:sz w:val="32"/>
-          <w:szCs w:val="32"/>
-        </w:rPr>
-        <w:t>Berbasis</w:t>
-      </w:r>
-      <w:proofErr w:type="spellEnd"/>
-      <w:r>
-        <w:rPr>
-          <w:rFonts w:ascii="Times New Roman" w:hAnsi="Times New Roman" w:cs="Times New Roman"/>
-          <w:b/>
-          <w:bCs/>
-          <w:sz w:val="32"/>
-          <w:szCs w:val="32"/>
-        </w:rPr>
-        <w:t xml:space="preserve"> Web </w:t>
-      </w:r>
-      <w:proofErr w:type="spellStart"/>
-      <w:r>
-        <w:rPr>
-          <w:rFonts w:ascii="Times New Roman" w:hAnsi="Times New Roman" w:cs="Times New Roman"/>
-          <w:b/>
-          <w:bCs/>
-          <w:sz w:val="32"/>
-          <w:szCs w:val="32"/>
-        </w:rPr>
-        <w:t>dengan</w:t>
-      </w:r>
-      <w:proofErr w:type="spellEnd"/>
-      <w:r>
-        <w:rPr>
-          <w:rFonts w:ascii="Times New Roman" w:hAnsi="Times New Roman" w:cs="Times New Roman"/>
-          <w:b/>
-          <w:bCs/>
-          <w:sz w:val="32"/>
-          <w:szCs w:val="32"/>
-        </w:rPr>
-        <w:t xml:space="preserve"> </w:t>
-      </w:r>
-      <w:proofErr w:type="spellStart"/>
-      <w:r>
-        <w:rPr>
-          <w:rFonts w:ascii="Times New Roman" w:hAnsi="Times New Roman" w:cs="Times New Roman"/>
-          <w:b/>
-          <w:bCs/>
-          <w:sz w:val="32"/>
-          <w:szCs w:val="32"/>
-        </w:rPr>
-        <w:t>Kriptografi</w:t>
-      </w:r>
-      <w:proofErr w:type="spellEnd"/>
-      <w:r>
-        <w:rPr>
-          <w:rFonts w:ascii="Times New Roman" w:hAnsi="Times New Roman" w:cs="Times New Roman"/>
-          <w:b/>
-          <w:bCs/>
-          <w:sz w:val="32"/>
-          <w:szCs w:val="32"/>
-        </w:rPr>
-        <w:t xml:space="preserve"> </w:t>
-      </w:r>
-      <w:proofErr w:type="spellStart"/>
-      <w:r>
-        <w:rPr>
-          <w:rFonts w:ascii="Times New Roman" w:hAnsi="Times New Roman" w:cs="Times New Roman"/>
-          <w:b/>
-          <w:bCs/>
-          <w:sz w:val="32"/>
-          <w:szCs w:val="32"/>
-        </w:rPr>
-        <w:t>Hibrida</w:t>
-      </w:r>
-      <w:proofErr w:type="spellEnd"/>
-      <w:r>
-        <w:rPr>
-          <w:rFonts w:ascii="Times New Roman" w:hAnsi="Times New Roman" w:cs="Times New Roman"/>
-          <w:b/>
-          <w:bCs/>
-          <w:sz w:val="32"/>
-          <w:szCs w:val="32"/>
-        </w:rPr>
-        <w:t xml:space="preserve"> dan Multi-Agentic AI Subsystem</w:t>
+        </w:rPr>
+        <w:t xml:space="preserve"> dan Kebocoran Data (Studi Kasus: Unit Kerja Instansi Pemerintah)</w:t>
       </w:r>
     </w:p>
     <w:p>
@@ -1190,225 +1021,78 @@
           <w:szCs w:val="36"/>
         </w:rPr>
       </w:pPr>
-      <w:proofErr w:type="spellStart"/>
-      <w:r>
-        <w:rPr>
-          <w:rFonts w:ascii="Times New Roman" w:hAnsi="Times New Roman" w:cs="Times New Roman"/>
+      <w:r/>
+      <w:r>
+        <w:rPr>
+          <w:rFonts w:ascii="Times New Roman" w:hAnsi="Times New Roman"/>
           <w:b/>
-          <w:bCs/>
+          <w:i/>
           <w:sz w:val="32"/>
-          <w:szCs w:val="32"/>
-        </w:rPr>
-        <w:t>Rancang</w:t>
-      </w:r>
-      <w:proofErr w:type="spellEnd"/>
-      <w:r>
-        <w:rPr>
-          <w:rFonts w:ascii="Times New Roman" w:hAnsi="Times New Roman" w:cs="Times New Roman"/>
+        </w:rPr>
+        <w:t>SecSent</w:t>
+      </w:r>
+      <w:r>
+        <w:rPr>
+          <w:rFonts w:ascii="Times New Roman" w:hAnsi="Times New Roman"/>
           <w:b/>
-          <w:bCs/>
+          <w:i w:val="0"/>
           <w:sz w:val="32"/>
-          <w:szCs w:val="32"/>
-        </w:rPr>
-        <w:t xml:space="preserve"> </w:t>
-      </w:r>
-      <w:proofErr w:type="spellStart"/>
-      <w:r>
-        <w:rPr>
-          <w:rFonts w:ascii="Times New Roman" w:hAnsi="Times New Roman" w:cs="Times New Roman"/>
+        </w:rPr>
+        <w:t xml:space="preserve">: Rancang Bangun Sistem Persuratan Digital Berarsitektur </w:t>
+      </w:r>
+      <w:r>
+        <w:rPr>
+          <w:rFonts w:ascii="Times New Roman" w:hAnsi="Times New Roman"/>
           <w:b/>
-          <w:bCs/>
+          <w:i/>
           <w:sz w:val="32"/>
-          <w:szCs w:val="32"/>
-        </w:rPr>
-        <w:t>Bangun</w:t>
-      </w:r>
-      <w:proofErr w:type="spellEnd"/>
-      <w:r>
-        <w:rPr>
-          <w:rFonts w:ascii="Times New Roman" w:hAnsi="Times New Roman" w:cs="Times New Roman"/>
+        </w:rPr>
+        <w:t>Zero-Trust</w:t>
+      </w:r>
+      <w:r>
+        <w:rPr>
+          <w:rFonts w:ascii="Times New Roman" w:hAnsi="Times New Roman"/>
           <w:b/>
-          <w:bCs/>
+          <w:i w:val="0"/>
           <w:sz w:val="32"/>
-          <w:szCs w:val="32"/>
-        </w:rPr>
-        <w:t xml:space="preserve"> </w:t>
-      </w:r>
-      <w:proofErr w:type="spellStart"/>
-      <w:r>
-        <w:rPr>
-          <w:rFonts w:ascii="Times New Roman" w:hAnsi="Times New Roman" w:cs="Times New Roman"/>
+        </w:rPr>
+        <w:t xml:space="preserve"> dengan Kriptografi Hibrida dan </w:t>
+      </w:r>
+      <w:r>
+        <w:rPr>
+          <w:rFonts w:ascii="Times New Roman" w:hAnsi="Times New Roman"/>
           <w:b/>
-          <w:bCs/>
+          <w:i/>
           <w:sz w:val="32"/>
-          <w:szCs w:val="32"/>
-        </w:rPr>
-        <w:t>Sistem</w:t>
-      </w:r>
-      <w:proofErr w:type="spellEnd"/>
-      <w:r>
-        <w:rPr>
-          <w:rFonts w:ascii="Times New Roman" w:hAnsi="Times New Roman" w:cs="Times New Roman"/>
+        </w:rPr>
+        <w:t>Multi-Agentic AI</w:t>
+      </w:r>
+      <w:r>
+        <w:rPr>
+          <w:rFonts w:ascii="Times New Roman" w:hAnsi="Times New Roman"/>
           <w:b/>
-          <w:bCs/>
+          <w:i w:val="0"/>
           <w:sz w:val="32"/>
-          <w:szCs w:val="32"/>
-        </w:rPr>
-        <w:t xml:space="preserve"> </w:t>
-      </w:r>
-      <w:proofErr w:type="spellStart"/>
-      <w:r>
-        <w:rPr>
-          <w:rFonts w:ascii="Times New Roman" w:hAnsi="Times New Roman" w:cs="Times New Roman"/>
+        </w:rPr>
+        <w:t xml:space="preserve"> untuk Mitigasi </w:t>
+      </w:r>
+      <w:r>
+        <w:rPr>
+          <w:rFonts w:ascii="Times New Roman" w:hAnsi="Times New Roman"/>
           <w:b/>
-          <w:bCs/>
+          <w:i/>
           <w:sz w:val="32"/>
-          <w:szCs w:val="32"/>
-        </w:rPr>
-        <w:t>Informasi</w:t>
-      </w:r>
-      <w:proofErr w:type="spellEnd"/>
-      <w:r>
-        <w:rPr>
-          <w:rFonts w:ascii="Times New Roman" w:hAnsi="Times New Roman" w:cs="Times New Roman"/>
+        </w:rPr>
+        <w:t>Insider Threat</w:t>
+      </w:r>
+      <w:r>
+        <w:rPr>
+          <w:rFonts w:ascii="Times New Roman" w:hAnsi="Times New Roman"/>
           <w:b/>
-          <w:bCs/>
+          <w:i w:val="0"/>
           <w:sz w:val="32"/>
-          <w:szCs w:val="32"/>
-        </w:rPr>
-        <w:t xml:space="preserve"> </w:t>
-      </w:r>
-      <w:proofErr w:type="spellStart"/>
-      <w:r>
-        <w:rPr>
-          <w:rFonts w:ascii="Times New Roman" w:hAnsi="Times New Roman" w:cs="Times New Roman"/>
-          <w:b/>
-          <w:bCs/>
-          <w:sz w:val="32"/>
-          <w:szCs w:val="32"/>
-        </w:rPr>
-        <w:t>Persuratan</w:t>
-      </w:r>
-      <w:proofErr w:type="spellEnd"/>
-      <w:r>
-        <w:rPr>
-          <w:rFonts w:ascii="Times New Roman" w:hAnsi="Times New Roman" w:cs="Times New Roman"/>
-          <w:b/>
-          <w:bCs/>
-          <w:sz w:val="32"/>
-          <w:szCs w:val="32"/>
-        </w:rPr>
-        <w:t xml:space="preserve"> Digital Zero-Trust (</w:t>
-      </w:r>
-      <w:proofErr w:type="spellStart"/>
-      <w:r>
-        <w:rPr>
-          <w:rFonts w:ascii="Times New Roman" w:hAnsi="Times New Roman" w:cs="Times New Roman"/>
-          <w:b/>
-          <w:bCs/>
-          <w:sz w:val="32"/>
-          <w:szCs w:val="32"/>
-        </w:rPr>
-        <w:t>SecureOffice</w:t>
-      </w:r>
-      <w:proofErr w:type="spellEnd"/>
-      <w:r>
-        <w:rPr>
-          <w:rFonts w:ascii="Times New Roman" w:hAnsi="Times New Roman" w:cs="Times New Roman"/>
-          <w:b/>
-          <w:bCs/>
-          <w:sz w:val="32"/>
-          <w:szCs w:val="32"/>
-        </w:rPr>
-        <w:t xml:space="preserve">-AI) </w:t>
-      </w:r>
-      <w:proofErr w:type="spellStart"/>
-      <w:r>
-        <w:rPr>
-          <w:rFonts w:ascii="Times New Roman" w:hAnsi="Times New Roman" w:cs="Times New Roman"/>
-          <w:b/>
-          <w:bCs/>
-          <w:sz w:val="32"/>
-          <w:szCs w:val="32"/>
-        </w:rPr>
-        <w:t>Berbasis</w:t>
-      </w:r>
-      <w:proofErr w:type="spellEnd"/>
-      <w:r>
-        <w:rPr>
-          <w:rFonts w:ascii="Times New Roman" w:hAnsi="Times New Roman" w:cs="Times New Roman"/>
-          <w:b/>
-          <w:bCs/>
-          <w:sz w:val="32"/>
-          <w:szCs w:val="32"/>
-        </w:rPr>
-        <w:t xml:space="preserve"> Web </w:t>
-      </w:r>
-      <w:proofErr w:type="spellStart"/>
-      <w:r>
-        <w:rPr>
-          <w:rFonts w:ascii="Times New Roman" w:hAnsi="Times New Roman" w:cs="Times New Roman"/>
-          <w:b/>
-          <w:bCs/>
-          <w:sz w:val="32"/>
-          <w:szCs w:val="32"/>
-        </w:rPr>
-        <w:t>dengan</w:t>
-      </w:r>
-      <w:proofErr w:type="spellEnd"/>
-      <w:r>
-        <w:rPr>
-          <w:rFonts w:ascii="Times New Roman" w:hAnsi="Times New Roman" w:cs="Times New Roman"/>
-          <w:b/>
-          <w:bCs/>
-          <w:sz w:val="32"/>
-          <w:szCs w:val="32"/>
-        </w:rPr>
-        <w:t xml:space="preserve"> </w:t>
-      </w:r>
-      <w:proofErr w:type="spellStart"/>
-      <w:r>
-        <w:rPr>
-          <w:rFonts w:ascii="Times New Roman" w:hAnsi="Times New Roman" w:cs="Times New Roman"/>
-          <w:b/>
-          <w:bCs/>
-          <w:sz w:val="32"/>
-          <w:szCs w:val="32"/>
-        </w:rPr>
-        <w:t>Kriptografi</w:t>
-      </w:r>
-      <w:proofErr w:type="spellEnd"/>
-      <w:r>
-        <w:rPr>
-          <w:rFonts w:ascii="Times New Roman" w:hAnsi="Times New Roman" w:cs="Times New Roman"/>
-          <w:b/>
-          <w:bCs/>
-          <w:sz w:val="32"/>
-          <w:szCs w:val="32"/>
-        </w:rPr>
-        <w:t xml:space="preserve"> </w:t>
-      </w:r>
-      <w:proofErr w:type="spellStart"/>
-      <w:r>
-        <w:rPr>
-          <w:rFonts w:ascii="Times New Roman" w:hAnsi="Times New Roman" w:cs="Times New Roman"/>
-          <w:b/>
-          <w:bCs/>
-          <w:sz w:val="32"/>
-          <w:szCs w:val="32"/>
-        </w:rPr>
-        <w:t>Hibrida</w:t>
-      </w:r>
-      <w:proofErr w:type="spellEnd"/>
-      <w:r>
-        <w:rPr>
-          <w:rFonts w:ascii="Times New Roman" w:hAnsi="Times New Roman" w:cs="Times New Roman"/>
-          <w:b/>
-          <w:bCs/>
-          <w:sz w:val="32"/>
-          <w:szCs w:val="32"/>
-        </w:rPr>
-        <w:t xml:space="preserve"> dan Multi-Agentic AI Subsystem</w:t>
+        </w:rPr>
+        <w:t xml:space="preserve"> dan Kebocoran Data (Studi Kasus: Unit Kerja Instansi Pemerintah)</w:t>
       </w:r>
     </w:p>
     <w:p>
@@ -1959,192 +1643,85 @@
           <w:p>
             <w:pPr>
               <w:spacing w:line="276" w:lineRule="auto"/>
-              <w:jc w:val="both"/>
+              <w:jc w:val="center"/>
               <w:rPr>
                 <w:rFonts w:ascii="Times New Roman" w:hAnsi="Times New Roman" w:cs="Times New Roman"/>
                 <w:sz w:val="24"/>
                 <w:szCs w:val="24"/>
               </w:rPr>
             </w:pPr>
-            <w:proofErr w:type="spellStart"/>
+            <w:r/>
             <w:r>
               <w:rPr>
-                <w:rFonts w:ascii="Times New Roman" w:hAnsi="Times New Roman" w:cs="Times New Roman"/>
+                <w:rFonts w:ascii="Times New Roman" w:hAnsi="Times New Roman"/>
+                <w:b/>
+                <w:i/>
                 <w:sz w:val="24"/>
-                <w:szCs w:val="24"/>
-              </w:rPr>
-              <w:t>Rancang</w:t>
+              </w:rPr>
+              <w:t>SecSent</w:t>
             </w:r>
-            <w:proofErr w:type="spellEnd"/>
             <w:r>
               <w:rPr>
-                <w:rFonts w:ascii="Times New Roman" w:hAnsi="Times New Roman" w:cs="Times New Roman"/>
+                <w:rFonts w:ascii="Times New Roman" w:hAnsi="Times New Roman"/>
+                <w:b/>
+                <w:i w:val="0"/>
                 <w:sz w:val="24"/>
-                <w:szCs w:val="24"/>
-              </w:rPr>
-              <w:t xml:space="preserve"> </w:t>
+              </w:rPr>
+              <w:t xml:space="preserve">: Rancang Bangun Sistem Persuratan Digital Berarsitektur </w:t>
             </w:r>
-            <w:proofErr w:type="spellStart"/>
             <w:r>
               <w:rPr>
-                <w:rFonts w:ascii="Times New Roman" w:hAnsi="Times New Roman" w:cs="Times New Roman"/>
+                <w:rFonts w:ascii="Times New Roman" w:hAnsi="Times New Roman"/>
+                <w:b/>
+                <w:i/>
                 <w:sz w:val="24"/>
-                <w:szCs w:val="24"/>
-              </w:rPr>
-              <w:t>Bangun</w:t>
+              </w:rPr>
+              <w:t>Zero-Trust</w:t>
             </w:r>
-            <w:proofErr w:type="spellEnd"/>
             <w:r>
               <w:rPr>
-                <w:rFonts w:ascii="Times New Roman" w:hAnsi="Times New Roman" w:cs="Times New Roman"/>
+                <w:rFonts w:ascii="Times New Roman" w:hAnsi="Times New Roman"/>
+                <w:b/>
+                <w:i w:val="0"/>
                 <w:sz w:val="24"/>
-                <w:szCs w:val="24"/>
-              </w:rPr>
-              <w:t xml:space="preserve"> </w:t>
+              </w:rPr>
+              <w:t xml:space="preserve"> dengan Kriptografi Hibrida dan </w:t>
             </w:r>
-            <w:proofErr w:type="spellStart"/>
             <w:r>
               <w:rPr>
-                <w:rFonts w:ascii="Times New Roman" w:hAnsi="Times New Roman" w:cs="Times New Roman"/>
+                <w:rFonts w:ascii="Times New Roman" w:hAnsi="Times New Roman"/>
+                <w:b/>
+                <w:i/>
                 <w:sz w:val="24"/>
-                <w:szCs w:val="24"/>
-              </w:rPr>
-              <w:t>Sistem</w:t>
+              </w:rPr>
+              <w:t>Multi-Agentic AI</w:t>
             </w:r>
-            <w:proofErr w:type="spellEnd"/>
             <w:r>
               <w:rPr>
-                <w:rFonts w:ascii="Times New Roman" w:hAnsi="Times New Roman" w:cs="Times New Roman"/>
+                <w:rFonts w:ascii="Times New Roman" w:hAnsi="Times New Roman"/>
+                <w:b/>
+                <w:i w:val="0"/>
                 <w:sz w:val="24"/>
-                <w:szCs w:val="24"/>
-              </w:rPr>
-              <w:t xml:space="preserve"> </w:t>
+              </w:rPr>
+              <w:t xml:space="preserve"> untuk Mitigasi </w:t>
             </w:r>
-            <w:proofErr w:type="spellStart"/>
             <w:r>
               <w:rPr>
-                <w:rFonts w:ascii="Times New Roman" w:hAnsi="Times New Roman" w:cs="Times New Roman"/>
+                <w:rFonts w:ascii="Times New Roman" w:hAnsi="Times New Roman"/>
+                <w:b/>
+                <w:i/>
                 <w:sz w:val="24"/>
-                <w:szCs w:val="24"/>
-              </w:rPr>
-              <w:t>Informasi</w:t>
+              </w:rPr>
+              <w:t>Insider Threat</w:t>
             </w:r>
-            <w:proofErr w:type="spellEnd"/>
             <w:r>
               <w:rPr>
-                <w:rFonts w:ascii="Times New Roman" w:hAnsi="Times New Roman" w:cs="Times New Roman"/>
+                <w:rFonts w:ascii="Times New Roman" w:hAnsi="Times New Roman"/>
+                <w:b/>
+                <w:i w:val="0"/>
                 <w:sz w:val="24"/>
-                <w:szCs w:val="24"/>
-              </w:rPr>
-              <w:t xml:space="preserve"> </w:t>
-            </w:r>
-            <w:proofErr w:type="spellStart"/>
-            <w:r>
-              <w:rPr>
-                <w:rFonts w:ascii="Times New Roman" w:hAnsi="Times New Roman" w:cs="Times New Roman"/>
-                <w:sz w:val="24"/>
-                <w:szCs w:val="24"/>
-              </w:rPr>
-              <w:t>Persuratan</w:t>
-            </w:r>
-            <w:proofErr w:type="spellEnd"/>
-            <w:r>
-              <w:rPr>
-                <w:rFonts w:ascii="Times New Roman" w:hAnsi="Times New Roman" w:cs="Times New Roman"/>
-                <w:sz w:val="24"/>
-                <w:szCs w:val="24"/>
-              </w:rPr>
-              <w:t xml:space="preserve"> Digital Zero-Trust (</w:t>
-            </w:r>
-            <w:proofErr w:type="spellStart"/>
-            <w:r>
-              <w:rPr>
-                <w:rFonts w:ascii="Times New Roman" w:hAnsi="Times New Roman" w:cs="Times New Roman"/>
-                <w:sz w:val="24"/>
-                <w:szCs w:val="24"/>
-              </w:rPr>
-              <w:t>SecureOffice</w:t>
-            </w:r>
-            <w:proofErr w:type="spellEnd"/>
-            <w:r>
-              <w:rPr>
-                <w:rFonts w:ascii="Times New Roman" w:hAnsi="Times New Roman" w:cs="Times New Roman"/>
-                <w:sz w:val="24"/>
-                <w:szCs w:val="24"/>
-              </w:rPr>
-              <w:t xml:space="preserve">-AI) </w:t>
-            </w:r>
-            <w:proofErr w:type="spellStart"/>
-            <w:r>
-              <w:rPr>
-                <w:rFonts w:ascii="Times New Roman" w:hAnsi="Times New Roman" w:cs="Times New Roman"/>
-                <w:sz w:val="24"/>
-                <w:szCs w:val="24"/>
-              </w:rPr>
-              <w:t>Berbasis</w:t>
-            </w:r>
-            <w:proofErr w:type="spellEnd"/>
-            <w:r>
-              <w:rPr>
-                <w:rFonts w:ascii="Times New Roman" w:hAnsi="Times New Roman" w:cs="Times New Roman"/>
-                <w:sz w:val="24"/>
-                <w:szCs w:val="24"/>
-              </w:rPr>
-              <w:t xml:space="preserve"> Web </w:t>
-            </w:r>
-            <w:proofErr w:type="spellStart"/>
-            <w:r>
-              <w:rPr>
-                <w:rFonts w:ascii="Times New Roman" w:hAnsi="Times New Roman" w:cs="Times New Roman"/>
-                <w:sz w:val="24"/>
-                <w:szCs w:val="24"/>
-              </w:rPr>
-              <w:t>dengan</w:t>
-            </w:r>
-            <w:proofErr w:type="spellEnd"/>
-            <w:r>
-              <w:rPr>
-                <w:rFonts w:ascii="Times New Roman" w:hAnsi="Times New Roman" w:cs="Times New Roman"/>
-                <w:sz w:val="24"/>
-                <w:szCs w:val="24"/>
-              </w:rPr>
-              <w:t xml:space="preserve"> </w:t>
-            </w:r>
-            <w:proofErr w:type="spellStart"/>
-            <w:r>
-              <w:rPr>
-                <w:rFonts w:ascii="Times New Roman" w:hAnsi="Times New Roman" w:cs="Times New Roman"/>
-                <w:sz w:val="24"/>
-                <w:szCs w:val="24"/>
-              </w:rPr>
-              <w:t>Kriptografi</w:t>
-            </w:r>
-            <w:proofErr w:type="spellEnd"/>
-            <w:r>
-              <w:rPr>
-                <w:rFonts w:ascii="Times New Roman" w:hAnsi="Times New Roman" w:cs="Times New Roman"/>
-                <w:sz w:val="24"/>
-                <w:szCs w:val="24"/>
-              </w:rPr>
-              <w:t xml:space="preserve"> </w:t>
-            </w:r>
-            <w:proofErr w:type="spellStart"/>
-            <w:r>
-              <w:rPr>
-                <w:rFonts w:ascii="Times New Roman" w:hAnsi="Times New Roman" w:cs="Times New Roman"/>
-                <w:sz w:val="24"/>
-                <w:szCs w:val="24"/>
-              </w:rPr>
-              <w:t>Hibrida</w:t>
-            </w:r>
-            <w:proofErr w:type="spellEnd"/>
-            <w:r>
-              <w:rPr>
-                <w:rFonts w:ascii="Times New Roman" w:hAnsi="Times New Roman" w:cs="Times New Roman"/>
-                <w:sz w:val="24"/>
-                <w:szCs w:val="24"/>
-              </w:rPr>
-              <w:t xml:space="preserve"> dan Multi-Agentic AI Subsystem</w:t>
+              </w:rPr>
+              <w:t xml:space="preserve"> dan Kebocoran Data (Studi Kasus: Unit Kerja Instansi Pemerintah)</w:t>
             </w:r>
           </w:p>
         </w:tc>
@@ -3149,92 +2726,85 @@
           <w:p>
             <w:pPr>
               <w:spacing w:line="276" w:lineRule="auto"/>
-              <w:jc w:val="both"/>
+              <w:jc w:val="center"/>
               <w:rPr>
                 <w:rFonts w:ascii="Times New Roman" w:hAnsi="Times New Roman" w:cs="Times New Roman"/>
                 <w:sz w:val="24"/>
                 <w:szCs w:val="24"/>
               </w:rPr>
             </w:pPr>
-            <w:proofErr w:type="spellStart"/>
+            <w:r/>
             <w:r>
-              <w:t>Rancang</w:t>
+              <w:rPr>
+                <w:rFonts w:ascii="Times New Roman" w:hAnsi="Times New Roman"/>
+                <w:b/>
+                <w:i/>
+                <w:sz w:val="24"/>
+              </w:rPr>
+              <w:t>SecSent</w:t>
             </w:r>
-            <w:proofErr w:type="spellEnd"/>
             <w:r>
-              <w:t xml:space="preserve"> </w:t>
+              <w:rPr>
+                <w:rFonts w:ascii="Times New Roman" w:hAnsi="Times New Roman"/>
+                <w:b/>
+                <w:i w:val="0"/>
+                <w:sz w:val="24"/>
+              </w:rPr>
+              <w:t xml:space="preserve">: Rancang Bangun Sistem Persuratan Digital Berarsitektur </w:t>
             </w:r>
-            <w:proofErr w:type="spellStart"/>
             <w:r>
-              <w:t>Bangun</w:t>
+              <w:rPr>
+                <w:rFonts w:ascii="Times New Roman" w:hAnsi="Times New Roman"/>
+                <w:b/>
+                <w:i/>
+                <w:sz w:val="24"/>
+              </w:rPr>
+              <w:t>Zero-Trust</w:t>
             </w:r>
-            <w:proofErr w:type="spellEnd"/>
             <w:r>
-              <w:t xml:space="preserve"> </w:t>
+              <w:rPr>
+                <w:rFonts w:ascii="Times New Roman" w:hAnsi="Times New Roman"/>
+                <w:b/>
+                <w:i w:val="0"/>
+                <w:sz w:val="24"/>
+              </w:rPr>
+              <w:t xml:space="preserve"> dengan Kriptografi Hibrida dan </w:t>
             </w:r>
-            <w:proofErr w:type="spellStart"/>
             <w:r>
-              <w:t>Sistem</w:t>
+              <w:rPr>
+                <w:rFonts w:ascii="Times New Roman" w:hAnsi="Times New Roman"/>
+                <w:b/>
+                <w:i/>
+                <w:sz w:val="24"/>
+              </w:rPr>
+              <w:t>Multi-Agentic AI</w:t>
             </w:r>
-            <w:proofErr w:type="spellEnd"/>
             <w:r>
-              <w:t xml:space="preserve"> </w:t>
+              <w:rPr>
+                <w:rFonts w:ascii="Times New Roman" w:hAnsi="Times New Roman"/>
+                <w:b/>
+                <w:i w:val="0"/>
+                <w:sz w:val="24"/>
+              </w:rPr>
+              <w:t xml:space="preserve"> untuk Mitigasi </w:t>
             </w:r>
-            <w:proofErr w:type="spellStart"/>
             <w:r>
-              <w:t>Informasi</w:t>
+              <w:rPr>
+                <w:rFonts w:ascii="Times New Roman" w:hAnsi="Times New Roman"/>
+                <w:b/>
+                <w:i/>
+                <w:sz w:val="24"/>
+              </w:rPr>
+              <w:t>Insider Threat</w:t>
             </w:r>
-            <w:proofErr w:type="spellEnd"/>
             <w:r>
-              <w:t xml:space="preserve"> </w:t>
-            </w:r>
-            <w:proofErr w:type="spellStart"/>
-            <w:r>
-              <w:t>Persuratan</w:t>
-            </w:r>
-            <w:proofErr w:type="spellEnd"/>
-            <w:r>
-              <w:t xml:space="preserve"> Digital Zero-Trust (</w:t>
-            </w:r>
-            <w:proofErr w:type="spellStart"/>
-            <w:r>
-              <w:t>SecureOffice</w:t>
-            </w:r>
-            <w:proofErr w:type="spellEnd"/>
-            <w:r>
-              <w:t xml:space="preserve">-AI) </w:t>
-            </w:r>
-            <w:proofErr w:type="spellStart"/>
-            <w:r>
-              <w:t>Berbasis</w:t>
-            </w:r>
-            <w:proofErr w:type="spellEnd"/>
-            <w:r>
-              <w:t xml:space="preserve"> Web </w:t>
-            </w:r>
-            <w:proofErr w:type="spellStart"/>
-            <w:r>
-              <w:t>dengan</w:t>
-            </w:r>
-            <w:proofErr w:type="spellEnd"/>
-            <w:r>
-              <w:t xml:space="preserve"> </w:t>
-            </w:r>
-            <w:proofErr w:type="spellStart"/>
-            <w:r>
-              <w:t>Kriptografi</w:t>
-            </w:r>
-            <w:proofErr w:type="spellEnd"/>
-            <w:r>
-              <w:t xml:space="preserve"> </w:t>
-            </w:r>
-            <w:proofErr w:type="spellStart"/>
-            <w:r>
-              <w:t>Hibrida</w:t>
-            </w:r>
-            <w:proofErr w:type="spellEnd"/>
-            <w:r>
-              <w:t xml:space="preserve"> dan Multi-Agentic AI Subsystem</w:t>
+              <w:rPr>
+                <w:rFonts w:ascii="Times New Roman" w:hAnsi="Times New Roman"/>
+                <w:b/>
+                <w:i w:val="0"/>
+                <w:sz w:val="24"/>
+              </w:rPr>
+              <w:t xml:space="preserve"> dan Kebocoran Data (Studi Kasus: Unit Kerja Instansi Pemerintah)</w:t>
             </w:r>
           </w:p>
         </w:tc>
@@ -4300,18 +3870,93 @@
           <w:szCs w:val="24"/>
         </w:rPr>
       </w:pPr>
-      <w:proofErr w:type="spellStart"/>
-      <w:r>
+      <w:r/>
+      <w:r>
+        <w:rPr>
+          <w:rFonts w:ascii="Times New Roman" w:hAnsi="Times New Roman"/>
+          <w:b/>
+          <w:i/>
+          <w:sz w:val="24"/>
+        </w:rPr>
+        <w:t>SecSent</w:t>
+      </w:r>
+      <w:r>
+        <w:rPr>
+          <w:rFonts w:ascii="Times New Roman" w:hAnsi="Times New Roman"/>
+          <w:b/>
+          <w:i w:val="0"/>
+          <w:sz w:val="24"/>
+        </w:rPr>
+        <w:t xml:space="preserve">: Rancang Bangun Sistem Persuratan Digital Berarsitektur </w:t>
+      </w:r>
+      <w:r>
+        <w:rPr>
+          <w:rFonts w:ascii="Times New Roman" w:hAnsi="Times New Roman"/>
+          <w:b/>
+          <w:i/>
+          <w:sz w:val="24"/>
+        </w:rPr>
+        <w:t>Zero-Trust</w:t>
+      </w:r>
+      <w:r>
+        <w:rPr>
+          <w:rFonts w:ascii="Times New Roman" w:hAnsi="Times New Roman"/>
+          <w:b/>
+          <w:i w:val="0"/>
+          <w:sz w:val="24"/>
+        </w:rPr>
+        <w:t xml:space="preserve"> dengan Kriptografi Hibrida dan </w:t>
+      </w:r>
+      <w:r>
+        <w:rPr>
+          <w:rFonts w:ascii="Times New Roman" w:hAnsi="Times New Roman"/>
+          <w:b/>
+          <w:i/>
+          <w:sz w:val="24"/>
+        </w:rPr>
+        <w:t>Multi-Agentic AI</w:t>
+      </w:r>
+      <w:r>
+        <w:rPr>
+          <w:rFonts w:ascii="Times New Roman" w:hAnsi="Times New Roman"/>
+          <w:b/>
+          <w:i w:val="0"/>
+          <w:sz w:val="24"/>
+        </w:rPr>
+        <w:t xml:space="preserve"> untuk Mitigasi </w:t>
+      </w:r>
+      <w:r>
+        <w:rPr>
+          <w:rFonts w:ascii="Times New Roman" w:hAnsi="Times New Roman"/>
+          <w:b/>
+          <w:i/>
+          <w:sz w:val="24"/>
+        </w:rPr>
+        <w:t>Insider Threat</w:t>
+      </w:r>
+      <w:r>
+        <w:rPr>
+          <w:rFonts w:ascii="Times New Roman" w:hAnsi="Times New Roman"/>
+          <w:b/>
+          <w:i w:val="0"/>
+          <w:sz w:val="24"/>
+        </w:rPr>
+        <w:t xml:space="preserve"> dan Kebocoran Data (Studi Kasus: Unit Kerja Instansi Pemerintah)</w:t>
+      </w:r>
+    </w:p>
+    <w:p>
+      <w:pPr>
+        <w:spacing w:after="0" w:line="240" w:lineRule="auto"/>
+        <w:jc w:val="center"/>
         <w:rPr>
           <w:rFonts w:ascii="Times New Roman" w:hAnsi="Times New Roman" w:cs="Times New Roman"/>
           <w:b/>
           <w:bCs/>
           <w:sz w:val="24"/>
           <w:szCs w:val="24"/>
-        </w:rPr>
-        <w:t>Rancang</w:t>
-      </w:r>
-      <w:proofErr w:type="spellEnd"/>
+          <w:lang w:val="pt-BR"/>
+        </w:rPr>
+      </w:pPr>
       <w:r>
         <w:rPr>
           <w:rFonts w:ascii="Times New Roman" w:hAnsi="Times New Roman" w:cs="Times New Roman"/>
@@ -4319,404 +3964,1085 @@
           <w:bCs/>
           <w:sz w:val="24"/>
           <w:szCs w:val="24"/>
-        </w:rPr>
-        <w:t xml:space="preserve"> </w:t>
-      </w:r>
-      <w:proofErr w:type="spellStart"/>
-      <w:r>
-        <w:rPr>
-          <w:rFonts w:ascii="Times New Roman" w:hAnsi="Times New Roman" w:cs="Times New Roman"/>
-          <w:b/>
-          <w:bCs/>
-          <w:sz w:val="24"/>
-          <w:szCs w:val="24"/>
-        </w:rPr>
-        <w:t>Bangun</w:t>
-      </w:r>
-      <w:proofErr w:type="spellEnd"/>
-      <w:r>
-        <w:rPr>
-          <w:rFonts w:ascii="Times New Roman" w:hAnsi="Times New Roman" w:cs="Times New Roman"/>
-          <w:b/>
-          <w:bCs/>
-          <w:sz w:val="24"/>
-          <w:szCs w:val="24"/>
-        </w:rPr>
-        <w:t xml:space="preserve"> </w:t>
-      </w:r>
-      <w:proofErr w:type="spellStart"/>
-      <w:r>
-        <w:rPr>
-          <w:rFonts w:ascii="Times New Roman" w:hAnsi="Times New Roman" w:cs="Times New Roman"/>
-          <w:b/>
-          <w:bCs/>
-          <w:sz w:val="24"/>
-          <w:szCs w:val="24"/>
-        </w:rPr>
-        <w:t>Sistem</w:t>
-      </w:r>
-      <w:proofErr w:type="spellEnd"/>
-      <w:r>
-        <w:rPr>
-          <w:rFonts w:ascii="Times New Roman" w:hAnsi="Times New Roman" w:cs="Times New Roman"/>
-          <w:b/>
-          <w:bCs/>
-          <w:sz w:val="24"/>
-          <w:szCs w:val="24"/>
-        </w:rPr>
-        <w:t xml:space="preserve"> </w:t>
-      </w:r>
-      <w:proofErr w:type="spellStart"/>
-      <w:r>
-        <w:rPr>
-          <w:rFonts w:ascii="Times New Roman" w:hAnsi="Times New Roman" w:cs="Times New Roman"/>
-          <w:b/>
-          <w:bCs/>
-          <w:sz w:val="24"/>
-          <w:szCs w:val="24"/>
-        </w:rPr>
-        <w:t>Informasi</w:t>
-      </w:r>
-      <w:proofErr w:type="spellEnd"/>
-      <w:r>
-        <w:rPr>
-          <w:rFonts w:ascii="Times New Roman" w:hAnsi="Times New Roman" w:cs="Times New Roman"/>
-          <w:b/>
-          <w:bCs/>
-          <w:sz w:val="24"/>
-          <w:szCs w:val="24"/>
-        </w:rPr>
-        <w:t xml:space="preserve"> </w:t>
-      </w:r>
-      <w:proofErr w:type="spellStart"/>
-      <w:r>
-        <w:rPr>
-          <w:rFonts w:ascii="Times New Roman" w:hAnsi="Times New Roman" w:cs="Times New Roman"/>
-          <w:b/>
-          <w:bCs/>
-          <w:sz w:val="24"/>
-          <w:szCs w:val="24"/>
-        </w:rPr>
-        <w:t>Persuratan</w:t>
-      </w:r>
-      <w:proofErr w:type="spellEnd"/>
-      <w:r>
-        <w:rPr>
-          <w:rFonts w:ascii="Times New Roman" w:hAnsi="Times New Roman" w:cs="Times New Roman"/>
-          <w:b/>
-          <w:bCs/>
-          <w:sz w:val="24"/>
-          <w:szCs w:val="24"/>
-        </w:rPr>
-        <w:t xml:space="preserve"> Digital </w:t>
-      </w:r>
-      <w:r>
-        <w:rPr>
-          <w:rFonts w:ascii="Times New Roman" w:hAnsi="Times New Roman" w:cs="Times New Roman"/>
-          <w:b/>
-          <w:bCs/>
+          <w:lang w:val="pt-BR"/>
+        </w:rPr>
+        <w:t>oleh</w:t>
+      </w:r>
+    </w:p>
+    <w:p>
+      <w:pPr>
+        <w:spacing w:after="0" w:line="240" w:lineRule="auto"/>
+        <w:jc w:val="center"/>
+        <w:rPr>
+          <w:rFonts w:ascii="Times New Roman" w:hAnsi="Times New Roman" w:cs="Times New Roman"/>
+          <w:sz w:val="24"/>
+          <w:szCs w:val="24"/>
+          <w:lang w:val="pt-BR"/>
+        </w:rPr>
+      </w:pPr>
+    </w:p>
+    <w:p>
+      <w:pPr>
+        <w:spacing w:after="0" w:line="240" w:lineRule="auto"/>
+        <w:jc w:val="center"/>
+        <w:rPr>
+          <w:rFonts w:ascii="Times New Roman" w:hAnsi="Times New Roman" w:cs="Times New Roman"/>
+          <w:sz w:val="24"/>
+          <w:szCs w:val="24"/>
+          <w:lang w:val="pt-BR"/>
+        </w:rPr>
+      </w:pPr>
+      <w:r>
+        <w:rPr>
+          <w:rFonts w:ascii="Times New Roman" w:hAnsi="Times New Roman" w:cs="Times New Roman"/>
+          <w:sz w:val="24"/>
+          <w:szCs w:val="24"/>
+          <w:lang w:val="pt-BR"/>
+        </w:rPr>
+        <w:t>Satria Alba Pramasha</w:t>
+      </w:r>
+    </w:p>
+    <w:p>
+      <w:pPr>
+        <w:spacing w:after="0" w:line="240" w:lineRule="auto"/>
+        <w:jc w:val="center"/>
+        <w:rPr>
+          <w:rFonts w:ascii="Times New Roman" w:hAnsi="Times New Roman" w:cs="Times New Roman"/>
+          <w:sz w:val="24"/>
+          <w:szCs w:val="24"/>
+          <w:lang w:val="pt-BR"/>
+        </w:rPr>
+      </w:pPr>
+      <w:r>
+        <w:t>2322101974</w:t>
+      </w:r>
+    </w:p>
+    <w:p>
+      <w:pPr>
+        <w:spacing w:after="0" w:line="240" w:lineRule="auto"/>
+        <w:jc w:val="center"/>
+        <w:rPr>
+          <w:rFonts w:ascii="Times New Roman" w:hAnsi="Times New Roman" w:cs="Times New Roman"/>
+          <w:sz w:val="24"/>
+          <w:szCs w:val="24"/>
+          <w:lang w:val="pt-BR"/>
+        </w:rPr>
+      </w:pPr>
+    </w:p>
+    <w:p>
+      <w:pPr>
+        <w:spacing w:after="0" w:line="240" w:lineRule="auto"/>
+        <w:jc w:val="center"/>
+        <w:rPr>
+          <w:rFonts w:ascii="Times New Roman" w:hAnsi="Times New Roman" w:cs="Times New Roman"/>
+          <w:sz w:val="24"/>
+          <w:szCs w:val="24"/>
+          <w:lang w:val="pt-BR"/>
+        </w:rPr>
+      </w:pPr>
+      <w:r>
+        <w:rPr>
+          <w:rFonts w:ascii="Times New Roman" w:hAnsi="Times New Roman" w:cs="Times New Roman"/>
+          <w:sz w:val="24"/>
+          <w:szCs w:val="24"/>
+          <w:lang w:val="pt-BR"/>
+        </w:rPr>
+        <w:t>Rekayasa Kriptografi</w:t>
+      </w:r>
+    </w:p>
+    <w:p>
+      <w:pPr>
+        <w:spacing w:after="0" w:line="240" w:lineRule="auto"/>
+        <w:jc w:val="center"/>
+        <w:rPr>
+          <w:rFonts w:ascii="Times New Roman" w:hAnsi="Times New Roman" w:cs="Times New Roman"/>
+          <w:sz w:val="24"/>
+          <w:szCs w:val="24"/>
+          <w:lang w:val="pt-BR"/>
+        </w:rPr>
+      </w:pPr>
+    </w:p>
+    <w:p>
+      <w:pPr>
+        <w:spacing w:after="0" w:line="240" w:lineRule="auto"/>
+        <w:jc w:val="center"/>
+        <w:rPr>
+          <w:rFonts w:ascii="Times New Roman" w:hAnsi="Times New Roman" w:cs="Times New Roman"/>
+          <w:sz w:val="24"/>
+          <w:szCs w:val="24"/>
+          <w:lang w:val="pt-BR"/>
+        </w:rPr>
+      </w:pPr>
+    </w:p>
+    <w:p>
+      <w:pPr>
+        <w:spacing w:after="0" w:line="240" w:lineRule="auto"/>
+        <w:jc w:val="center"/>
+        <w:rPr>
+          <w:rFonts w:ascii="Times New Roman" w:hAnsi="Times New Roman" w:cs="Times New Roman"/>
+          <w:sz w:val="24"/>
+          <w:szCs w:val="24"/>
+          <w:lang w:val="pt-BR"/>
+        </w:rPr>
+      </w:pPr>
+    </w:p>
+    <w:p>
+      <w:pPr>
+        <w:spacing w:after="0" w:line="240" w:lineRule="auto"/>
+        <w:jc w:val="both"/>
+        <w:rPr>
+          <w:rFonts w:ascii="Times New Roman" w:hAnsi="Times New Roman" w:cs="Times New Roman"/>
+          <w:sz w:val="24"/>
+          <w:szCs w:val="24"/>
+          <w:lang w:val="fi-FI"/>
+        </w:rPr>
+      </w:pPr>
+      <w:r>
+        <w:rPr>
+          <w:rFonts w:ascii="Times New Roman" w:hAnsi="Times New Roman" w:cs="Times New Roman"/>
+          <w:sz w:val="24"/>
+          <w:szCs w:val="24"/>
+          <w:lang w:val="pt-BR"/>
+        </w:rPr>
+        <w:t>Sistem Tata Naskah Dinas Elektronik (TNDE) konvensional pada instansi pemerintahan sering kali rentan terhadap kebocoran data tingkat basis data (</w:t>
+      </w:r>
+      <w:r>
+        <w:rPr>
+          <w:rFonts w:ascii="Times New Roman" w:hAnsi="Times New Roman" w:cs="Times New Roman"/>
           <w:i/>
           <w:iCs/>
           <w:sz w:val="24"/>
           <w:szCs w:val="24"/>
-        </w:rPr>
-        <w:t>Zero-Trust</w:t>
-      </w:r>
-      <w:r>
-        <w:rPr>
-          <w:rFonts w:ascii="Times New Roman" w:hAnsi="Times New Roman" w:cs="Times New Roman"/>
-          <w:b/>
-          <w:bCs/>
-          <w:sz w:val="24"/>
-          <w:szCs w:val="24"/>
-        </w:rPr>
-        <w:t xml:space="preserve"> (</w:t>
-      </w:r>
-      <w:proofErr w:type="spellStart"/>
-      <w:r>
-        <w:rPr>
-          <w:rFonts w:ascii="Times New Roman" w:hAnsi="Times New Roman" w:cs="Times New Roman"/>
-          <w:b/>
-          <w:bCs/>
-          <w:sz w:val="24"/>
-          <w:szCs w:val="24"/>
-        </w:rPr>
-        <w:t>SecureOffice</w:t>
-      </w:r>
-      <w:proofErr w:type="spellEnd"/>
-      <w:r>
-        <w:rPr>
-          <w:rFonts w:ascii="Times New Roman" w:hAnsi="Times New Roman" w:cs="Times New Roman"/>
-          <w:b/>
-          <w:bCs/>
-          <w:sz w:val="24"/>
-          <w:szCs w:val="24"/>
-        </w:rPr>
-        <w:t xml:space="preserve">-AI) </w:t>
-      </w:r>
-      <w:proofErr w:type="spellStart"/>
-      <w:r>
-        <w:rPr>
-          <w:rFonts w:ascii="Times New Roman" w:hAnsi="Times New Roman" w:cs="Times New Roman"/>
-          <w:b/>
-          <w:bCs/>
-          <w:sz w:val="24"/>
-          <w:szCs w:val="24"/>
-        </w:rPr>
-        <w:t>Berbasis</w:t>
-      </w:r>
-      <w:proofErr w:type="spellEnd"/>
-      <w:r>
-        <w:rPr>
-          <w:rFonts w:ascii="Times New Roman" w:hAnsi="Times New Roman" w:cs="Times New Roman"/>
-          <w:b/>
-          <w:bCs/>
-          <w:sz w:val="24"/>
-          <w:szCs w:val="24"/>
-        </w:rPr>
-        <w:t xml:space="preserve"> Web </w:t>
-      </w:r>
-      <w:proofErr w:type="spellStart"/>
-      <w:r>
-        <w:rPr>
-          <w:rFonts w:ascii="Times New Roman" w:hAnsi="Times New Roman" w:cs="Times New Roman"/>
-          <w:b/>
-          <w:bCs/>
-          <w:sz w:val="24"/>
-          <w:szCs w:val="24"/>
-        </w:rPr>
-        <w:t>dengan</w:t>
-      </w:r>
-      <w:proofErr w:type="spellEnd"/>
-      <w:r>
-        <w:rPr>
-          <w:rFonts w:ascii="Times New Roman" w:hAnsi="Times New Roman" w:cs="Times New Roman"/>
-          <w:b/>
-          <w:bCs/>
-          <w:sz w:val="24"/>
-          <w:szCs w:val="24"/>
-        </w:rPr>
-        <w:t xml:space="preserve"> </w:t>
-      </w:r>
-      <w:proofErr w:type="spellStart"/>
-      <w:r>
-        <w:rPr>
-          <w:rFonts w:ascii="Times New Roman" w:hAnsi="Times New Roman" w:cs="Times New Roman"/>
-          <w:b/>
-          <w:bCs/>
-          <w:sz w:val="24"/>
-          <w:szCs w:val="24"/>
-        </w:rPr>
-        <w:t>Kriptografi</w:t>
-      </w:r>
-      <w:proofErr w:type="spellEnd"/>
-      <w:r>
-        <w:rPr>
-          <w:rFonts w:ascii="Times New Roman" w:hAnsi="Times New Roman" w:cs="Times New Roman"/>
-          <w:b/>
-          <w:bCs/>
-          <w:sz w:val="24"/>
-          <w:szCs w:val="24"/>
-        </w:rPr>
-        <w:t xml:space="preserve"> </w:t>
-      </w:r>
-      <w:proofErr w:type="spellStart"/>
-      <w:r>
-        <w:rPr>
-          <w:rFonts w:ascii="Times New Roman" w:hAnsi="Times New Roman" w:cs="Times New Roman"/>
-          <w:b/>
-          <w:bCs/>
-          <w:sz w:val="24"/>
-          <w:szCs w:val="24"/>
-        </w:rPr>
-        <w:t>Hibrida</w:t>
-      </w:r>
-      <w:proofErr w:type="spellEnd"/>
-      <w:r>
-        <w:rPr>
-          <w:rFonts w:ascii="Times New Roman" w:hAnsi="Times New Roman" w:cs="Times New Roman"/>
-          <w:b/>
-          <w:bCs/>
-          <w:sz w:val="24"/>
-          <w:szCs w:val="24"/>
-        </w:rPr>
-        <w:t xml:space="preserve"> (AES-256-GCM, X25519, Ed25519) dan </w:t>
-      </w:r>
-      <w:r>
-        <w:rPr>
-          <w:rFonts w:ascii="Times New Roman" w:hAnsi="Times New Roman" w:cs="Times New Roman"/>
-          <w:b/>
-          <w:bCs/>
+          <w:lang w:val="pt-BR"/>
+        </w:rPr>
+        <w:t>database</w:t>
+      </w:r>
+      <w:r>
+        <w:rPr>
+          <w:rFonts w:ascii="Times New Roman" w:hAnsi="Times New Roman" w:cs="Times New Roman"/>
+          <w:sz w:val="24"/>
+          <w:szCs w:val="24"/>
+          <w:lang w:val="pt-BR"/>
+        </w:rPr>
+        <w:t>) dan serangan internal (</w:t>
+      </w:r>
+      <w:r>
+        <w:rPr>
+          <w:rFonts w:ascii="Times New Roman" w:hAnsi="Times New Roman" w:cs="Times New Roman"/>
           <w:i/>
           <w:iCs/>
           <w:sz w:val="24"/>
           <w:szCs w:val="24"/>
-        </w:rPr>
-        <w:t>Multi-Agentic AI Subsystem</w:t>
+          <w:lang w:val="pt-BR"/>
+        </w:rPr>
+        <w:t>insider attack</w:t>
+      </w:r>
+      <w:r>
+        <w:rPr>
+          <w:rFonts w:ascii="Times New Roman" w:hAnsi="Times New Roman" w:cs="Times New Roman"/>
+          <w:sz w:val="24"/>
+          <w:szCs w:val="24"/>
+          <w:lang w:val="pt-BR"/>
+        </w:rPr>
+        <w:t xml:space="preserve">). Ketergantungan pada </w:t>
+      </w:r>
+      <w:r>
+        <w:rPr>
+          <w:rFonts w:ascii="Times New Roman" w:hAnsi="Times New Roman" w:cs="Times New Roman"/>
+          <w:i/>
+          <w:iCs/>
+          <w:sz w:val="24"/>
+          <w:szCs w:val="24"/>
+          <w:lang w:val="pt-BR"/>
+        </w:rPr>
+        <w:t>Transparent Data Encryption</w:t>
+      </w:r>
+      <w:r>
+        <w:rPr>
+          <w:rFonts w:ascii="Times New Roman" w:hAnsi="Times New Roman" w:cs="Times New Roman"/>
+          <w:sz w:val="24"/>
+          <w:szCs w:val="24"/>
+          <w:lang w:val="pt-BR"/>
+        </w:rPr>
+        <w:t xml:space="preserve"> (TDE) dan </w:t>
+      </w:r>
+      <w:r>
+        <w:rPr>
+          <w:rFonts w:ascii="Times New Roman" w:hAnsi="Times New Roman" w:cs="Times New Roman"/>
+          <w:i/>
+          <w:iCs/>
+          <w:sz w:val="24"/>
+          <w:szCs w:val="24"/>
+          <w:lang w:val="pt-BR"/>
+        </w:rPr>
+        <w:t>Transport Layer Security</w:t>
+      </w:r>
+      <w:r>
+        <w:rPr>
+          <w:rFonts w:ascii="Times New Roman" w:hAnsi="Times New Roman" w:cs="Times New Roman"/>
+          <w:sz w:val="24"/>
+          <w:szCs w:val="24"/>
+          <w:lang w:val="pt-BR"/>
+        </w:rPr>
+        <w:t xml:space="preserve"> (TLS) tidak cukup melindungi dokumen surat dinas saat berada di tingkat penyimpanan (</w:t>
+      </w:r>
+      <w:r>
+        <w:rPr>
+          <w:rFonts w:ascii="Times New Roman" w:hAnsi="Times New Roman" w:cs="Times New Roman"/>
+          <w:i/>
+          <w:sz w:val="24"/>
+          <w:szCs w:val="24"/>
+          <w:lang w:val="fi-FI"/>
+        </w:rPr>
+        <w:t>data-at-rest</w:t>
+      </w:r>
+      <w:r>
+        <w:rPr>
+          <w:rFonts w:ascii="Times New Roman" w:hAnsi="Times New Roman" w:cs="Times New Roman"/>
+          <w:iCs/>
+          <w:sz w:val="24"/>
+          <w:szCs w:val="24"/>
+          <w:lang w:val="fi-FI"/>
+        </w:rPr>
+        <w:t>) maupun pengolahan (</w:t>
+      </w:r>
+      <w:r>
+        <w:rPr>
+          <w:rFonts w:ascii="Times New Roman" w:hAnsi="Times New Roman" w:cs="Times New Roman"/>
+          <w:i/>
+          <w:sz w:val="24"/>
+          <w:szCs w:val="24"/>
+          <w:lang w:val="fi-FI"/>
+        </w:rPr>
+        <w:t>data-in-use</w:t>
+      </w:r>
+      <w:r>
+        <w:t xml:space="preserve">). </w:t>
+      </w:r>
+      <w:proofErr w:type="spellStart"/>
+      <w:r>
+        <w:t>Ketiadaan</w:t>
+      </w:r>
+      <w:proofErr w:type="spellEnd"/>
+      <w:r>
+        <w:t xml:space="preserve"> </w:t>
+      </w:r>
+      <w:proofErr w:type="spellStart"/>
+      <w:r>
+        <w:t>otentikasi</w:t>
+      </w:r>
+      <w:proofErr w:type="spellEnd"/>
+      <w:r>
+        <w:t xml:space="preserve"> </w:t>
+      </w:r>
+      <w:proofErr w:type="spellStart"/>
+      <w:r>
+        <w:t>kriptografis</w:t>
+      </w:r>
+      <w:proofErr w:type="spellEnd"/>
+      <w:r>
+        <w:t xml:space="preserve"> pada </w:t>
+      </w:r>
+      <w:proofErr w:type="spellStart"/>
+      <w:r>
+        <w:t>tanda</w:t>
+      </w:r>
+      <w:proofErr w:type="spellEnd"/>
+      <w:r>
+        <w:t xml:space="preserve"> </w:t>
+      </w:r>
+      <w:proofErr w:type="spellStart"/>
+      <w:r>
+        <w:t>tangan</w:t>
+      </w:r>
+      <w:proofErr w:type="spellEnd"/>
+      <w:r>
+        <w:t xml:space="preserve"> digital </w:t>
+      </w:r>
+      <w:proofErr w:type="spellStart"/>
+      <w:r>
+        <w:t>biasa</w:t>
+      </w:r>
+      <w:proofErr w:type="spellEnd"/>
+      <w:r>
+        <w:t xml:space="preserve"> juga </w:t>
+      </w:r>
+      <w:proofErr w:type="spellStart"/>
+      <w:r>
+        <w:t>memicu</w:t>
+      </w:r>
+      <w:proofErr w:type="spellEnd"/>
+      <w:r>
+        <w:t xml:space="preserve"> </w:t>
+      </w:r>
+      <w:proofErr w:type="spellStart"/>
+      <w:r>
+        <w:t>risiko</w:t>
+      </w:r>
+      <w:proofErr w:type="spellEnd"/>
+      <w:r>
+        <w:t xml:space="preserve"> </w:t>
+      </w:r>
+      <w:proofErr w:type="spellStart"/>
+      <w:r>
+        <w:t>penyangkalan</w:t>
+      </w:r>
+      <w:proofErr w:type="spellEnd"/>
+      <w:r>
+        <w:t xml:space="preserve"> (</w:t>
+      </w:r>
+      <w:r>
+        <w:rPr>
+          <w:i/>
+        </w:rPr>
+        <w:t>repudiation</w:t>
+      </w:r>
+      <w:r>
+        <w:t xml:space="preserve">) dan </w:t>
+      </w:r>
+      <w:proofErr w:type="spellStart"/>
+      <w:r>
+        <w:t>pemalsuan</w:t>
+      </w:r>
+      <w:proofErr w:type="spellEnd"/>
+      <w:r>
+        <w:t xml:space="preserve"> </w:t>
+      </w:r>
+      <w:proofErr w:type="spellStart"/>
+      <w:r>
+        <w:t>dokumen</w:t>
+      </w:r>
+      <w:proofErr w:type="spellEnd"/>
+      <w:r>
+        <w:t xml:space="preserve"> </w:t>
+      </w:r>
+      <w:proofErr w:type="spellStart"/>
+      <w:r>
+        <w:t>naskah</w:t>
+      </w:r>
+      <w:proofErr w:type="spellEnd"/>
+      <w:r>
+        <w:t xml:space="preserve"> </w:t>
+      </w:r>
+      <w:proofErr w:type="spellStart"/>
+      <w:r>
+        <w:t>dinas</w:t>
+      </w:r>
+      <w:proofErr w:type="spellEnd"/>
+      <w:r>
+        <w:t xml:space="preserve"> </w:t>
+      </w:r>
+      <w:proofErr w:type="spellStart"/>
+      <w:r>
+        <w:t>resmi</w:t>
+      </w:r>
+      <w:proofErr w:type="spellEnd"/>
+      <w:r>
+        <w:t>.</w:t>
       </w:r>
     </w:p>
     <w:p>
       <w:pPr>
         <w:spacing w:after="0" w:line="240" w:lineRule="auto"/>
-        <w:jc w:val="center"/>
+        <w:jc w:val="both"/>
+        <w:rPr>
+          <w:rFonts w:ascii="Times New Roman" w:hAnsi="Times New Roman" w:cs="Times New Roman"/>
+          <w:sz w:val="24"/>
+          <w:szCs w:val="24"/>
+          <w:lang w:val="fi-FI"/>
+        </w:rPr>
+      </w:pPr>
+      <w:r>
+        <w:rPr>
+          <w:rFonts w:ascii="Times New Roman" w:hAnsi="Times New Roman" w:cs="Times New Roman"/>
+          <w:sz w:val="24"/>
+          <w:szCs w:val="24"/>
+          <w:lang w:val="fi-FI"/>
+        </w:rPr>
+        <w:t xml:space="preserve">Penelitian ini mengusulkan </w:t>
+      </w:r>
+      <w:r>
         <w:rPr>
           <w:rFonts w:ascii="Times New Roman" w:hAnsi="Times New Roman" w:cs="Times New Roman"/>
           <w:b/>
-          <w:bCs/>
-          <w:sz w:val="24"/>
-          <w:szCs w:val="24"/>
-          <w:lang w:val="pt-BR"/>
-        </w:rPr>
-      </w:pPr>
+          <w:iCs/>
+          <w:sz w:val="24"/>
+          <w:szCs w:val="24"/>
+          <w:lang w:val="fi-FI"/>
+        </w:rPr>
+        <w:t>SecSent</w:t>
+      </w:r>
+      <w:r>
+        <w:rPr>
+          <w:rFonts w:ascii="Times New Roman" w:hAnsi="Times New Roman" w:cs="Times New Roman"/>
+          <w:sz w:val="24"/>
+          <w:szCs w:val="24"/>
+          <w:lang w:val="fi-FI"/>
+        </w:rPr>
+        <w:t xml:space="preserve">, sebuah platform persuratan digital berbasis web berarsitektur </w:t>
+      </w:r>
+      <w:r>
+        <w:rPr>
+          <w:rFonts w:ascii="Times New Roman" w:hAnsi="Times New Roman" w:cs="Times New Roman"/>
+          <w:i/>
+          <w:iCs/>
+          <w:sz w:val="24"/>
+          <w:szCs w:val="24"/>
+          <w:lang w:val="fi-FI"/>
+        </w:rPr>
+        <w:t>Zero-Trust</w:t>
+      </w:r>
+      <w:r>
+        <w:rPr>
+          <w:rFonts w:ascii="Times New Roman" w:hAnsi="Times New Roman" w:cs="Times New Roman"/>
+          <w:sz w:val="24"/>
+          <w:szCs w:val="24"/>
+          <w:lang w:val="fi-FI"/>
+        </w:rPr>
+        <w:t xml:space="preserve"> yang menerapkan </w:t>
+      </w:r>
+      <w:r>
+        <w:rPr>
+          <w:rFonts w:ascii="Times New Roman" w:hAnsi="Times New Roman" w:cs="Times New Roman"/>
+          <w:i/>
+          <w:iCs/>
+          <w:sz w:val="24"/>
+          <w:szCs w:val="24"/>
+          <w:lang w:val="fi-FI"/>
+        </w:rPr>
+        <w:t>Object-Level Encryption</w:t>
+      </w:r>
+      <w:r>
+        <w:rPr>
+          <w:rFonts w:ascii="Times New Roman" w:hAnsi="Times New Roman" w:cs="Times New Roman"/>
+          <w:sz w:val="24"/>
+          <w:szCs w:val="24"/>
+          <w:lang w:val="fi-FI"/>
+        </w:rPr>
+        <w:t xml:space="preserve"> menggunakan </w:t>
+      </w:r>
+      <w:r>
+        <w:rPr>
+          <w:rFonts w:ascii="Times New Roman" w:hAnsi="Times New Roman" w:cs="Times New Roman"/>
+          <w:i/>
+          <w:iCs/>
+          <w:sz w:val="24"/>
+          <w:szCs w:val="24"/>
+          <w:lang w:val="fi-FI"/>
+        </w:rPr>
+        <w:t>Hybrid Cryptography</w:t>
+      </w:r>
+      <w:r>
+        <w:rPr>
+          <w:rFonts w:ascii="Times New Roman" w:hAnsi="Times New Roman" w:cs="Times New Roman"/>
+          <w:sz w:val="24"/>
+          <w:szCs w:val="24"/>
+          <w:lang w:val="fi-FI"/>
+        </w:rPr>
+        <w:t xml:space="preserve">. Sistem mengombinasikan enkripsi simetris </w:t>
+      </w:r>
       <w:r>
         <w:rPr>
           <w:rFonts w:ascii="Times New Roman" w:hAnsi="Times New Roman" w:cs="Times New Roman"/>
           <w:b/>
-          <w:bCs/>
-          <w:sz w:val="24"/>
-          <w:szCs w:val="24"/>
-          <w:lang w:val="pt-BR"/>
-        </w:rPr>
-        <w:t>oleh</w:t>
+          <w:iCs/>
+          <w:sz w:val="24"/>
+          <w:szCs w:val="24"/>
+          <w:lang w:val="fi-FI"/>
+        </w:rPr>
+        <w:t>AES-256-GCM</w:t>
+      </w:r>
+      <w:r>
+        <w:rPr>
+          <w:rFonts w:ascii="Times New Roman" w:hAnsi="Times New Roman" w:cs="Times New Roman"/>
+          <w:sz w:val="24"/>
+          <w:szCs w:val="24"/>
+          <w:lang w:val="fi-FI"/>
+        </w:rPr>
+        <w:t xml:space="preserve"> untuk </w:t>
+      </w:r>
+      <w:r>
+        <w:rPr>
+          <w:rFonts w:ascii="Times New Roman" w:hAnsi="Times New Roman" w:cs="Times New Roman"/>
+          <w:i/>
+          <w:iCs/>
+          <w:sz w:val="24"/>
+          <w:szCs w:val="24"/>
+          <w:lang w:val="fi-FI"/>
+        </w:rPr>
+        <w:t>payload</w:t>
+      </w:r>
+      <w:r>
+        <w:rPr>
+          <w:rFonts w:ascii="Times New Roman" w:hAnsi="Times New Roman" w:cs="Times New Roman"/>
+          <w:sz w:val="24"/>
+          <w:szCs w:val="24"/>
+          <w:lang w:val="fi-FI"/>
+        </w:rPr>
+        <w:t xml:space="preserve"> dokumen, pembungkusan kunci (</w:t>
+      </w:r>
+      <w:r>
+        <w:rPr>
+          <w:rFonts w:ascii="Times New Roman" w:hAnsi="Times New Roman" w:cs="Times New Roman"/>
+          <w:i/>
+          <w:iCs/>
+          <w:sz w:val="24"/>
+          <w:szCs w:val="24"/>
+          <w:lang w:val="fi-FI"/>
+        </w:rPr>
+        <w:t>key wrapping</w:t>
+      </w:r>
+      <w:r>
+        <w:rPr>
+          <w:rFonts w:ascii="Times New Roman" w:hAnsi="Times New Roman" w:cs="Times New Roman"/>
+          <w:sz w:val="24"/>
+          <w:szCs w:val="24"/>
+          <w:lang w:val="fi-FI"/>
+        </w:rPr>
+        <w:t xml:space="preserve">) kurva eliptik </w:t>
+      </w:r>
+      <w:r>
+        <w:rPr>
+          <w:rFonts w:ascii="Times New Roman" w:hAnsi="Times New Roman" w:cs="Times New Roman"/>
+          <w:b/>
+          <w:iCs/>
+          <w:sz w:val="24"/>
+          <w:szCs w:val="24"/>
+          <w:lang w:val="fi-FI"/>
+        </w:rPr>
+        <w:t>X25519</w:t>
+      </w:r>
+      <w:r>
+        <w:rPr>
+          <w:rFonts w:ascii="Times New Roman" w:hAnsi="Times New Roman" w:cs="Times New Roman"/>
+          <w:sz w:val="24"/>
+          <w:szCs w:val="24"/>
+          <w:lang w:val="fi-FI"/>
+        </w:rPr>
+        <w:t xml:space="preserve"> untuk distribusi kunci aman, dan tanda tangan digital </w:t>
+      </w:r>
+      <w:r>
+        <w:rPr>
+          <w:rFonts w:ascii="Times New Roman" w:hAnsi="Times New Roman" w:cs="Times New Roman"/>
+          <w:b/>
+          <w:iCs/>
+          <w:sz w:val="24"/>
+          <w:szCs w:val="24"/>
+          <w:lang w:val="fi-FI"/>
+        </w:rPr>
+        <w:t>Ed25519</w:t>
+      </w:r>
+      <w:r>
+        <w:rPr>
+          <w:rFonts w:ascii="Times New Roman" w:hAnsi="Times New Roman" w:cs="Times New Roman"/>
+          <w:sz w:val="24"/>
+          <w:szCs w:val="24"/>
+          <w:lang w:val="fi-FI"/>
+        </w:rPr>
+        <w:t xml:space="preserve"> untuk keabsahan hukum (</w:t>
+      </w:r>
+      <w:r>
+        <w:rPr>
+          <w:rFonts w:ascii="Times New Roman" w:hAnsi="Times New Roman" w:cs="Times New Roman"/>
+          <w:i/>
+          <w:iCs/>
+          <w:sz w:val="24"/>
+          <w:szCs w:val="24"/>
+          <w:lang w:val="fi-FI"/>
+        </w:rPr>
+        <w:t>non-repudiation</w:t>
+      </w:r>
+      <w:r>
+        <w:rPr>
+          <w:rFonts w:ascii="Times New Roman" w:hAnsi="Times New Roman" w:cs="Times New Roman"/>
+          <w:sz w:val="24"/>
+          <w:szCs w:val="24"/>
+          <w:lang w:val="fi-FI"/>
+        </w:rPr>
+        <w:t xml:space="preserve">). Selain itu, sistem diperkuat dengan </w:t>
+      </w:r>
+      <w:r>
+        <w:rPr>
+          <w:rFonts w:ascii="Times New Roman" w:hAnsi="Times New Roman" w:cs="Times New Roman"/>
+          <w:b/>
+          <w:iCs/>
+          <w:sz w:val="24"/>
+          <w:szCs w:val="24"/>
+          <w:lang w:val="fi-FI"/>
+        </w:rPr>
+        <w:t>Multi-Agentic AI Subsystem</w:t>
+      </w:r>
+      <w:r>
+        <w:rPr>
+          <w:rFonts w:ascii="Times New Roman" w:hAnsi="Times New Roman" w:cs="Times New Roman"/>
+          <w:sz w:val="24"/>
+          <w:szCs w:val="24"/>
+          <w:lang w:val="fi-FI"/>
+        </w:rPr>
+        <w:t xml:space="preserve"> berbasis </w:t>
+      </w:r>
+      <w:r>
+        <w:rPr>
+          <w:i/>
+        </w:rPr>
+        <w:t>human-in-the-loop</w:t>
+      </w:r>
+      <w:r>
+        <w:t xml:space="preserve"> </w:t>
+      </w:r>
+      <w:proofErr w:type="spellStart"/>
+      <w:r>
+        <w:t>untuk</w:t>
+      </w:r>
+      <w:proofErr w:type="spellEnd"/>
+      <w:r>
+        <w:t xml:space="preserve"> </w:t>
+      </w:r>
+      <w:proofErr w:type="spellStart"/>
+      <w:r>
+        <w:t>analisis</w:t>
+      </w:r>
+      <w:proofErr w:type="spellEnd"/>
+      <w:r>
+        <w:t xml:space="preserve"> </w:t>
+      </w:r>
+      <w:proofErr w:type="spellStart"/>
+      <w:r>
+        <w:t>risiko</w:t>
+      </w:r>
+      <w:proofErr w:type="spellEnd"/>
+      <w:r>
+        <w:t xml:space="preserve"> </w:t>
+      </w:r>
+      <w:proofErr w:type="spellStart"/>
+      <w:r>
+        <w:t>dokumen</w:t>
+      </w:r>
+      <w:proofErr w:type="spellEnd"/>
+      <w:r>
+        <w:t xml:space="preserve">, </w:t>
+      </w:r>
+      <w:proofErr w:type="spellStart"/>
+      <w:r>
+        <w:t>klasifikasi</w:t>
+      </w:r>
+      <w:proofErr w:type="spellEnd"/>
+      <w:r>
+        <w:t xml:space="preserve"> </w:t>
+      </w:r>
+      <w:proofErr w:type="spellStart"/>
+      <w:r>
+        <w:t>surat</w:t>
+      </w:r>
+      <w:proofErr w:type="spellEnd"/>
+      <w:r>
+        <w:t xml:space="preserve"> </w:t>
+      </w:r>
+      <w:proofErr w:type="spellStart"/>
+      <w:r>
+        <w:t>otomatis</w:t>
+      </w:r>
+      <w:proofErr w:type="spellEnd"/>
+      <w:r>
+        <w:t xml:space="preserve">, dan </w:t>
+      </w:r>
+      <w:proofErr w:type="spellStart"/>
+      <w:r>
+        <w:t>redaksi</w:t>
+      </w:r>
+      <w:proofErr w:type="spellEnd"/>
+      <w:r>
+        <w:t xml:space="preserve"> </w:t>
+      </w:r>
+      <w:r>
+        <w:rPr>
+          <w:i/>
+        </w:rPr>
+        <w:t>PII (Personally Identifiable Information)</w:t>
+      </w:r>
+      <w:r>
+        <w:t xml:space="preserve">. </w:t>
+      </w:r>
+      <w:proofErr w:type="spellStart"/>
+      <w:r>
+        <w:t>Pengujian</w:t>
+      </w:r>
+      <w:proofErr w:type="spellEnd"/>
+      <w:r>
+        <w:t xml:space="preserve"> </w:t>
+      </w:r>
+      <w:proofErr w:type="spellStart"/>
+      <w:r>
+        <w:t>dilakukan</w:t>
+      </w:r>
+      <w:proofErr w:type="spellEnd"/>
+      <w:r>
+        <w:t xml:space="preserve"> </w:t>
+      </w:r>
+      <w:proofErr w:type="spellStart"/>
+      <w:r>
+        <w:t>mengacu</w:t>
+      </w:r>
+      <w:proofErr w:type="spellEnd"/>
+      <w:r>
+        <w:t xml:space="preserve"> pada </w:t>
+      </w:r>
+      <w:proofErr w:type="spellStart"/>
+      <w:r>
+        <w:t>standar</w:t>
+      </w:r>
+      <w:proofErr w:type="spellEnd"/>
+      <w:r>
+        <w:t xml:space="preserve"> </w:t>
+      </w:r>
+      <w:r>
+        <w:rPr>
+          <w:b/>
+        </w:rPr>
+        <w:t>ISO/IEC 25010:2011</w:t>
+      </w:r>
+      <w:r>
+        <w:t xml:space="preserve">, </w:t>
+      </w:r>
+      <w:r>
+        <w:rPr>
+          <w:b/>
+        </w:rPr>
+        <w:t>NIST SP 800-115</w:t>
+      </w:r>
+      <w:r>
+        <w:t xml:space="preserve">, dan </w:t>
+      </w:r>
+      <w:r>
+        <w:rPr>
+          <w:b/>
+        </w:rPr>
+        <w:t>FIPS 140-3</w:t>
+      </w:r>
+      <w:r>
+        <w:t xml:space="preserve">. Hasil </w:t>
+      </w:r>
+      <w:proofErr w:type="spellStart"/>
+      <w:r>
+        <w:t>evaluasi</w:t>
+      </w:r>
+      <w:proofErr w:type="spellEnd"/>
+      <w:r>
+        <w:t xml:space="preserve"> </w:t>
+      </w:r>
+      <w:proofErr w:type="spellStart"/>
+      <w:r>
+        <w:t>empiris</w:t>
+      </w:r>
+      <w:proofErr w:type="spellEnd"/>
+      <w:r>
+        <w:t xml:space="preserve"> </w:t>
+      </w:r>
+      <w:proofErr w:type="spellStart"/>
+      <w:r>
+        <w:t>menunjukkan</w:t>
+      </w:r>
+      <w:proofErr w:type="spellEnd"/>
+      <w:r>
+        <w:t xml:space="preserve"> </w:t>
+      </w:r>
+      <w:proofErr w:type="spellStart"/>
+      <w:r>
+        <w:t>bahwa</w:t>
+      </w:r>
+      <w:proofErr w:type="spellEnd"/>
+      <w:r>
+        <w:t xml:space="preserve"> </w:t>
+      </w:r>
+      <w:proofErr w:type="spellStart"/>
+      <w:r>
+        <w:t>sistem</w:t>
+      </w:r>
+      <w:proofErr w:type="spellEnd"/>
+      <w:r>
+        <w:t xml:space="preserve"> </w:t>
+      </w:r>
+      <w:proofErr w:type="spellStart"/>
+      <w:r>
+        <w:t>berhasil</w:t>
+      </w:r>
+      <w:proofErr w:type="spellEnd"/>
+      <w:r>
+        <w:t xml:space="preserve"> </w:t>
+      </w:r>
+      <w:proofErr w:type="spellStart"/>
+      <w:r>
+        <w:t>menolak</w:t>
+      </w:r>
+      <w:proofErr w:type="spellEnd"/>
+      <w:r>
+        <w:t xml:space="preserve"> 100% </w:t>
+      </w:r>
+      <w:proofErr w:type="spellStart"/>
+      <w:r>
+        <w:t>manipulasi</w:t>
+      </w:r>
+      <w:proofErr w:type="spellEnd"/>
+      <w:r>
+        <w:t xml:space="preserve"> biner oleh Administrator Database (DBA) </w:t>
+      </w:r>
+      <w:proofErr w:type="spellStart"/>
+      <w:r>
+        <w:t>dengan</w:t>
+      </w:r>
+      <w:proofErr w:type="spellEnd"/>
+      <w:r>
+        <w:t xml:space="preserve"> </w:t>
+      </w:r>
+      <w:proofErr w:type="spellStart"/>
+      <w:r>
+        <w:t>latensi</w:t>
+      </w:r>
+      <w:proofErr w:type="spellEnd"/>
+      <w:r>
+        <w:t xml:space="preserve"> </w:t>
+      </w:r>
+      <w:proofErr w:type="spellStart"/>
+      <w:r>
+        <w:t>enkripsi</w:t>
+      </w:r>
+      <w:proofErr w:type="spellEnd"/>
+      <w:r>
+        <w:t xml:space="preserve"> sangat </w:t>
+      </w:r>
+      <w:proofErr w:type="spellStart"/>
+      <w:r>
+        <w:t>rendah</w:t>
+      </w:r>
+      <w:proofErr w:type="spellEnd"/>
+      <w:r>
+        <w:t xml:space="preserve">, </w:t>
+      </w:r>
+      <w:r>
+        <w:rPr>
+          <w:i/>
+        </w:rPr>
+        <w:t>throughput</w:t>
+      </w:r>
+      <w:r>
+        <w:t xml:space="preserve"> </w:t>
+      </w:r>
+      <w:proofErr w:type="spellStart"/>
+      <w:r>
+        <w:t>komputasi</w:t>
+      </w:r>
+      <w:proofErr w:type="spellEnd"/>
+      <w:r>
+        <w:t xml:space="preserve"> </w:t>
+      </w:r>
+      <w:proofErr w:type="spellStart"/>
+      <w:r>
+        <w:t>tinggi</w:t>
+      </w:r>
+      <w:proofErr w:type="spellEnd"/>
+      <w:r>
+        <w:t xml:space="preserve">, </w:t>
+      </w:r>
+      <w:proofErr w:type="spellStart"/>
+      <w:r>
+        <w:t>efisiensi</w:t>
+      </w:r>
+      <w:proofErr w:type="spellEnd"/>
+      <w:r>
+        <w:t xml:space="preserve"> </w:t>
+      </w:r>
+      <w:proofErr w:type="spellStart"/>
+      <w:r>
+        <w:t>memori</w:t>
+      </w:r>
+      <w:proofErr w:type="spellEnd"/>
+      <w:r>
+        <w:t xml:space="preserve"> </w:t>
+      </w:r>
+      <w:r>
+        <w:rPr>
+          <w:i/>
+        </w:rPr>
+        <w:t>heap</w:t>
+      </w:r>
+      <w:r>
+        <w:t xml:space="preserve">, </w:t>
+      </w:r>
+      <w:proofErr w:type="spellStart"/>
+      <w:r>
+        <w:t>serta</w:t>
+      </w:r>
+      <w:proofErr w:type="spellEnd"/>
+      <w:r>
+        <w:t xml:space="preserve"> </w:t>
+      </w:r>
+      <w:proofErr w:type="spellStart"/>
+      <w:r>
+        <w:t>tingkat</w:t>
+      </w:r>
+      <w:proofErr w:type="spellEnd"/>
+      <w:r>
+        <w:t xml:space="preserve"> </w:t>
+      </w:r>
+      <w:proofErr w:type="spellStart"/>
+      <w:r>
+        <w:t>kebergunaan</w:t>
+      </w:r>
+      <w:proofErr w:type="spellEnd"/>
+      <w:r>
+        <w:t xml:space="preserve"> </w:t>
+      </w:r>
+      <w:proofErr w:type="spellStart"/>
+      <w:r>
+        <w:t>antarmuka</w:t>
+      </w:r>
+      <w:proofErr w:type="spellEnd"/>
+      <w:r>
+        <w:t xml:space="preserve"> yang </w:t>
+      </w:r>
+      <w:proofErr w:type="spellStart"/>
+      <w:r>
+        <w:t>teruji</w:t>
+      </w:r>
+      <w:proofErr w:type="spellEnd"/>
+      <w:r>
+        <w:t xml:space="preserve"> via </w:t>
+      </w:r>
+      <w:r>
+        <w:rPr>
+          <w:i/>
+        </w:rPr>
+        <w:t>System Usability Scale</w:t>
+      </w:r>
+      <w:r>
+        <w:t xml:space="preserve"> (SUS).</w:t>
       </w:r>
     </w:p>
     <w:p>
       <w:pPr>
         <w:spacing w:after="0" w:line="240" w:lineRule="auto"/>
-        <w:jc w:val="center"/>
-        <w:rPr>
-          <w:rFonts w:ascii="Times New Roman" w:hAnsi="Times New Roman" w:cs="Times New Roman"/>
-          <w:sz w:val="24"/>
-          <w:szCs w:val="24"/>
-          <w:lang w:val="pt-BR"/>
+        <w:jc w:val="both"/>
+        <w:rPr>
+          <w:rFonts w:ascii="Times New Roman" w:hAnsi="Times New Roman" w:cs="Times New Roman"/>
+          <w:sz w:val="24"/>
+          <w:szCs w:val="24"/>
+          <w:lang w:val="fi-FI"/>
         </w:rPr>
       </w:pPr>
     </w:p>
     <w:p>
       <w:pPr>
         <w:spacing w:after="0" w:line="240" w:lineRule="auto"/>
-        <w:jc w:val="center"/>
-        <w:rPr>
-          <w:rFonts w:ascii="Times New Roman" w:hAnsi="Times New Roman" w:cs="Times New Roman"/>
-          <w:sz w:val="24"/>
-          <w:szCs w:val="24"/>
-          <w:lang w:val="pt-BR"/>
-        </w:rPr>
-      </w:pPr>
-      <w:r>
-        <w:rPr>
-          <w:rFonts w:ascii="Times New Roman" w:hAnsi="Times New Roman" w:cs="Times New Roman"/>
-          <w:sz w:val="24"/>
-          <w:szCs w:val="24"/>
-          <w:lang w:val="pt-BR"/>
-        </w:rPr>
-        <w:t>Satria Alba Pramasha</w:t>
+        <w:jc w:val="both"/>
+        <w:rPr>
+          <w:rFonts w:ascii="Times New Roman" w:hAnsi="Times New Roman" w:cs="Times New Roman"/>
+          <w:sz w:val="24"/>
+          <w:szCs w:val="24"/>
+          <w:lang w:val="en-US"/>
+        </w:rPr>
+      </w:pPr>
+      <w:r>
+        <w:rPr>
+          <w:rFonts w:ascii="Times New Roman" w:hAnsi="Times New Roman" w:cs="Times New Roman"/>
+          <w:sz w:val="24"/>
+          <w:szCs w:val="24"/>
+          <w:lang w:val="en-US"/>
+        </w:rPr>
+        <w:t xml:space="preserve">x + 31 </w:t>
+      </w:r>
+      <w:proofErr w:type="spellStart"/>
+      <w:r>
+        <w:rPr>
+          <w:rFonts w:ascii="Times New Roman" w:hAnsi="Times New Roman" w:cs="Times New Roman"/>
+          <w:sz w:val="24"/>
+          <w:szCs w:val="24"/>
+          <w:lang w:val="en-US"/>
+        </w:rPr>
+        <w:t>halaman</w:t>
+      </w:r>
+      <w:proofErr w:type="spellEnd"/>
+      <w:r>
+        <w:rPr>
+          <w:rFonts w:ascii="Times New Roman" w:hAnsi="Times New Roman" w:cs="Times New Roman"/>
+          <w:sz w:val="24"/>
+          <w:szCs w:val="24"/>
+          <w:lang w:val="en-US"/>
+        </w:rPr>
+        <w:t xml:space="preserve"> + </w:t>
+      </w:r>
+      <w:proofErr w:type="spellStart"/>
+      <w:r>
+        <w:rPr>
+          <w:rFonts w:ascii="Times New Roman" w:hAnsi="Times New Roman" w:cs="Times New Roman"/>
+          <w:sz w:val="24"/>
+          <w:szCs w:val="24"/>
+          <w:lang w:val="en-US"/>
+        </w:rPr>
+        <w:t>lampiran</w:t>
+      </w:r>
+      <w:proofErr w:type="spellEnd"/>
+      <w:r>
+        <w:rPr>
+          <w:rFonts w:ascii="Times New Roman" w:hAnsi="Times New Roman" w:cs="Times New Roman"/>
+          <w:sz w:val="24"/>
+          <w:szCs w:val="24"/>
+          <w:lang w:val="en-US"/>
+        </w:rPr>
+        <w:t xml:space="preserve"> (2026)</w:t>
       </w:r>
     </w:p>
     <w:p>
       <w:pPr>
         <w:spacing w:after="0" w:line="240" w:lineRule="auto"/>
-        <w:jc w:val="center"/>
-        <w:rPr>
-          <w:rFonts w:ascii="Times New Roman" w:hAnsi="Times New Roman" w:cs="Times New Roman"/>
-          <w:sz w:val="24"/>
-          <w:szCs w:val="24"/>
-          <w:lang w:val="pt-BR"/>
-        </w:rPr>
-      </w:pPr>
-      <w:r>
-        <w:t>2322101974</w:t>
-      </w:r>
-    </w:p>
-    <w:p>
-      <w:pPr>
-        <w:spacing w:after="0" w:line="240" w:lineRule="auto"/>
-        <w:jc w:val="center"/>
-        <w:rPr>
-          <w:rFonts w:ascii="Times New Roman" w:hAnsi="Times New Roman" w:cs="Times New Roman"/>
-          <w:sz w:val="24"/>
-          <w:szCs w:val="24"/>
-          <w:lang w:val="pt-BR"/>
-        </w:rPr>
-      </w:pPr>
-    </w:p>
-    <w:p>
-      <w:pPr>
-        <w:spacing w:after="0" w:line="240" w:lineRule="auto"/>
-        <w:jc w:val="center"/>
-        <w:rPr>
-          <w:rFonts w:ascii="Times New Roman" w:hAnsi="Times New Roman" w:cs="Times New Roman"/>
-          <w:sz w:val="24"/>
-          <w:szCs w:val="24"/>
-          <w:lang w:val="pt-BR"/>
-        </w:rPr>
-      </w:pPr>
-      <w:r>
-        <w:rPr>
-          <w:rFonts w:ascii="Times New Roman" w:hAnsi="Times New Roman" w:cs="Times New Roman"/>
-          <w:sz w:val="24"/>
-          <w:szCs w:val="24"/>
-          <w:lang w:val="pt-BR"/>
-        </w:rPr>
-        <w:t>Rekayasa Kriptografi</w:t>
-      </w:r>
-    </w:p>
-    <w:p>
-      <w:pPr>
-        <w:spacing w:after="0" w:line="240" w:lineRule="auto"/>
-        <w:jc w:val="center"/>
-        <w:rPr>
-          <w:rFonts w:ascii="Times New Roman" w:hAnsi="Times New Roman" w:cs="Times New Roman"/>
-          <w:sz w:val="24"/>
-          <w:szCs w:val="24"/>
-          <w:lang w:val="pt-BR"/>
-        </w:rPr>
-      </w:pPr>
-    </w:p>
-    <w:p>
-      <w:pPr>
-        <w:spacing w:after="0" w:line="240" w:lineRule="auto"/>
-        <w:jc w:val="center"/>
-        <w:rPr>
-          <w:rFonts w:ascii="Times New Roman" w:hAnsi="Times New Roman" w:cs="Times New Roman"/>
-          <w:sz w:val="24"/>
-          <w:szCs w:val="24"/>
-          <w:lang w:val="pt-BR"/>
-        </w:rPr>
-      </w:pPr>
-    </w:p>
-    <w:p>
-      <w:pPr>
-        <w:spacing w:after="0" w:line="240" w:lineRule="auto"/>
-        <w:jc w:val="center"/>
-        <w:rPr>
-          <w:rFonts w:ascii="Times New Roman" w:hAnsi="Times New Roman" w:cs="Times New Roman"/>
-          <w:sz w:val="24"/>
-          <w:szCs w:val="24"/>
-          <w:lang w:val="pt-BR"/>
-        </w:rPr>
-      </w:pPr>
-    </w:p>
-    <w:p>
-      <w:pPr>
-        <w:spacing w:after="0" w:line="240" w:lineRule="auto"/>
         <w:jc w:val="both"/>
         <w:rPr>
           <w:rFonts w:ascii="Times New Roman" w:hAnsi="Times New Roman" w:cs="Times New Roman"/>
           <w:sz w:val="24"/>
           <w:szCs w:val="24"/>
-          <w:lang w:val="fi-FI"/>
-        </w:rPr>
-      </w:pPr>
-      <w:r>
-        <w:rPr>
-          <w:rFonts w:ascii="Times New Roman" w:hAnsi="Times New Roman" w:cs="Times New Roman"/>
-          <w:sz w:val="24"/>
-          <w:szCs w:val="24"/>
-          <w:lang w:val="pt-BR"/>
-        </w:rPr>
-        <w:t>Sistem Tata Naskah Dinas Elektronik (TNDE) konvensional pada instansi pemerintahan sering kali rentan terhadap kebocoran data tingkat basis data (</w:t>
-      </w:r>
+          <w:lang w:val="en-US"/>
+        </w:rPr>
+      </w:pPr>
+      <w:r>
+        <w:rPr>
+          <w:rFonts w:ascii="Times New Roman" w:hAnsi="Times New Roman" w:cs="Times New Roman"/>
+          <w:sz w:val="24"/>
+          <w:szCs w:val="24"/>
+          <w:lang w:val="en-US"/>
+        </w:rPr>
+        <w:t xml:space="preserve">Kata </w:t>
+      </w:r>
+      <w:proofErr w:type="spellStart"/>
+      <w:proofErr w:type="gramStart"/>
+      <w:r>
+        <w:rPr>
+          <w:rFonts w:ascii="Times New Roman" w:hAnsi="Times New Roman" w:cs="Times New Roman"/>
+          <w:sz w:val="24"/>
+          <w:szCs w:val="24"/>
+          <w:lang w:val="en-US"/>
+        </w:rPr>
+        <w:t>kunci</w:t>
+      </w:r>
+      <w:proofErr w:type="spellEnd"/>
+      <w:r>
+        <w:rPr>
+          <w:rFonts w:ascii="Times New Roman" w:hAnsi="Times New Roman" w:cs="Times New Roman"/>
+          <w:sz w:val="24"/>
+          <w:szCs w:val="24"/>
+          <w:lang w:val="en-US"/>
+        </w:rPr>
+        <w:t xml:space="preserve"> :</w:t>
+      </w:r>
+      <w:proofErr w:type="gramEnd"/>
+      <w:r>
+        <w:rPr>
+          <w:rFonts w:ascii="Times New Roman" w:hAnsi="Times New Roman" w:cs="Times New Roman"/>
+          <w:sz w:val="24"/>
+          <w:szCs w:val="24"/>
+          <w:lang w:val="en-US"/>
+        </w:rPr>
+        <w:t xml:space="preserve"> </w:t>
+      </w:r>
+      <w:proofErr w:type="spellStart"/>
       <w:r>
         <w:rPr>
           <w:rFonts w:ascii="Times New Roman" w:hAnsi="Times New Roman" w:cs="Times New Roman"/>
@@ -4724,19 +5050,10 @@
           <w:iCs/>
           <w:sz w:val="24"/>
           <w:szCs w:val="24"/>
-          <w:lang w:val="pt-BR"/>
-        </w:rPr>
-        <w:t>database</w:t>
-      </w:r>
-      <w:r>
-        <w:rPr>
-          <w:rFonts w:ascii="Times New Roman" w:hAnsi="Times New Roman" w:cs="Times New Roman"/>
-          <w:sz w:val="24"/>
-          <w:szCs w:val="24"/>
-          <w:lang w:val="pt-BR"/>
-        </w:rPr>
-        <w:t>) dan serangan internal (</w:t>
-      </w:r>
+        </w:rPr>
+        <w:t>Persuratan</w:t>
+      </w:r>
+      <w:proofErr w:type="spellEnd"/>
       <w:r>
         <w:rPr>
           <w:rFonts w:ascii="Times New Roman" w:hAnsi="Times New Roman" w:cs="Times New Roman"/>
@@ -4744,18 +5061,16 @@
           <w:iCs/>
           <w:sz w:val="24"/>
           <w:szCs w:val="24"/>
-          <w:lang w:val="pt-BR"/>
-        </w:rPr>
-        <w:t>insider attack</w:t>
-      </w:r>
-      <w:r>
-        <w:rPr>
-          <w:rFonts w:ascii="Times New Roman" w:hAnsi="Times New Roman" w:cs="Times New Roman"/>
-          <w:sz w:val="24"/>
-          <w:szCs w:val="24"/>
-          <w:lang w:val="pt-BR"/>
-        </w:rPr>
-        <w:t xml:space="preserve">). Ketergantungan pada </w:t>
+        </w:rPr>
+        <w:t xml:space="preserve"> Digital</w:t>
+      </w:r>
+      <w:r>
+        <w:rPr>
+          <w:rFonts w:ascii="Times New Roman" w:hAnsi="Times New Roman" w:cs="Times New Roman"/>
+          <w:sz w:val="24"/>
+          <w:szCs w:val="24"/>
+        </w:rPr>
+        <w:t xml:space="preserve">, </w:t>
       </w:r>
       <w:r>
         <w:rPr>
@@ -4764,18 +5079,16 @@
           <w:iCs/>
           <w:sz w:val="24"/>
           <w:szCs w:val="24"/>
-          <w:lang w:val="pt-BR"/>
-        </w:rPr>
-        <w:t>Transparent Data Encryption</w:t>
-      </w:r>
-      <w:r>
-        <w:rPr>
-          <w:rFonts w:ascii="Times New Roman" w:hAnsi="Times New Roman" w:cs="Times New Roman"/>
-          <w:sz w:val="24"/>
-          <w:szCs w:val="24"/>
-          <w:lang w:val="pt-BR"/>
-        </w:rPr>
-        <w:t xml:space="preserve"> (TDE) dan </w:t>
+        </w:rPr>
+        <w:t>Zero-Trust Architecture</w:t>
+      </w:r>
+      <w:r>
+        <w:rPr>
+          <w:rFonts w:ascii="Times New Roman" w:hAnsi="Times New Roman" w:cs="Times New Roman"/>
+          <w:sz w:val="24"/>
+          <w:szCs w:val="24"/>
+        </w:rPr>
+        <w:t xml:space="preserve">, </w:t>
       </w:r>
       <w:r>
         <w:rPr>
@@ -4784,213 +5097,16 @@
           <w:iCs/>
           <w:sz w:val="24"/>
           <w:szCs w:val="24"/>
-          <w:lang w:val="pt-BR"/>
-        </w:rPr>
-        <w:t>Transport Layer Security</w:t>
-      </w:r>
-      <w:r>
-        <w:rPr>
-          <w:rFonts w:ascii="Times New Roman" w:hAnsi="Times New Roman" w:cs="Times New Roman"/>
-          <w:sz w:val="24"/>
-          <w:szCs w:val="24"/>
-          <w:lang w:val="pt-BR"/>
-        </w:rPr>
-        <w:t xml:space="preserve"> (TLS) tidak cukup melindungi dokumen surat dinas saat berada di tingkat penyimpanan (</w:t>
-      </w:r>
-      <w:r>
-        <w:rPr>
-          <w:rFonts w:ascii="Times New Roman" w:hAnsi="Times New Roman" w:cs="Times New Roman"/>
-          <w:i/>
-          <w:sz w:val="24"/>
-          <w:szCs w:val="24"/>
-          <w:lang w:val="fi-FI"/>
-        </w:rPr>
-        <w:t>data-at-rest</w:t>
-      </w:r>
-      <w:r>
-        <w:rPr>
-          <w:rFonts w:ascii="Times New Roman" w:hAnsi="Times New Roman" w:cs="Times New Roman"/>
-          <w:iCs/>
-          <w:sz w:val="24"/>
-          <w:szCs w:val="24"/>
-          <w:lang w:val="fi-FI"/>
-        </w:rPr>
-        <w:t>) maupun pengolahan (</w:t>
-      </w:r>
-      <w:r>
-        <w:rPr>
-          <w:rFonts w:ascii="Times New Roman" w:hAnsi="Times New Roman" w:cs="Times New Roman"/>
-          <w:i/>
-          <w:sz w:val="24"/>
-          <w:szCs w:val="24"/>
-          <w:lang w:val="fi-FI"/>
-        </w:rPr>
-        <w:t>data-in-use</w:t>
-      </w:r>
-      <w:r>
-        <w:t xml:space="preserve">). </w:t>
-      </w:r>
-      <w:proofErr w:type="spellStart"/>
-      <w:r>
-        <w:t>Ketiadaan</w:t>
-      </w:r>
-      <w:proofErr w:type="spellEnd"/>
-      <w:r>
-        <w:t xml:space="preserve"> </w:t>
-      </w:r>
-      <w:proofErr w:type="spellStart"/>
-      <w:r>
-        <w:t>otentikasi</w:t>
-      </w:r>
-      <w:proofErr w:type="spellEnd"/>
-      <w:r>
-        <w:t xml:space="preserve"> </w:t>
-      </w:r>
-      <w:proofErr w:type="spellStart"/>
-      <w:r>
-        <w:t>kriptografis</w:t>
-      </w:r>
-      <w:proofErr w:type="spellEnd"/>
-      <w:r>
-        <w:t xml:space="preserve"> pada </w:t>
-      </w:r>
-      <w:proofErr w:type="spellStart"/>
-      <w:r>
-        <w:t>tanda</w:t>
-      </w:r>
-      <w:proofErr w:type="spellEnd"/>
-      <w:r>
-        <w:t xml:space="preserve"> </w:t>
-      </w:r>
-      <w:proofErr w:type="spellStart"/>
-      <w:r>
-        <w:t>tangan</w:t>
-      </w:r>
-      <w:proofErr w:type="spellEnd"/>
-      <w:r>
-        <w:t xml:space="preserve"> digital </w:t>
-      </w:r>
-      <w:proofErr w:type="spellStart"/>
-      <w:r>
-        <w:t>biasa</w:t>
-      </w:r>
-      <w:proofErr w:type="spellEnd"/>
-      <w:r>
-        <w:t xml:space="preserve"> juga </w:t>
-      </w:r>
-      <w:proofErr w:type="spellStart"/>
-      <w:r>
-        <w:t>memicu</w:t>
-      </w:r>
-      <w:proofErr w:type="spellEnd"/>
-      <w:r>
-        <w:t xml:space="preserve"> </w:t>
-      </w:r>
-      <w:proofErr w:type="spellStart"/>
-      <w:r>
-        <w:t>risiko</w:t>
-      </w:r>
-      <w:proofErr w:type="spellEnd"/>
-      <w:r>
-        <w:t xml:space="preserve"> </w:t>
-      </w:r>
-      <w:proofErr w:type="spellStart"/>
-      <w:r>
-        <w:t>penyangkalan</w:t>
-      </w:r>
-      <w:proofErr w:type="spellEnd"/>
-      <w:r>
-        <w:t xml:space="preserve"> (</w:t>
-      </w:r>
-      <w:r>
-        <w:rPr>
-          <w:i/>
-        </w:rPr>
-        <w:t>repudiation</w:t>
-      </w:r>
-      <w:r>
-        <w:t xml:space="preserve">) dan </w:t>
-      </w:r>
-      <w:proofErr w:type="spellStart"/>
-      <w:r>
-        <w:t>pemalsuan</w:t>
-      </w:r>
-      <w:proofErr w:type="spellEnd"/>
-      <w:r>
-        <w:t xml:space="preserve"> </w:t>
-      </w:r>
-      <w:proofErr w:type="spellStart"/>
-      <w:r>
-        <w:t>dokumen</w:t>
-      </w:r>
-      <w:proofErr w:type="spellEnd"/>
-      <w:r>
-        <w:t xml:space="preserve"> </w:t>
-      </w:r>
-      <w:proofErr w:type="spellStart"/>
-      <w:r>
-        <w:t>naskah</w:t>
-      </w:r>
-      <w:proofErr w:type="spellEnd"/>
-      <w:r>
-        <w:t xml:space="preserve"> </w:t>
-      </w:r>
-      <w:proofErr w:type="spellStart"/>
-      <w:r>
-        <w:t>dinas</w:t>
-      </w:r>
-      <w:proofErr w:type="spellEnd"/>
-      <w:r>
-        <w:t xml:space="preserve"> </w:t>
-      </w:r>
-      <w:proofErr w:type="spellStart"/>
-      <w:r>
-        <w:t>resmi</w:t>
-      </w:r>
-      <w:proofErr w:type="spellEnd"/>
-      <w:r>
-        <w:t>.</w:t>
-      </w:r>
-    </w:p>
-    <w:p>
-      <w:pPr>
-        <w:spacing w:after="0" w:line="240" w:lineRule="auto"/>
-        <w:jc w:val="both"/>
-        <w:rPr>
-          <w:rFonts w:ascii="Times New Roman" w:hAnsi="Times New Roman" w:cs="Times New Roman"/>
-          <w:sz w:val="24"/>
-          <w:szCs w:val="24"/>
-          <w:lang w:val="fi-FI"/>
-        </w:rPr>
-      </w:pPr>
-      <w:r>
-        <w:rPr>
-          <w:rFonts w:ascii="Times New Roman" w:hAnsi="Times New Roman" w:cs="Times New Roman"/>
-          <w:sz w:val="24"/>
-          <w:szCs w:val="24"/>
-          <w:lang w:val="fi-FI"/>
-        </w:rPr>
-        <w:t xml:space="preserve">Penelitian ini mengusulkan </w:t>
-      </w:r>
-      <w:r>
-        <w:rPr>
-          <w:rFonts w:ascii="Times New Roman" w:hAnsi="Times New Roman" w:cs="Times New Roman"/>
-          <w:b/>
-          <w:iCs/>
-          <w:sz w:val="24"/>
-          <w:szCs w:val="24"/>
-          <w:lang w:val="fi-FI"/>
-        </w:rPr>
-        <w:t>SecureOffice-AI</w:t>
-      </w:r>
-      <w:r>
-        <w:rPr>
-          <w:rFonts w:ascii="Times New Roman" w:hAnsi="Times New Roman" w:cs="Times New Roman"/>
-          <w:sz w:val="24"/>
-          <w:szCs w:val="24"/>
-          <w:lang w:val="fi-FI"/>
-        </w:rPr>
-        <w:t xml:space="preserve">, sebuah platform persuratan digital berbasis web berarsitektur </w:t>
+        </w:rPr>
+        <w:t>Hybrid Cryptography</w:t>
+      </w:r>
+      <w:r>
+        <w:rPr>
+          <w:rFonts w:ascii="Times New Roman" w:hAnsi="Times New Roman" w:cs="Times New Roman"/>
+          <w:sz w:val="24"/>
+          <w:szCs w:val="24"/>
+        </w:rPr>
+        <w:t xml:space="preserve">, AES-256-GCM, </w:t>
       </w:r>
       <w:r>
         <w:rPr>
@@ -4999,752 +5115,24 @@
           <w:iCs/>
           <w:sz w:val="24"/>
           <w:szCs w:val="24"/>
-          <w:lang w:val="fi-FI"/>
-        </w:rPr>
-        <w:t>Zero-Trust</w:t>
-      </w:r>
-      <w:r>
-        <w:rPr>
-          <w:rFonts w:ascii="Times New Roman" w:hAnsi="Times New Roman" w:cs="Times New Roman"/>
-          <w:sz w:val="24"/>
-          <w:szCs w:val="24"/>
-          <w:lang w:val="fi-FI"/>
-        </w:rPr>
-        <w:t xml:space="preserve"> yang menerapkan </w:t>
-      </w:r>
-      <w:r>
-        <w:rPr>
-          <w:rFonts w:ascii="Times New Roman" w:hAnsi="Times New Roman" w:cs="Times New Roman"/>
+        </w:rPr>
+        <w:t>Multi-Agentic AI</w:t>
+      </w:r>
+      <w:r>
+        <w:t xml:space="preserve">, </w:t>
+      </w:r>
+      <w:proofErr w:type="spellStart"/>
+      <w:r>
+        <w:rPr>
           <w:i/>
-          <w:iCs/>
-          <w:sz w:val="24"/>
-          <w:szCs w:val="24"/>
-          <w:lang w:val="fi-FI"/>
-        </w:rPr>
-        <w:t>Object-Level Encryption</w:t>
-      </w:r>
-      <w:r>
-        <w:rPr>
-          <w:rFonts w:ascii="Times New Roman" w:hAnsi="Times New Roman" w:cs="Times New Roman"/>
-          <w:sz w:val="24"/>
-          <w:szCs w:val="24"/>
-          <w:lang w:val="fi-FI"/>
-        </w:rPr>
-        <w:t xml:space="preserve"> menggunakan </w:t>
-      </w:r>
-      <w:r>
-        <w:rPr>
-          <w:rFonts w:ascii="Times New Roman" w:hAnsi="Times New Roman" w:cs="Times New Roman"/>
+        </w:rPr>
+        <w:t>SecSent</w:t>
+      </w:r>
+      <w:proofErr w:type="spellEnd"/>
+      <w:r>
+        <w:rPr>
           <w:i/>
-          <w:iCs/>
-          <w:sz w:val="24"/>
-          <w:szCs w:val="24"/>
-          <w:lang w:val="fi-FI"/>
-        </w:rPr>
-        <w:t>Hybrid Cryptography</w:t>
-      </w:r>
-      <w:r>
-        <w:rPr>
-          <w:rFonts w:ascii="Times New Roman" w:hAnsi="Times New Roman" w:cs="Times New Roman"/>
-          <w:sz w:val="24"/>
-          <w:szCs w:val="24"/>
-          <w:lang w:val="fi-FI"/>
-        </w:rPr>
-        <w:t xml:space="preserve">. Sistem mengombinasikan enkripsi simetris </w:t>
-      </w:r>
-      <w:r>
-        <w:rPr>
-          <w:rFonts w:ascii="Times New Roman" w:hAnsi="Times New Roman" w:cs="Times New Roman"/>
-          <w:b/>
-          <w:iCs/>
-          <w:sz w:val="24"/>
-          <w:szCs w:val="24"/>
-          <w:lang w:val="fi-FI"/>
-        </w:rPr>
-        <w:t>AES-256-GCM</w:t>
-      </w:r>
-      <w:r>
-        <w:rPr>
-          <w:rFonts w:ascii="Times New Roman" w:hAnsi="Times New Roman" w:cs="Times New Roman"/>
-          <w:sz w:val="24"/>
-          <w:szCs w:val="24"/>
-          <w:lang w:val="fi-FI"/>
-        </w:rPr>
-        <w:t xml:space="preserve"> untuk </w:t>
-      </w:r>
-      <w:r>
-        <w:rPr>
-          <w:rFonts w:ascii="Times New Roman" w:hAnsi="Times New Roman" w:cs="Times New Roman"/>
-          <w:i/>
-          <w:iCs/>
-          <w:sz w:val="24"/>
-          <w:szCs w:val="24"/>
-          <w:lang w:val="fi-FI"/>
-        </w:rPr>
-        <w:t>payload</w:t>
-      </w:r>
-      <w:r>
-        <w:rPr>
-          <w:rFonts w:ascii="Times New Roman" w:hAnsi="Times New Roman" w:cs="Times New Roman"/>
-          <w:sz w:val="24"/>
-          <w:szCs w:val="24"/>
-          <w:lang w:val="fi-FI"/>
-        </w:rPr>
-        <w:t xml:space="preserve"> dokumen, pembungkusan kunci (</w:t>
-      </w:r>
-      <w:r>
-        <w:rPr>
-          <w:rFonts w:ascii="Times New Roman" w:hAnsi="Times New Roman" w:cs="Times New Roman"/>
-          <w:i/>
-          <w:iCs/>
-          <w:sz w:val="24"/>
-          <w:szCs w:val="24"/>
-          <w:lang w:val="fi-FI"/>
-        </w:rPr>
-        <w:t>key wrapping</w:t>
-      </w:r>
-      <w:r>
-        <w:rPr>
-          <w:rFonts w:ascii="Times New Roman" w:hAnsi="Times New Roman" w:cs="Times New Roman"/>
-          <w:sz w:val="24"/>
-          <w:szCs w:val="24"/>
-          <w:lang w:val="fi-FI"/>
-        </w:rPr>
-        <w:t xml:space="preserve">) kurva eliptik </w:t>
-      </w:r>
-      <w:r>
-        <w:rPr>
-          <w:rFonts w:ascii="Times New Roman" w:hAnsi="Times New Roman" w:cs="Times New Roman"/>
-          <w:b/>
-          <w:iCs/>
-          <w:sz w:val="24"/>
-          <w:szCs w:val="24"/>
-          <w:lang w:val="fi-FI"/>
-        </w:rPr>
-        <w:t>X25519</w:t>
-      </w:r>
-      <w:r>
-        <w:rPr>
-          <w:rFonts w:ascii="Times New Roman" w:hAnsi="Times New Roman" w:cs="Times New Roman"/>
-          <w:sz w:val="24"/>
-          <w:szCs w:val="24"/>
-          <w:lang w:val="fi-FI"/>
-        </w:rPr>
-        <w:t xml:space="preserve"> untuk distribusi kunci aman, dan tanda tangan digital </w:t>
-      </w:r>
-      <w:r>
-        <w:rPr>
-          <w:rFonts w:ascii="Times New Roman" w:hAnsi="Times New Roman" w:cs="Times New Roman"/>
-          <w:b/>
-          <w:iCs/>
-          <w:sz w:val="24"/>
-          <w:szCs w:val="24"/>
-          <w:lang w:val="fi-FI"/>
-        </w:rPr>
-        <w:t>Ed25519</w:t>
-      </w:r>
-      <w:r>
-        <w:rPr>
-          <w:rFonts w:ascii="Times New Roman" w:hAnsi="Times New Roman" w:cs="Times New Roman"/>
-          <w:sz w:val="24"/>
-          <w:szCs w:val="24"/>
-          <w:lang w:val="fi-FI"/>
-        </w:rPr>
-        <w:t xml:space="preserve"> untuk keabsahan hukum (</w:t>
-      </w:r>
-      <w:r>
-        <w:rPr>
-          <w:rFonts w:ascii="Times New Roman" w:hAnsi="Times New Roman" w:cs="Times New Roman"/>
-          <w:i/>
-          <w:iCs/>
-          <w:sz w:val="24"/>
-          <w:szCs w:val="24"/>
-          <w:lang w:val="fi-FI"/>
-        </w:rPr>
-        <w:t>non-repudiation</w:t>
-      </w:r>
-      <w:r>
-        <w:rPr>
-          <w:rFonts w:ascii="Times New Roman" w:hAnsi="Times New Roman" w:cs="Times New Roman"/>
-          <w:sz w:val="24"/>
-          <w:szCs w:val="24"/>
-          <w:lang w:val="fi-FI"/>
-        </w:rPr>
-        <w:t xml:space="preserve">). Selain itu, sistem diperkuat dengan </w:t>
-      </w:r>
-      <w:r>
-        <w:rPr>
-          <w:rFonts w:ascii="Times New Roman" w:hAnsi="Times New Roman" w:cs="Times New Roman"/>
-          <w:b/>
-          <w:iCs/>
-          <w:sz w:val="24"/>
-          <w:szCs w:val="24"/>
-          <w:lang w:val="fi-FI"/>
-        </w:rPr>
-        <w:t>Multi-Agentic AI Subsystem</w:t>
-      </w:r>
-      <w:r>
-        <w:rPr>
-          <w:rFonts w:ascii="Times New Roman" w:hAnsi="Times New Roman" w:cs="Times New Roman"/>
-          <w:sz w:val="24"/>
-          <w:szCs w:val="24"/>
-          <w:lang w:val="fi-FI"/>
-        </w:rPr>
-        <w:t xml:space="preserve"> berbasis </w:t>
-      </w:r>
-      <w:r>
-        <w:rPr>
-          <w:i/>
-        </w:rPr>
-        <w:t>human-in-the-loop</w:t>
-      </w:r>
-      <w:r>
-        <w:t xml:space="preserve"> </w:t>
-      </w:r>
-      <w:proofErr w:type="spellStart"/>
-      <w:r>
-        <w:t>untuk</w:t>
-      </w:r>
-      <w:proofErr w:type="spellEnd"/>
-      <w:r>
-        <w:t xml:space="preserve"> </w:t>
-      </w:r>
-      <w:proofErr w:type="spellStart"/>
-      <w:r>
-        <w:t>analisis</w:t>
-      </w:r>
-      <w:proofErr w:type="spellEnd"/>
-      <w:r>
-        <w:t xml:space="preserve"> </w:t>
-      </w:r>
-      <w:proofErr w:type="spellStart"/>
-      <w:r>
-        <w:t>risiko</w:t>
-      </w:r>
-      <w:proofErr w:type="spellEnd"/>
-      <w:r>
-        <w:t xml:space="preserve"> </w:t>
-      </w:r>
-      <w:proofErr w:type="spellStart"/>
-      <w:r>
-        <w:t>dokumen</w:t>
-      </w:r>
-      <w:proofErr w:type="spellEnd"/>
-      <w:r>
-        <w:t xml:space="preserve">, </w:t>
-      </w:r>
-      <w:proofErr w:type="spellStart"/>
-      <w:r>
-        <w:t>klasifikasi</w:t>
-      </w:r>
-      <w:proofErr w:type="spellEnd"/>
-      <w:r>
-        <w:t xml:space="preserve"> </w:t>
-      </w:r>
-      <w:proofErr w:type="spellStart"/>
-      <w:r>
-        <w:t>surat</w:t>
-      </w:r>
-      <w:proofErr w:type="spellEnd"/>
-      <w:r>
-        <w:t xml:space="preserve"> </w:t>
-      </w:r>
-      <w:proofErr w:type="spellStart"/>
-      <w:r>
-        <w:t>otomatis</w:t>
-      </w:r>
-      <w:proofErr w:type="spellEnd"/>
-      <w:r>
-        <w:t xml:space="preserve">, dan </w:t>
-      </w:r>
-      <w:proofErr w:type="spellStart"/>
-      <w:r>
-        <w:t>redaksi</w:t>
-      </w:r>
-      <w:proofErr w:type="spellEnd"/>
-      <w:r>
-        <w:t xml:space="preserve"> </w:t>
-      </w:r>
-      <w:r>
-        <w:rPr>
-          <w:i/>
-        </w:rPr>
-        <w:t>PII (Personally Identifiable Information)</w:t>
-      </w:r>
-      <w:r>
-        <w:t xml:space="preserve">. </w:t>
-      </w:r>
-      <w:proofErr w:type="spellStart"/>
-      <w:r>
-        <w:t>Pengujian</w:t>
-      </w:r>
-      <w:proofErr w:type="spellEnd"/>
-      <w:r>
-        <w:t xml:space="preserve"> </w:t>
-      </w:r>
-      <w:proofErr w:type="spellStart"/>
-      <w:r>
-        <w:t>dilakukan</w:t>
-      </w:r>
-      <w:proofErr w:type="spellEnd"/>
-      <w:r>
-        <w:t xml:space="preserve"> </w:t>
-      </w:r>
-      <w:proofErr w:type="spellStart"/>
-      <w:r>
-        <w:t>mengacu</w:t>
-      </w:r>
-      <w:proofErr w:type="spellEnd"/>
-      <w:r>
-        <w:t xml:space="preserve"> pada </w:t>
-      </w:r>
-      <w:proofErr w:type="spellStart"/>
-      <w:r>
-        <w:t>standar</w:t>
-      </w:r>
-      <w:proofErr w:type="spellEnd"/>
-      <w:r>
-        <w:t xml:space="preserve"> </w:t>
-      </w:r>
-      <w:r>
-        <w:rPr>
-          <w:b/>
-        </w:rPr>
-        <w:t>ISO/IEC 25010:2011</w:t>
-      </w:r>
-      <w:r>
-        <w:t xml:space="preserve">, </w:t>
-      </w:r>
-      <w:r>
-        <w:rPr>
-          <w:b/>
-        </w:rPr>
-        <w:t>NIST SP 800-115</w:t>
-      </w:r>
-      <w:r>
-        <w:t xml:space="preserve">, dan </w:t>
-      </w:r>
-      <w:r>
-        <w:rPr>
-          <w:b/>
-        </w:rPr>
-        <w:t>FIPS 140-3</w:t>
-      </w:r>
-      <w:r>
-        <w:t xml:space="preserve">. Hasil </w:t>
-      </w:r>
-      <w:proofErr w:type="spellStart"/>
-      <w:r>
-        <w:t>evaluasi</w:t>
-      </w:r>
-      <w:proofErr w:type="spellEnd"/>
-      <w:r>
-        <w:t xml:space="preserve"> </w:t>
-      </w:r>
-      <w:proofErr w:type="spellStart"/>
-      <w:r>
-        <w:t>empiris</w:t>
-      </w:r>
-      <w:proofErr w:type="spellEnd"/>
-      <w:r>
-        <w:t xml:space="preserve"> </w:t>
-      </w:r>
-      <w:proofErr w:type="spellStart"/>
-      <w:r>
-        <w:t>menunjukkan</w:t>
-      </w:r>
-      <w:proofErr w:type="spellEnd"/>
-      <w:r>
-        <w:t xml:space="preserve"> </w:t>
-      </w:r>
-      <w:proofErr w:type="spellStart"/>
-      <w:r>
-        <w:t>bahwa</w:t>
-      </w:r>
-      <w:proofErr w:type="spellEnd"/>
-      <w:r>
-        <w:t xml:space="preserve"> </w:t>
-      </w:r>
-      <w:proofErr w:type="spellStart"/>
-      <w:r>
-        <w:t>sistem</w:t>
-      </w:r>
-      <w:proofErr w:type="spellEnd"/>
-      <w:r>
-        <w:t xml:space="preserve"> </w:t>
-      </w:r>
-      <w:proofErr w:type="spellStart"/>
-      <w:r>
-        <w:t>berhasil</w:t>
-      </w:r>
-      <w:proofErr w:type="spellEnd"/>
-      <w:r>
-        <w:t xml:space="preserve"> </w:t>
-      </w:r>
-      <w:proofErr w:type="spellStart"/>
-      <w:r>
-        <w:t>menolak</w:t>
-      </w:r>
-      <w:proofErr w:type="spellEnd"/>
-      <w:r>
-        <w:t xml:space="preserve"> 100% </w:t>
-      </w:r>
-      <w:proofErr w:type="spellStart"/>
-      <w:r>
-        <w:t>manipulasi</w:t>
-      </w:r>
-      <w:proofErr w:type="spellEnd"/>
-      <w:r>
-        <w:t xml:space="preserve"> biner oleh Administrator Database (DBA) </w:t>
-      </w:r>
-      <w:proofErr w:type="spellStart"/>
-      <w:r>
-        <w:t>dengan</w:t>
-      </w:r>
-      <w:proofErr w:type="spellEnd"/>
-      <w:r>
-        <w:t xml:space="preserve"> </w:t>
-      </w:r>
-      <w:proofErr w:type="spellStart"/>
-      <w:r>
-        <w:t>latensi</w:t>
-      </w:r>
-      <w:proofErr w:type="spellEnd"/>
-      <w:r>
-        <w:t xml:space="preserve"> </w:t>
-      </w:r>
-      <w:proofErr w:type="spellStart"/>
-      <w:r>
-        <w:t>enkripsi</w:t>
-      </w:r>
-      <w:proofErr w:type="spellEnd"/>
-      <w:r>
-        <w:t xml:space="preserve"> sangat </w:t>
-      </w:r>
-      <w:proofErr w:type="spellStart"/>
-      <w:r>
-        <w:t>rendah</w:t>
-      </w:r>
-      <w:proofErr w:type="spellEnd"/>
-      <w:r>
-        <w:t xml:space="preserve">, </w:t>
-      </w:r>
-      <w:r>
-        <w:rPr>
-          <w:i/>
-        </w:rPr>
-        <w:t>throughput</w:t>
-      </w:r>
-      <w:r>
-        <w:t xml:space="preserve"> </w:t>
-      </w:r>
-      <w:proofErr w:type="spellStart"/>
-      <w:r>
-        <w:t>komputasi</w:t>
-      </w:r>
-      <w:proofErr w:type="spellEnd"/>
-      <w:r>
-        <w:t xml:space="preserve"> </w:t>
-      </w:r>
-      <w:proofErr w:type="spellStart"/>
-      <w:r>
-        <w:t>tinggi</w:t>
-      </w:r>
-      <w:proofErr w:type="spellEnd"/>
-      <w:r>
-        <w:t xml:space="preserve">, </w:t>
-      </w:r>
-      <w:proofErr w:type="spellStart"/>
-      <w:r>
-        <w:t>efisiensi</w:t>
-      </w:r>
-      <w:proofErr w:type="spellEnd"/>
-      <w:r>
-        <w:t xml:space="preserve"> </w:t>
-      </w:r>
-      <w:proofErr w:type="spellStart"/>
-      <w:r>
-        <w:t>memori</w:t>
-      </w:r>
-      <w:proofErr w:type="spellEnd"/>
-      <w:r>
-        <w:t xml:space="preserve"> </w:t>
-      </w:r>
-      <w:r>
-        <w:rPr>
-          <w:i/>
-        </w:rPr>
-        <w:t>heap</w:t>
-      </w:r>
-      <w:r>
-        <w:t xml:space="preserve">, </w:t>
-      </w:r>
-      <w:proofErr w:type="spellStart"/>
-      <w:r>
-        <w:t>serta</w:t>
-      </w:r>
-      <w:proofErr w:type="spellEnd"/>
-      <w:r>
-        <w:t xml:space="preserve"> </w:t>
-      </w:r>
-      <w:proofErr w:type="spellStart"/>
-      <w:r>
-        <w:t>tingkat</w:t>
-      </w:r>
-      <w:proofErr w:type="spellEnd"/>
-      <w:r>
-        <w:t xml:space="preserve"> </w:t>
-      </w:r>
-      <w:proofErr w:type="spellStart"/>
-      <w:r>
-        <w:t>kebergunaan</w:t>
-      </w:r>
-      <w:proofErr w:type="spellEnd"/>
-      <w:r>
-        <w:t xml:space="preserve"> </w:t>
-      </w:r>
-      <w:proofErr w:type="spellStart"/>
-      <w:r>
-        <w:t>antarmuka</w:t>
-      </w:r>
-      <w:proofErr w:type="spellEnd"/>
-      <w:r>
-        <w:t xml:space="preserve"> yang </w:t>
-      </w:r>
-      <w:proofErr w:type="spellStart"/>
-      <w:r>
-        <w:t>teruji</w:t>
-      </w:r>
-      <w:proofErr w:type="spellEnd"/>
-      <w:r>
-        <w:t xml:space="preserve"> via </w:t>
-      </w:r>
-      <w:r>
-        <w:rPr>
-          <w:i/>
-        </w:rPr>
-        <w:t>System Usability Scale</w:t>
-      </w:r>
-      <w:r>
-        <w:t xml:space="preserve"> (SUS).</w:t>
-      </w:r>
-    </w:p>
-    <w:p>
-      <w:pPr>
-        <w:spacing w:after="0" w:line="240" w:lineRule="auto"/>
-        <w:jc w:val="both"/>
-        <w:rPr>
-          <w:rFonts w:ascii="Times New Roman" w:hAnsi="Times New Roman" w:cs="Times New Roman"/>
-          <w:sz w:val="24"/>
-          <w:szCs w:val="24"/>
-          <w:lang w:val="fi-FI"/>
-        </w:rPr>
-      </w:pPr>
-    </w:p>
-    <w:p>
-      <w:pPr>
-        <w:spacing w:after="0" w:line="240" w:lineRule="auto"/>
-        <w:jc w:val="both"/>
-        <w:rPr>
-          <w:rFonts w:ascii="Times New Roman" w:hAnsi="Times New Roman" w:cs="Times New Roman"/>
-          <w:sz w:val="24"/>
-          <w:szCs w:val="24"/>
-          <w:lang w:val="en-US"/>
-        </w:rPr>
-      </w:pPr>
-      <w:r>
-        <w:rPr>
-          <w:rFonts w:ascii="Times New Roman" w:hAnsi="Times New Roman" w:cs="Times New Roman"/>
-          <w:sz w:val="24"/>
-          <w:szCs w:val="24"/>
-          <w:lang w:val="en-US"/>
-        </w:rPr>
-        <w:t xml:space="preserve">x + 31 </w:t>
-      </w:r>
-      <w:proofErr w:type="spellStart"/>
-      <w:r>
-        <w:rPr>
-          <w:rFonts w:ascii="Times New Roman" w:hAnsi="Times New Roman" w:cs="Times New Roman"/>
-          <w:sz w:val="24"/>
-          <w:szCs w:val="24"/>
-          <w:lang w:val="en-US"/>
-        </w:rPr>
-        <w:t>halaman</w:t>
-      </w:r>
-      <w:proofErr w:type="spellEnd"/>
-      <w:r>
-        <w:rPr>
-          <w:rFonts w:ascii="Times New Roman" w:hAnsi="Times New Roman" w:cs="Times New Roman"/>
-          <w:sz w:val="24"/>
-          <w:szCs w:val="24"/>
-          <w:lang w:val="en-US"/>
-        </w:rPr>
-        <w:t xml:space="preserve"> + </w:t>
-      </w:r>
-      <w:proofErr w:type="spellStart"/>
-      <w:r>
-        <w:rPr>
-          <w:rFonts w:ascii="Times New Roman" w:hAnsi="Times New Roman" w:cs="Times New Roman"/>
-          <w:sz w:val="24"/>
-          <w:szCs w:val="24"/>
-          <w:lang w:val="en-US"/>
-        </w:rPr>
-        <w:t>lampiran</w:t>
-      </w:r>
-      <w:proofErr w:type="spellEnd"/>
-      <w:r>
-        <w:rPr>
-          <w:rFonts w:ascii="Times New Roman" w:hAnsi="Times New Roman" w:cs="Times New Roman"/>
-          <w:sz w:val="24"/>
-          <w:szCs w:val="24"/>
-          <w:lang w:val="en-US"/>
-        </w:rPr>
-        <w:t xml:space="preserve"> (2026)</w:t>
-      </w:r>
-    </w:p>
-    <w:p>
-      <w:pPr>
-        <w:spacing w:after="0" w:line="240" w:lineRule="auto"/>
-        <w:jc w:val="both"/>
-        <w:rPr>
-          <w:rFonts w:ascii="Times New Roman" w:hAnsi="Times New Roman" w:cs="Times New Roman"/>
-          <w:sz w:val="24"/>
-          <w:szCs w:val="24"/>
-          <w:lang w:val="en-US"/>
-        </w:rPr>
-      </w:pPr>
-      <w:r>
-        <w:rPr>
-          <w:rFonts w:ascii="Times New Roman" w:hAnsi="Times New Roman" w:cs="Times New Roman"/>
-          <w:sz w:val="24"/>
-          <w:szCs w:val="24"/>
-          <w:lang w:val="en-US"/>
-        </w:rPr>
-        <w:t xml:space="preserve">Kata </w:t>
-      </w:r>
-      <w:proofErr w:type="spellStart"/>
-      <w:proofErr w:type="gramStart"/>
-      <w:r>
-        <w:rPr>
-          <w:rFonts w:ascii="Times New Roman" w:hAnsi="Times New Roman" w:cs="Times New Roman"/>
-          <w:sz w:val="24"/>
-          <w:szCs w:val="24"/>
-          <w:lang w:val="en-US"/>
-        </w:rPr>
-        <w:t>kunci</w:t>
-      </w:r>
-      <w:proofErr w:type="spellEnd"/>
-      <w:r>
-        <w:rPr>
-          <w:rFonts w:ascii="Times New Roman" w:hAnsi="Times New Roman" w:cs="Times New Roman"/>
-          <w:sz w:val="24"/>
-          <w:szCs w:val="24"/>
-          <w:lang w:val="en-US"/>
-        </w:rPr>
-        <w:t xml:space="preserve"> :</w:t>
-      </w:r>
-      <w:proofErr w:type="gramEnd"/>
-      <w:r>
-        <w:rPr>
-          <w:rFonts w:ascii="Times New Roman" w:hAnsi="Times New Roman" w:cs="Times New Roman"/>
-          <w:sz w:val="24"/>
-          <w:szCs w:val="24"/>
-          <w:lang w:val="en-US"/>
-        </w:rPr>
-        <w:t xml:space="preserve"> </w:t>
-      </w:r>
-      <w:proofErr w:type="spellStart"/>
-      <w:r>
-        <w:rPr>
-          <w:rFonts w:ascii="Times New Roman" w:hAnsi="Times New Roman" w:cs="Times New Roman"/>
-          <w:i/>
-          <w:iCs/>
-          <w:sz w:val="24"/>
-          <w:szCs w:val="24"/>
-        </w:rPr>
-        <w:t>Persuratan</w:t>
-      </w:r>
-      <w:proofErr w:type="spellEnd"/>
-      <w:r>
-        <w:rPr>
-          <w:rFonts w:ascii="Times New Roman" w:hAnsi="Times New Roman" w:cs="Times New Roman"/>
-          <w:i/>
-          <w:iCs/>
-          <w:sz w:val="24"/>
-          <w:szCs w:val="24"/>
-        </w:rPr>
-        <w:t xml:space="preserve"> Digital</w:t>
-      </w:r>
-      <w:r>
-        <w:rPr>
-          <w:rFonts w:ascii="Times New Roman" w:hAnsi="Times New Roman" w:cs="Times New Roman"/>
-          <w:sz w:val="24"/>
-          <w:szCs w:val="24"/>
-        </w:rPr>
-        <w:t xml:space="preserve">, </w:t>
-      </w:r>
-      <w:r>
-        <w:rPr>
-          <w:rFonts w:ascii="Times New Roman" w:hAnsi="Times New Roman" w:cs="Times New Roman"/>
-          <w:i/>
-          <w:iCs/>
-          <w:sz w:val="24"/>
-          <w:szCs w:val="24"/>
-        </w:rPr>
-        <w:t>Zero-Trust Architecture</w:t>
-      </w:r>
-      <w:r>
-        <w:rPr>
-          <w:rFonts w:ascii="Times New Roman" w:hAnsi="Times New Roman" w:cs="Times New Roman"/>
-          <w:sz w:val="24"/>
-          <w:szCs w:val="24"/>
-        </w:rPr>
-        <w:t xml:space="preserve">, </w:t>
-      </w:r>
-      <w:r>
-        <w:rPr>
-          <w:rFonts w:ascii="Times New Roman" w:hAnsi="Times New Roman" w:cs="Times New Roman"/>
-          <w:i/>
-          <w:iCs/>
-          <w:sz w:val="24"/>
-          <w:szCs w:val="24"/>
-        </w:rPr>
-        <w:t>Hybrid Cryptography</w:t>
-      </w:r>
-      <w:r>
-        <w:rPr>
-          <w:rFonts w:ascii="Times New Roman" w:hAnsi="Times New Roman" w:cs="Times New Roman"/>
-          <w:sz w:val="24"/>
-          <w:szCs w:val="24"/>
-        </w:rPr>
-        <w:t xml:space="preserve">, AES-256-GCM, </w:t>
-      </w:r>
-      <w:r>
-        <w:rPr>
-          <w:rFonts w:ascii="Times New Roman" w:hAnsi="Times New Roman" w:cs="Times New Roman"/>
-          <w:i/>
-          <w:iCs/>
-          <w:sz w:val="24"/>
-          <w:szCs w:val="24"/>
-        </w:rPr>
-        <w:t>Multi-Agentic AI</w:t>
-      </w:r>
-      <w:r>
-        <w:t xml:space="preserve">, </w:t>
-      </w:r>
-      <w:proofErr w:type="spellStart"/>
-      <w:r>
-        <w:rPr>
-          <w:i/>
-        </w:rPr>
-        <w:t>SecureOffice</w:t>
-      </w:r>
-      <w:proofErr w:type="spellEnd"/>
-      <w:r>
-        <w:rPr>
-          <w:i/>
-        </w:rPr>
-        <w:t>-AI</w:t>
+        </w:rPr>
       </w:r>
     </w:p>
     <w:p>
@@ -8909,7 +8297,7 @@
           <w:iCs/>
           <w:lang w:val="fi-FI"/>
         </w:rPr>
-        <w:t>SecureOffice-AI</w:t>
+        <w:t>SecSent</w:t>
       </w:r>
       <w:r>
         <w:rPr>
@@ -9079,7 +8467,7 @@
         <w:rPr>
           <w:lang w:val="fi-FI"/>
         </w:rPr>
-        <w:t xml:space="preserve">Untuk meningkatkan efisiensi dan membantu administrasi persuratan, SecureOffice-AI mengintegrasikan </w:t>
+        <w:t xml:space="preserve">Untuk meningkatkan efisiensi dan membantu administrasi persuratan, SecSent mengintegrasikan </w:t>
       </w:r>
       <w:r>
         <w:rPr>
@@ -10235,7 +9623,7 @@
           <w:szCs w:val="24"/>
           <w:lang w:val="fi-FI"/>
         </w:rPr>
-        <w:t xml:space="preserve">Menghasilkan platform persuratan digital SecureOffice-AI berarsitektur mikroservis 4-tier dengan proteksi </w:t>
+        <w:t xml:space="preserve">Menghasilkan platform persuratan digital SecSent berarsitektur mikroservis 4-tier dengan proteksi </w:t>
       </w:r>
       <w:r>
         <w:rPr>
@@ -15042,7 +14430,7 @@
           <w:szCs w:val="24"/>
           <w:lang w:val="sv-SE"/>
         </w:rPr>
-        <w:t>Tabel 2.3 merupakan kerangka konseptual dari penelitian yang dilakukan oleh penulis. Kerangka konseptual terdiri dari latar belakang masalah TNDE, rumusan solusi Zero-Trust &amp; Hybrid Cryptography, proses pengembangan mikroservis SecureOffice-AI, dan evaluasi keamanan empiris.</w:t>
+        <w:t>Tabel 2.3 merupakan kerangka konseptual dari penelitian yang dilakukan oleh penulis. Kerangka konseptual terdiri dari latar belakang masalah TNDE, rumusan solusi Zero-Trust &amp; Hybrid Cryptography, proses pengembangan mikroservis SecSent, dan evaluasi keamanan empiris.</w:t>
       </w:r>
     </w:p>
     <w:p>
@@ -15973,7 +15361,7 @@
           <w:szCs w:val="24"/>
           <w:lang w:val="it-IT"/>
         </w:rPr>
-        <w:t>Objek penelitian ini adalah rancang bangun Sistem Informasi Persuratan Digital Zero-Trust (</w:t>
+        <w:t>Objek penelitian ini adalah rancang bangun Sistem Persuratan Digital Berarsitektur Zero-Trust (</w:t>
       </w:r>
       <w:r>
         <w:rPr>
@@ -15984,7 +15372,7 @@
           <w:szCs w:val="24"/>
           <w:lang w:val="it-IT"/>
         </w:rPr>
-        <w:t>SecureOffice-AI</w:t>
+        <w:t>SecSent</w:t>
       </w:r>
       <w:r>
         <w:rPr>

</xml_diff>

<commit_message>
fix(upload): separate lightweight dbPayload to prevent Netlify HTTP 413 payload limit when sending PDF files
</commit_message>
<xml_diff>
--- a/Proposal_Satria Alba Pramasha.docx
+++ b/Proposal_Satria Alba Pramasha.docx
@@ -15927,6 +15927,634 @@
     </w:tbl>
     <w:p>
       <w:pPr>
+        <w:spacing w:before="240" w:after="120"/>
+      </w:pPr>
+      <w:r>
+        <w:rPr>
+          <w:rFonts w:ascii="Times New Roman" w:hAnsi="Times New Roman"/>
+          <w:b/>
+          <w:sz w:val="24"/>
+        </w:rPr>
+        <w:t>Tabel 2.6 Matriks Keamanan STRIDE dan Mitigasi Keamanan SecSent</w:t>
+      </w:r>
+    </w:p>
+    <w:tbl>
+      <w:tblPr>
+        <w:tblStyle w:val="TableGrid0"/>
+        <w:tblW w:type="auto" w:w="0"/>
+        <w:tblLook w:firstColumn="1" w:firstRow="1" w:lastColumn="0" w:lastRow="0" w:noHBand="0" w:noVBand="1" w:val="04A0"/>
+      </w:tblPr>
+      <w:tblGrid>
+        <w:gridCol w:w="576"/>
+        <w:gridCol w:w="1728"/>
+        <w:gridCol w:w="2592"/>
+        <w:gridCol w:w="3024"/>
+      </w:tblGrid>
+      <w:tr>
+        <w:tc>
+          <w:tcPr>
+            <w:tcW w:type="dxa" w:w="576"/>
+          </w:tcPr>
+          <w:p>
+            <w:pPr>
+              <w:spacing w:before="40" w:after="40"/>
+              <w:jc w:val="center"/>
+            </w:pPr>
+            <w:r/>
+            <w:r>
+              <w:rPr>
+                <w:rFonts w:ascii="Times New Roman" w:hAnsi="Times New Roman"/>
+                <w:b/>
+                <w:i w:val="0"/>
+                <w:sz w:val="22"/>
+              </w:rPr>
+              <w:t>No</w:t>
+            </w:r>
+          </w:p>
+        </w:tc>
+        <w:tc>
+          <w:tcPr>
+            <w:tcW w:type="dxa" w:w="1728"/>
+          </w:tcPr>
+          <w:p>
+            <w:pPr>
+              <w:spacing w:before="40" w:after="40"/>
+              <w:jc w:val="center"/>
+            </w:pPr>
+            <w:r/>
+            <w:r>
+              <w:rPr>
+                <w:rFonts w:ascii="Times New Roman" w:hAnsi="Times New Roman"/>
+                <w:b/>
+                <w:i w:val="0"/>
+                <w:sz w:val="22"/>
+              </w:rPr>
+              <w:t>Kategori Ancaman (STRIDE)</w:t>
+            </w:r>
+          </w:p>
+        </w:tc>
+        <w:tc>
+          <w:tcPr>
+            <w:tcW w:type="dxa" w:w="2592"/>
+          </w:tcPr>
+          <w:p>
+            <w:pPr>
+              <w:spacing w:before="40" w:after="40"/>
+              <w:jc w:val="center"/>
+            </w:pPr>
+            <w:r/>
+            <w:r>
+              <w:rPr>
+                <w:rFonts w:ascii="Times New Roman" w:hAnsi="Times New Roman"/>
+                <w:b/>
+                <w:i w:val="0"/>
+                <w:sz w:val="22"/>
+              </w:rPr>
+              <w:t>Skenario Ancaman pada Persuratan</w:t>
+            </w:r>
+          </w:p>
+        </w:tc>
+        <w:tc>
+          <w:tcPr>
+            <w:tcW w:type="dxa" w:w="3024"/>
+          </w:tcPr>
+          <w:p>
+            <w:pPr>
+              <w:spacing w:before="40" w:after="40"/>
+              <w:jc w:val="center"/>
+            </w:pPr>
+            <w:r/>
+            <w:r>
+              <w:rPr>
+                <w:rFonts w:ascii="Times New Roman" w:hAnsi="Times New Roman"/>
+                <w:b/>
+                <w:i w:val="0"/>
+                <w:sz w:val="22"/>
+              </w:rPr>
+              <w:t>Strategi Mitigasi pada SecSent</w:t>
+            </w:r>
+          </w:p>
+        </w:tc>
+      </w:tr>
+      <w:tr>
+        <w:tc>
+          <w:tcPr>
+            <w:tcW w:type="dxa" w:w="576"/>
+          </w:tcPr>
+          <w:p>
+            <w:pPr>
+              <w:spacing w:before="40" w:after="40"/>
+              <w:jc w:val="center"/>
+            </w:pPr>
+            <w:r/>
+            <w:r>
+              <w:rPr>
+                <w:rFonts w:ascii="Times New Roman" w:hAnsi="Times New Roman"/>
+                <w:b w:val="0"/>
+                <w:i w:val="0"/>
+                <w:sz w:val="22"/>
+              </w:rPr>
+              <w:t>1</w:t>
+            </w:r>
+          </w:p>
+        </w:tc>
+        <w:tc>
+          <w:tcPr>
+            <w:tcW w:type="dxa" w:w="1728"/>
+          </w:tcPr>
+          <w:p>
+            <w:pPr>
+              <w:spacing w:before="40" w:after="40"/>
+              <w:jc w:val="left"/>
+            </w:pPr>
+            <w:r/>
+            <w:r>
+              <w:rPr>
+                <w:rFonts w:ascii="Times New Roman" w:hAnsi="Times New Roman"/>
+                <w:b w:val="0"/>
+                <w:i w:val="0"/>
+                <w:sz w:val="22"/>
+              </w:rPr>
+              <w:t>Spoofing Identity</w:t>
+            </w:r>
+          </w:p>
+        </w:tc>
+        <w:tc>
+          <w:tcPr>
+            <w:tcW w:type="dxa" w:w="2592"/>
+          </w:tcPr>
+          <w:p>
+            <w:pPr>
+              <w:spacing w:before="40" w:after="40"/>
+              <w:jc w:val="left"/>
+            </w:pPr>
+            <w:r/>
+            <w:r>
+              <w:rPr>
+                <w:rFonts w:ascii="Times New Roman" w:hAnsi="Times New Roman"/>
+                <w:b w:val="0"/>
+                <w:i w:val="0"/>
+                <w:sz w:val="22"/>
+              </w:rPr>
+              <w:t>Penyerang memalsukan identitas pejabat pengirim untuk mengirim surat dinas palsu.</w:t>
+            </w:r>
+          </w:p>
+        </w:tc>
+        <w:tc>
+          <w:tcPr>
+            <w:tcW w:type="dxa" w:w="3024"/>
+          </w:tcPr>
+          <w:p>
+            <w:pPr>
+              <w:spacing w:before="40" w:after="40"/>
+              <w:jc w:val="left"/>
+            </w:pPr>
+            <w:r/>
+            <w:r>
+              <w:rPr>
+                <w:rFonts w:ascii="Times New Roman" w:hAnsi="Times New Roman"/>
+                <w:b w:val="0"/>
+                <w:i w:val="0"/>
+                <w:sz w:val="22"/>
+              </w:rPr>
+              <w:t>MFA TOTP 6-Digit (RFC 6238) + Tanda tangan digital Ed25519 menggunakan kunci privat unik pejabat di local browser vault.</w:t>
+            </w:r>
+          </w:p>
+        </w:tc>
+      </w:tr>
+      <w:tr>
+        <w:tc>
+          <w:tcPr>
+            <w:tcW w:type="dxa" w:w="576"/>
+          </w:tcPr>
+          <w:p>
+            <w:pPr>
+              <w:spacing w:before="40" w:after="40"/>
+              <w:jc w:val="center"/>
+            </w:pPr>
+            <w:r/>
+            <w:r>
+              <w:rPr>
+                <w:rFonts w:ascii="Times New Roman" w:hAnsi="Times New Roman"/>
+                <w:b w:val="0"/>
+                <w:i w:val="0"/>
+                <w:sz w:val="22"/>
+              </w:rPr>
+              <w:t>2</w:t>
+            </w:r>
+          </w:p>
+        </w:tc>
+        <w:tc>
+          <w:tcPr>
+            <w:tcW w:type="dxa" w:w="1728"/>
+          </w:tcPr>
+          <w:p>
+            <w:pPr>
+              <w:spacing w:before="40" w:after="40"/>
+              <w:jc w:val="left"/>
+            </w:pPr>
+            <w:r/>
+            <w:r>
+              <w:rPr>
+                <w:rFonts w:ascii="Times New Roman" w:hAnsi="Times New Roman"/>
+                <w:b w:val="0"/>
+                <w:i w:val="0"/>
+                <w:sz w:val="22"/>
+              </w:rPr>
+              <w:t>Tampering Data</w:t>
+            </w:r>
+          </w:p>
+        </w:tc>
+        <w:tc>
+          <w:tcPr>
+            <w:tcW w:type="dxa" w:w="2592"/>
+          </w:tcPr>
+          <w:p>
+            <w:pPr>
+              <w:spacing w:before="40" w:after="40"/>
+              <w:jc w:val="left"/>
+            </w:pPr>
+            <w:r/>
+            <w:r>
+              <w:rPr>
+                <w:rFonts w:ascii="Times New Roman" w:hAnsi="Times New Roman"/>
+                <w:b w:val="0"/>
+                <w:i w:val="0"/>
+                <w:sz w:val="22"/>
+              </w:rPr>
+              <w:t>Administrator Database (DBA) atau penyerang memodifikasi isi biner surat di penyimpanan database.</w:t>
+            </w:r>
+          </w:p>
+        </w:tc>
+        <w:tc>
+          <w:tcPr>
+            <w:tcW w:type="dxa" w:w="3024"/>
+          </w:tcPr>
+          <w:p>
+            <w:pPr>
+              <w:spacing w:before="40" w:after="40"/>
+              <w:jc w:val="left"/>
+            </w:pPr>
+            <w:r/>
+            <w:r>
+              <w:rPr>
+                <w:rFonts w:ascii="Times New Roman" w:hAnsi="Times New Roman"/>
+                <w:b w:val="0"/>
+                <w:i w:val="0"/>
+                <w:sz w:val="22"/>
+              </w:rPr>
+              <w:t>Object-Level Encryption menggunakan AES-256-GCM (Data Encryption Key / DEK) pada payload dokumen sebelum disimpan.</w:t>
+            </w:r>
+          </w:p>
+        </w:tc>
+      </w:tr>
+      <w:tr>
+        <w:tc>
+          <w:tcPr>
+            <w:tcW w:type="dxa" w:w="576"/>
+          </w:tcPr>
+          <w:p>
+            <w:pPr>
+              <w:spacing w:before="40" w:after="40"/>
+              <w:jc w:val="center"/>
+            </w:pPr>
+            <w:r/>
+            <w:r>
+              <w:rPr>
+                <w:rFonts w:ascii="Times New Roman" w:hAnsi="Times New Roman"/>
+                <w:b w:val="0"/>
+                <w:i w:val="0"/>
+                <w:sz w:val="22"/>
+              </w:rPr>
+              <w:t>3</w:t>
+            </w:r>
+          </w:p>
+        </w:tc>
+        <w:tc>
+          <w:tcPr>
+            <w:tcW w:type="dxa" w:w="1728"/>
+          </w:tcPr>
+          <w:p>
+            <w:pPr>
+              <w:spacing w:before="40" w:after="40"/>
+              <w:jc w:val="left"/>
+            </w:pPr>
+            <w:r/>
+            <w:r>
+              <w:rPr>
+                <w:rFonts w:ascii="Times New Roman" w:hAnsi="Times New Roman"/>
+                <w:b w:val="0"/>
+                <w:i w:val="0"/>
+                <w:sz w:val="22"/>
+              </w:rPr>
+              <w:t>Repudiation</w:t>
+            </w:r>
+          </w:p>
+        </w:tc>
+        <w:tc>
+          <w:tcPr>
+            <w:tcW w:type="dxa" w:w="2592"/>
+          </w:tcPr>
+          <w:p>
+            <w:pPr>
+              <w:spacing w:before="40" w:after="40"/>
+              <w:jc w:val="left"/>
+            </w:pPr>
+            <w:r/>
+            <w:r>
+              <w:rPr>
+                <w:rFonts w:ascii="Times New Roman" w:hAnsi="Times New Roman"/>
+                <w:b w:val="0"/>
+                <w:i w:val="0"/>
+                <w:sz w:val="22"/>
+              </w:rPr>
+              <w:t>Pejabat pengirim menyangkal telah mengirimkan atau menandatangani surat dinas resmi.</w:t>
+            </w:r>
+          </w:p>
+        </w:tc>
+        <w:tc>
+          <w:tcPr>
+            <w:tcW w:type="dxa" w:w="3024"/>
+          </w:tcPr>
+          <w:p>
+            <w:pPr>
+              <w:spacing w:before="40" w:after="40"/>
+              <w:jc w:val="left"/>
+            </w:pPr>
+            <w:r/>
+            <w:r>
+              <w:rPr>
+                <w:rFonts w:ascii="Times New Roman" w:hAnsi="Times New Roman"/>
+                <w:b w:val="0"/>
+                <w:i w:val="0"/>
+                <w:sz w:val="22"/>
+              </w:rPr>
+              <w:t>Skema tanda tangan digital asimetris Ed25519 terikat timestamp token yang tidak dapat disangkal secara hukum.</w:t>
+            </w:r>
+          </w:p>
+        </w:tc>
+      </w:tr>
+      <w:tr>
+        <w:tc>
+          <w:tcPr>
+            <w:tcW w:type="dxa" w:w="576"/>
+          </w:tcPr>
+          <w:p>
+            <w:pPr>
+              <w:spacing w:before="40" w:after="40"/>
+              <w:jc w:val="center"/>
+            </w:pPr>
+            <w:r/>
+            <w:r>
+              <w:rPr>
+                <w:rFonts w:ascii="Times New Roman" w:hAnsi="Times New Roman"/>
+                <w:b w:val="0"/>
+                <w:i w:val="0"/>
+                <w:sz w:val="22"/>
+              </w:rPr>
+              <w:t>4</w:t>
+            </w:r>
+          </w:p>
+        </w:tc>
+        <w:tc>
+          <w:tcPr>
+            <w:tcW w:type="dxa" w:w="1728"/>
+          </w:tcPr>
+          <w:p>
+            <w:pPr>
+              <w:spacing w:before="40" w:after="40"/>
+              <w:jc w:val="left"/>
+            </w:pPr>
+            <w:r/>
+            <w:r>
+              <w:rPr>
+                <w:rFonts w:ascii="Times New Roman" w:hAnsi="Times New Roman"/>
+                <w:b w:val="0"/>
+                <w:i w:val="0"/>
+                <w:sz w:val="22"/>
+              </w:rPr>
+              <w:t>Information Disclosure</w:t>
+            </w:r>
+          </w:p>
+        </w:tc>
+        <w:tc>
+          <w:tcPr>
+            <w:tcW w:type="dxa" w:w="2592"/>
+          </w:tcPr>
+          <w:p>
+            <w:pPr>
+              <w:spacing w:before="40" w:after="40"/>
+              <w:jc w:val="left"/>
+            </w:pPr>
+            <w:r/>
+            <w:r>
+              <w:rPr>
+                <w:rFonts w:ascii="Times New Roman" w:hAnsi="Times New Roman"/>
+                <w:b w:val="0"/>
+                <w:i w:val="0"/>
+                <w:sz w:val="22"/>
+              </w:rPr>
+              <w:t>Pihak tidak berwenang mengintip berkas surat berklasifikasi rahasia pada penyimpanan storage.</w:t>
+            </w:r>
+          </w:p>
+        </w:tc>
+        <w:tc>
+          <w:tcPr>
+            <w:tcW w:type="dxa" w:w="3024"/>
+          </w:tcPr>
+          <w:p>
+            <w:pPr>
+              <w:spacing w:before="40" w:after="40"/>
+              <w:jc w:val="left"/>
+            </w:pPr>
+            <w:r/>
+            <w:r>
+              <w:rPr>
+                <w:rFonts w:ascii="Times New Roman" w:hAnsi="Times New Roman"/>
+                <w:b w:val="0"/>
+                <w:i w:val="0"/>
+                <w:sz w:val="22"/>
+              </w:rPr>
+              <w:t>Envelope Encryption berbasis X25519 key exchange (DEK hanya dapat didekripsi dengan kunci privat penerima sah).</w:t>
+            </w:r>
+          </w:p>
+        </w:tc>
+      </w:tr>
+      <w:tr>
+        <w:tc>
+          <w:tcPr>
+            <w:tcW w:type="dxa" w:w="576"/>
+          </w:tcPr>
+          <w:p>
+            <w:pPr>
+              <w:spacing w:before="40" w:after="40"/>
+              <w:jc w:val="center"/>
+            </w:pPr>
+            <w:r/>
+            <w:r>
+              <w:rPr>
+                <w:rFonts w:ascii="Times New Roman" w:hAnsi="Times New Roman"/>
+                <w:b w:val="0"/>
+                <w:i w:val="0"/>
+                <w:sz w:val="22"/>
+              </w:rPr>
+              <w:t>5</w:t>
+            </w:r>
+          </w:p>
+        </w:tc>
+        <w:tc>
+          <w:tcPr>
+            <w:tcW w:type="dxa" w:w="1728"/>
+          </w:tcPr>
+          <w:p>
+            <w:pPr>
+              <w:spacing w:before="40" w:after="40"/>
+              <w:jc w:val="left"/>
+            </w:pPr>
+            <w:r/>
+            <w:r>
+              <w:rPr>
+                <w:rFonts w:ascii="Times New Roman" w:hAnsi="Times New Roman"/>
+                <w:b w:val="0"/>
+                <w:i w:val="0"/>
+                <w:sz w:val="22"/>
+              </w:rPr>
+              <w:t>Denial of Service</w:t>
+            </w:r>
+          </w:p>
+        </w:tc>
+        <w:tc>
+          <w:tcPr>
+            <w:tcW w:type="dxa" w:w="2592"/>
+          </w:tcPr>
+          <w:p>
+            <w:pPr>
+              <w:spacing w:before="40" w:after="40"/>
+              <w:jc w:val="left"/>
+            </w:pPr>
+            <w:r/>
+            <w:r>
+              <w:rPr>
+                <w:rFonts w:ascii="Times New Roman" w:hAnsi="Times New Roman"/>
+                <w:b w:val="0"/>
+                <w:i w:val="0"/>
+                <w:sz w:val="22"/>
+              </w:rPr>
+              <w:t>Serangan pembanjiran request API untuk menghentikan aliran persuratan dinas instansi.</w:t>
+            </w:r>
+          </w:p>
+        </w:tc>
+        <w:tc>
+          <w:tcPr>
+            <w:tcW w:type="dxa" w:w="3024"/>
+          </w:tcPr>
+          <w:p>
+            <w:pPr>
+              <w:spacing w:before="40" w:after="40"/>
+              <w:jc w:val="left"/>
+            </w:pPr>
+            <w:r/>
+            <w:r>
+              <w:rPr>
+                <w:rFonts w:ascii="Times New Roman" w:hAnsi="Times New Roman"/>
+                <w:b w:val="0"/>
+                <w:i w:val="0"/>
+                <w:sz w:val="22"/>
+              </w:rPr>
+              <w:t>Penerapan Rate Limiting di API Gateway Nginx dan caching kebijakan akses di Redis.</w:t>
+            </w:r>
+          </w:p>
+        </w:tc>
+      </w:tr>
+      <w:tr>
+        <w:tc>
+          <w:tcPr>
+            <w:tcW w:type="dxa" w:w="576"/>
+          </w:tcPr>
+          <w:p>
+            <w:pPr>
+              <w:spacing w:before="40" w:after="40"/>
+              <w:jc w:val="center"/>
+            </w:pPr>
+            <w:r/>
+            <w:r>
+              <w:rPr>
+                <w:rFonts w:ascii="Times New Roman" w:hAnsi="Times New Roman"/>
+                <w:b w:val="0"/>
+                <w:i w:val="0"/>
+                <w:sz w:val="22"/>
+              </w:rPr>
+              <w:t>6</w:t>
+            </w:r>
+          </w:p>
+        </w:tc>
+        <w:tc>
+          <w:tcPr>
+            <w:tcW w:type="dxa" w:w="1728"/>
+          </w:tcPr>
+          <w:p>
+            <w:pPr>
+              <w:spacing w:before="40" w:after="40"/>
+              <w:jc w:val="left"/>
+            </w:pPr>
+            <w:r/>
+            <w:r>
+              <w:rPr>
+                <w:rFonts w:ascii="Times New Roman" w:hAnsi="Times New Roman"/>
+                <w:b w:val="0"/>
+                <w:i w:val="0"/>
+                <w:sz w:val="22"/>
+              </w:rPr>
+              <w:t>Elevation of Privilege</w:t>
+            </w:r>
+          </w:p>
+        </w:tc>
+        <w:tc>
+          <w:tcPr>
+            <w:tcW w:type="dxa" w:w="2592"/>
+          </w:tcPr>
+          <w:p>
+            <w:pPr>
+              <w:spacing w:before="40" w:after="40"/>
+              <w:jc w:val="left"/>
+            </w:pPr>
+            <w:r/>
+            <w:r>
+              <w:rPr>
+                <w:rFonts w:ascii="Times New Roman" w:hAnsi="Times New Roman"/>
+                <w:b w:val="0"/>
+                <w:i w:val="0"/>
+                <w:sz w:val="22"/>
+              </w:rPr>
+              <w:t>Staf biasa mengakses surat dinas berkategori CONFIDENTIAL atau SECRET milik kepala unit.</w:t>
+            </w:r>
+          </w:p>
+        </w:tc>
+        <w:tc>
+          <w:tcPr>
+            <w:tcW w:type="dxa" w:w="3024"/>
+          </w:tcPr>
+          <w:p>
+            <w:pPr>
+              <w:spacing w:before="40" w:after="40"/>
+              <w:jc w:val="left"/>
+            </w:pPr>
+            <w:r/>
+            <w:r>
+              <w:rPr>
+                <w:rFonts w:ascii="Times New Roman" w:hAnsi="Times New Roman"/>
+                <w:b w:val="0"/>
+                <w:i w:val="0"/>
+                <w:sz w:val="22"/>
+              </w:rPr>
+              <w:t>Validasi hak otorisasi di sisi backend core menggunakan gabungan Role-Based Access Control (RBAC) dan Clearance Level.</w:t>
+            </w:r>
+          </w:p>
+        </w:tc>
+      </w:tr>
+    </w:tbl>
+    <w:p>
+      <w:pPr>
         <w:spacing w:after="0" w:line="276" w:lineRule="auto"/>
         <w:jc w:val="both"/>
         <w:rPr>
@@ -16484,7 +17112,7 @@
     <w:p>
       <w:pPr>
         <w:spacing w:after="0" w:line="276" w:lineRule="auto"/>
-        <w:jc w:val="both"/>
+        <w:jc w:val="center"/>
         <w:rPr>
           <w:rFonts w:ascii="Times New Roman" w:hAnsi="Times New Roman" w:cs="Times New Roman"/>
           <w:sz w:val="24"/>
@@ -16492,7 +17120,457 @@
           <w:lang w:val="id-ID"/>
         </w:rPr>
       </w:pPr>
+      <w:r/>
+      <w:r>
+        <w:drawing>
+          <wp:inline xmlns:a="http://schemas.openxmlformats.org/drawingml/2006/main" xmlns:pic="http://schemas.openxmlformats.org/drawingml/2006/picture">
+            <wp:extent cx="5029200" cy="2514600"/>
+            <wp:docPr id="2040411922" name="Picture 2040411922"/>
+            <wp:cNvGraphicFramePr>
+              <a:graphicFrameLocks noChangeAspect="1"/>
+            </wp:cNvGraphicFramePr>
+            <a:graphic>
+              <a:graphicData uri="http://schemas.openxmlformats.org/drawingml/2006/picture">
+                <pic:pic>
+                  <pic:nvPicPr>
+                    <pic:cNvPr id="0" name="conceptual_framework.png"/>
+                    <pic:cNvPicPr/>
+                  </pic:nvPicPr>
+                  <pic:blipFill>
+                    <a:blip r:embed="rId13"/>
+                    <a:stretch>
+                      <a:fillRect/>
+                    </a:stretch>
+                  </pic:blipFill>
+                  <pic:spPr>
+                    <a:xfrm>
+                      <a:off x="0" y="0"/>
+                      <a:ext cx="5029200" cy="2514600"/>
+                    </a:xfrm>
+                    <a:prstGeom prst="rect"/>
+                  </pic:spPr>
+                </pic:pic>
+              </a:graphicData>
+            </a:graphic>
+          </wp:inline>
+        </w:drawing>
+      </w:r>
     </w:p>
+    <w:p>
+      <w:pPr>
+        <w:spacing w:before="240" w:after="120"/>
+      </w:pPr>
+      <w:r>
+        <w:rPr>
+          <w:rFonts w:ascii="Times New Roman" w:hAnsi="Times New Roman"/>
+          <w:b/>
+          <w:sz w:val="24"/>
+        </w:rPr>
+        <w:t>Tabel 2.7 Matriks Otorisasi RBAC dan Clearance Level SecSent</w:t>
+      </w:r>
+    </w:p>
+    <w:tbl>
+      <w:tblPr>
+        <w:tblStyle w:val="TableGrid0"/>
+        <w:tblW w:type="auto" w:w="0"/>
+        <w:tblLook w:firstColumn="1" w:firstRow="1" w:lastColumn="0" w:lastRow="0" w:noHBand="0" w:noVBand="1" w:val="04A0"/>
+      </w:tblPr>
+      <w:tblGrid>
+        <w:gridCol w:w="1728"/>
+        <w:gridCol w:w="3600"/>
+        <w:gridCol w:w="2592"/>
+      </w:tblGrid>
+      <w:tr>
+        <w:tc>
+          <w:tcPr>
+            <w:tcW w:type="dxa" w:w="1728"/>
+          </w:tcPr>
+          <w:p>
+            <w:pPr>
+              <w:spacing w:before="40" w:after="40"/>
+              <w:jc w:val="center"/>
+            </w:pPr>
+            <w:r/>
+            <w:r>
+              <w:rPr>
+                <w:rFonts w:ascii="Times New Roman" w:hAnsi="Times New Roman"/>
+                <w:b/>
+                <w:i w:val="0"/>
+                <w:sz w:val="22"/>
+              </w:rPr>
+              <w:t>Peran Pengguna (Role)</w:t>
+            </w:r>
+          </w:p>
+        </w:tc>
+        <w:tc>
+          <w:tcPr>
+            <w:tcW w:type="dxa" w:w="3600"/>
+          </w:tcPr>
+          <w:p>
+            <w:pPr>
+              <w:spacing w:before="40" w:after="40"/>
+              <w:jc w:val="center"/>
+            </w:pPr>
+            <w:r/>
+            <w:r>
+              <w:rPr>
+                <w:rFonts w:ascii="Times New Roman" w:hAnsi="Times New Roman"/>
+                <w:b/>
+                <w:i w:val="0"/>
+                <w:sz w:val="22"/>
+              </w:rPr>
+              <w:t>Hak Akses Alur Persuratan</w:t>
+            </w:r>
+          </w:p>
+        </w:tc>
+        <w:tc>
+          <w:tcPr>
+            <w:tcW w:type="dxa" w:w="2592"/>
+          </w:tcPr>
+          <w:p>
+            <w:pPr>
+              <w:spacing w:before="40" w:after="40"/>
+              <w:jc w:val="center"/>
+            </w:pPr>
+            <w:r/>
+            <w:r>
+              <w:rPr>
+                <w:rFonts w:ascii="Times New Roman" w:hAnsi="Times New Roman"/>
+                <w:b/>
+                <w:i w:val="0"/>
+                <w:sz w:val="22"/>
+              </w:rPr>
+              <w:t>Clearance Level Dokumen</w:t>
+            </w:r>
+          </w:p>
+        </w:tc>
+      </w:tr>
+      <w:tr>
+        <w:tc>
+          <w:tcPr>
+            <w:tcW w:type="dxa" w:w="1728"/>
+          </w:tcPr>
+          <w:p>
+            <w:pPr>
+              <w:spacing w:before="40" w:after="40"/>
+              <w:jc w:val="center"/>
+            </w:pPr>
+            <w:r/>
+            <w:r>
+              <w:rPr>
+                <w:rFonts w:ascii="Times New Roman" w:hAnsi="Times New Roman"/>
+                <w:b w:val="0"/>
+                <w:i w:val="0"/>
+                <w:sz w:val="22"/>
+              </w:rPr>
+              <w:t>ADMIN</w:t>
+            </w:r>
+          </w:p>
+        </w:tc>
+        <w:tc>
+          <w:tcPr>
+            <w:tcW w:type="dxa" w:w="3600"/>
+          </w:tcPr>
+          <w:p>
+            <w:pPr>
+              <w:spacing w:before="40" w:after="40"/>
+              <w:jc w:val="left"/>
+            </w:pPr>
+            <w:r/>
+            <w:r>
+              <w:rPr>
+                <w:rFonts w:ascii="Times New Roman" w:hAnsi="Times New Roman"/>
+                <w:b w:val="0"/>
+                <w:i w:val="0"/>
+                <w:sz w:val="22"/>
+              </w:rPr>
+              <w:t>Manajemen Akun, Setup Unit Kerja, Audit System Log</w:t>
+            </w:r>
+          </w:p>
+        </w:tc>
+        <w:tc>
+          <w:tcPr>
+            <w:tcW w:type="dxa" w:w="2592"/>
+          </w:tcPr>
+          <w:p>
+            <w:pPr>
+              <w:spacing w:before="40" w:after="40"/>
+              <w:jc w:val="left"/>
+            </w:pPr>
+            <w:r/>
+            <w:r>
+              <w:rPr>
+                <w:rFonts w:ascii="Times New Roman" w:hAnsi="Times New Roman"/>
+                <w:b w:val="0"/>
+                <w:i w:val="0"/>
+                <w:sz w:val="22"/>
+              </w:rPr>
+              <w:t>UNCLASSIFIED saja (tidak diizinkan membaca isi dokumen rahasia)</w:t>
+            </w:r>
+          </w:p>
+        </w:tc>
+      </w:tr>
+      <w:tr>
+        <w:tc>
+          <w:tcPr>
+            <w:tcW w:type="dxa" w:w="1728"/>
+          </w:tcPr>
+          <w:p>
+            <w:pPr>
+              <w:spacing w:before="40" w:after="40"/>
+              <w:jc w:val="center"/>
+            </w:pPr>
+            <w:r/>
+            <w:r>
+              <w:rPr>
+                <w:rFonts w:ascii="Times New Roman" w:hAnsi="Times New Roman"/>
+                <w:b w:val="0"/>
+                <w:i w:val="0"/>
+                <w:sz w:val="22"/>
+              </w:rPr>
+              <w:t>HEAD_OF_UNIT</w:t>
+            </w:r>
+          </w:p>
+        </w:tc>
+        <w:tc>
+          <w:tcPr>
+            <w:tcW w:type="dxa" w:w="3600"/>
+          </w:tcPr>
+          <w:p>
+            <w:pPr>
+              <w:spacing w:before="40" w:after="40"/>
+              <w:jc w:val="left"/>
+            </w:pPr>
+            <w:r/>
+            <w:r>
+              <w:rPr>
+                <w:rFonts w:ascii="Times New Roman" w:hAnsi="Times New Roman"/>
+                <w:b w:val="0"/>
+                <w:i w:val="0"/>
+                <w:sz w:val="22"/>
+              </w:rPr>
+              <w:t>Membuat, Mengirim, Menandatangani (Ed25519), Disposisi, Membaca Arsip Unit</w:t>
+            </w:r>
+          </w:p>
+        </w:tc>
+        <w:tc>
+          <w:tcPr>
+            <w:tcW w:type="dxa" w:w="2592"/>
+          </w:tcPr>
+          <w:p>
+            <w:pPr>
+              <w:spacing w:before="40" w:after="40"/>
+              <w:jc w:val="left"/>
+            </w:pPr>
+            <w:r/>
+            <w:r>
+              <w:rPr>
+                <w:rFonts w:ascii="Times New Roman" w:hAnsi="Times New Roman"/>
+                <w:b w:val="0"/>
+                <w:i w:val="0"/>
+                <w:sz w:val="22"/>
+              </w:rPr>
+              <w:t>Semua Level (UNCLASSIFIED, RESTRICTED, CONFIDENTIAL, SECRET)</w:t>
+            </w:r>
+          </w:p>
+        </w:tc>
+      </w:tr>
+      <w:tr>
+        <w:tc>
+          <w:tcPr>
+            <w:tcW w:type="dxa" w:w="1728"/>
+          </w:tcPr>
+          <w:p>
+            <w:pPr>
+              <w:spacing w:before="40" w:after="40"/>
+              <w:jc w:val="center"/>
+            </w:pPr>
+            <w:r/>
+            <w:r>
+              <w:rPr>
+                <w:rFonts w:ascii="Times New Roman" w:hAnsi="Times New Roman"/>
+                <w:b w:val="0"/>
+                <w:i w:val="0"/>
+                <w:sz w:val="22"/>
+              </w:rPr>
+              <w:t>SECRETARY</w:t>
+            </w:r>
+          </w:p>
+        </w:tc>
+        <w:tc>
+          <w:tcPr>
+            <w:tcW w:type="dxa" w:w="3600"/>
+          </w:tcPr>
+          <w:p>
+            <w:pPr>
+              <w:spacing w:before="40" w:after="40"/>
+              <w:jc w:val="left"/>
+            </w:pPr>
+            <w:r/>
+            <w:r>
+              <w:rPr>
+                <w:rFonts w:ascii="Times New Roman" w:hAnsi="Times New Roman"/>
+                <w:b w:val="0"/>
+                <w:i w:val="0"/>
+                <w:sz w:val="22"/>
+              </w:rPr>
+              <w:t>Membuat Draft Surat, Registrasi Surat Masuk, Meneruskan Surat ke Pimpinan</w:t>
+            </w:r>
+          </w:p>
+        </w:tc>
+        <w:tc>
+          <w:tcPr>
+            <w:tcW w:type="dxa" w:w="2592"/>
+          </w:tcPr>
+          <w:p>
+            <w:pPr>
+              <w:spacing w:before="40" w:after="40"/>
+              <w:jc w:val="left"/>
+            </w:pPr>
+            <w:r/>
+            <w:r>
+              <w:rPr>
+                <w:rFonts w:ascii="Times New Roman" w:hAnsi="Times New Roman"/>
+                <w:b w:val="0"/>
+                <w:i w:val="0"/>
+                <w:sz w:val="22"/>
+              </w:rPr>
+              <w:t>Hingga CONFIDENTIAL</w:t>
+            </w:r>
+          </w:p>
+        </w:tc>
+      </w:tr>
+      <w:tr>
+        <w:tc>
+          <w:tcPr>
+            <w:tcW w:type="dxa" w:w="1728"/>
+          </w:tcPr>
+          <w:p>
+            <w:pPr>
+              <w:spacing w:before="40" w:after="40"/>
+              <w:jc w:val="center"/>
+            </w:pPr>
+            <w:r/>
+            <w:r>
+              <w:rPr>
+                <w:rFonts w:ascii="Times New Roman" w:hAnsi="Times New Roman"/>
+                <w:b w:val="0"/>
+                <w:i w:val="0"/>
+                <w:sz w:val="22"/>
+              </w:rPr>
+              <w:t>STAFF</w:t>
+            </w:r>
+          </w:p>
+        </w:tc>
+        <w:tc>
+          <w:tcPr>
+            <w:tcW w:type="dxa" w:w="3600"/>
+          </w:tcPr>
+          <w:p>
+            <w:pPr>
+              <w:spacing w:before="40" w:after="40"/>
+              <w:jc w:val="left"/>
+            </w:pPr>
+            <w:r/>
+            <w:r>
+              <w:rPr>
+                <w:rFonts w:ascii="Times New Roman" w:hAnsi="Times New Roman"/>
+                <w:b w:val="0"/>
+                <w:i w:val="0"/>
+                <w:sz w:val="22"/>
+              </w:rPr>
+              <w:t>Menerima Surat/Disposisi, Mengerjakan Lembar Kerja Disposisi</w:t>
+            </w:r>
+          </w:p>
+        </w:tc>
+        <w:tc>
+          <w:tcPr>
+            <w:tcW w:type="dxa" w:w="2592"/>
+          </w:tcPr>
+          <w:p>
+            <w:pPr>
+              <w:spacing w:before="40" w:after="40"/>
+              <w:jc w:val="left"/>
+            </w:pPr>
+            <w:r/>
+            <w:r>
+              <w:rPr>
+                <w:rFonts w:ascii="Times New Roman" w:hAnsi="Times New Roman"/>
+                <w:b w:val="0"/>
+                <w:i w:val="0"/>
+                <w:sz w:val="22"/>
+              </w:rPr>
+              <w:t>Hingga RESTRICTED (atau CONFIDENTIAL jika diberi wewenang khusus)</w:t>
+            </w:r>
+          </w:p>
+        </w:tc>
+      </w:tr>
+      <w:tr>
+        <w:tc>
+          <w:tcPr>
+            <w:tcW w:type="dxa" w:w="1728"/>
+          </w:tcPr>
+          <w:p>
+            <w:pPr>
+              <w:spacing w:before="40" w:after="40"/>
+              <w:jc w:val="center"/>
+            </w:pPr>
+            <w:r/>
+            <w:r>
+              <w:rPr>
+                <w:rFonts w:ascii="Times New Roman" w:hAnsi="Times New Roman"/>
+                <w:b w:val="0"/>
+                <w:i w:val="0"/>
+                <w:sz w:val="22"/>
+              </w:rPr>
+              <w:t>AUDITOR</w:t>
+            </w:r>
+          </w:p>
+        </w:tc>
+        <w:tc>
+          <w:tcPr>
+            <w:tcW w:type="dxa" w:w="3600"/>
+          </w:tcPr>
+          <w:p>
+            <w:pPr>
+              <w:spacing w:before="40" w:after="40"/>
+              <w:jc w:val="left"/>
+            </w:pPr>
+            <w:r/>
+            <w:r>
+              <w:rPr>
+                <w:rFonts w:ascii="Times New Roman" w:hAnsi="Times New Roman"/>
+                <w:b w:val="0"/>
+                <w:i w:val="0"/>
+                <w:sz w:val="22"/>
+              </w:rPr>
+              <w:t>Membaca Riwayat Log Transaksi, Melakukan Verifikasi Kepatuhan (Compliance)</w:t>
+            </w:r>
+          </w:p>
+        </w:tc>
+        <w:tc>
+          <w:tcPr>
+            <w:tcW w:type="dxa" w:w="2592"/>
+          </w:tcPr>
+          <w:p>
+            <w:pPr>
+              <w:spacing w:before="40" w:after="40"/>
+              <w:jc w:val="left"/>
+            </w:pPr>
+            <w:r/>
+            <w:r>
+              <w:rPr>
+                <w:rFonts w:ascii="Times New Roman" w:hAnsi="Times New Roman"/>
+                <w:b w:val="0"/>
+                <w:i w:val="0"/>
+                <w:sz w:val="22"/>
+              </w:rPr>
+              <w:t>UNCLASSIFIED &amp; RESTRICTED (tidak membaca isi cipher dokumen)</w:t>
+            </w:r>
+          </w:p>
+        </w:tc>
+      </w:tr>
+    </w:tbl>
     <w:p>
       <w:pPr>
         <w:spacing w:after="0" w:line="276" w:lineRule="auto"/>
@@ -17516,6 +18594,746 @@
         <w:t xml:space="preserve"> (SUS) serta evaluasi efisiensi workflow persuratan.</w:t>
       </w:r>
     </w:p>
+    <w:p>
+      <w:pPr>
+        <w:spacing w:before="240" w:after="120"/>
+      </w:pPr>
+      <w:r>
+        <w:rPr>
+          <w:rFonts w:ascii="Times New Roman" w:hAnsi="Times New Roman"/>
+          <w:b/>
+          <w:sz w:val="24"/>
+        </w:rPr>
+        <w:t>Tabel 3.2 Kuesioner Pengukuran Usability System Usability Scale (SUS)</w:t>
+      </w:r>
+    </w:p>
+    <w:tbl>
+      <w:tblPr>
+        <w:tblStyle w:val="TableGrid0"/>
+        <w:tblW w:type="auto" w:w="0"/>
+        <w:tblLook w:firstColumn="1" w:firstRow="1" w:lastColumn="0" w:lastRow="0" w:noHBand="0" w:noVBand="1" w:val="04A0"/>
+      </w:tblPr>
+      <w:tblGrid>
+        <w:gridCol w:w="576"/>
+        <w:gridCol w:w="5184"/>
+        <w:gridCol w:w="2160"/>
+      </w:tblGrid>
+      <w:tr>
+        <w:tc>
+          <w:tcPr>
+            <w:tcW w:type="dxa" w:w="576"/>
+          </w:tcPr>
+          <w:p>
+            <w:pPr>
+              <w:spacing w:before="40" w:after="40"/>
+              <w:jc w:val="center"/>
+            </w:pPr>
+            <w:r/>
+            <w:r>
+              <w:rPr>
+                <w:rFonts w:ascii="Times New Roman" w:hAnsi="Times New Roman"/>
+                <w:b/>
+                <w:i w:val="0"/>
+                <w:sz w:val="22"/>
+              </w:rPr>
+              <w:t>No</w:t>
+            </w:r>
+          </w:p>
+        </w:tc>
+        <w:tc>
+          <w:tcPr>
+            <w:tcW w:type="dxa" w:w="5184"/>
+          </w:tcPr>
+          <w:p>
+            <w:pPr>
+              <w:spacing w:before="40" w:after="40"/>
+              <w:jc w:val="center"/>
+            </w:pPr>
+            <w:r/>
+            <w:r>
+              <w:rPr>
+                <w:rFonts w:ascii="Times New Roman" w:hAnsi="Times New Roman"/>
+                <w:b/>
+                <w:i w:val="0"/>
+                <w:sz w:val="22"/>
+              </w:rPr>
+              <w:t>Pernyataan Kuesioner SUS</w:t>
+            </w:r>
+          </w:p>
+        </w:tc>
+        <w:tc>
+          <w:tcPr>
+            <w:tcW w:type="dxa" w:w="2160"/>
+          </w:tcPr>
+          <w:p>
+            <w:pPr>
+              <w:spacing w:before="40" w:after="40"/>
+              <w:jc w:val="center"/>
+            </w:pPr>
+            <w:r/>
+            <w:r>
+              <w:rPr>
+                <w:rFonts w:ascii="Times New Roman" w:hAnsi="Times New Roman"/>
+                <w:b/>
+                <w:i w:val="0"/>
+                <w:sz w:val="22"/>
+              </w:rPr>
+              <w:t>Skala Penilaian (Likert Scale)</w:t>
+            </w:r>
+          </w:p>
+        </w:tc>
+      </w:tr>
+      <w:tr>
+        <w:tc>
+          <w:tcPr>
+            <w:tcW w:type="dxa" w:w="576"/>
+          </w:tcPr>
+          <w:p>
+            <w:pPr>
+              <w:spacing w:before="40" w:after="40"/>
+              <w:jc w:val="center"/>
+            </w:pPr>
+            <w:r/>
+            <w:r>
+              <w:rPr>
+                <w:rFonts w:ascii="Times New Roman" w:hAnsi="Times New Roman"/>
+                <w:b w:val="0"/>
+                <w:i w:val="0"/>
+                <w:sz w:val="22"/>
+              </w:rPr>
+              <w:t>1</w:t>
+            </w:r>
+          </w:p>
+        </w:tc>
+        <w:tc>
+          <w:tcPr>
+            <w:tcW w:type="dxa" w:w="5184"/>
+          </w:tcPr>
+          <w:p>
+            <w:pPr>
+              <w:spacing w:before="40" w:after="40"/>
+              <w:jc w:val="left"/>
+            </w:pPr>
+            <w:r/>
+            <w:r>
+              <w:rPr>
+                <w:rFonts w:ascii="Times New Roman" w:hAnsi="Times New Roman"/>
+                <w:b w:val="0"/>
+                <w:i w:val="0"/>
+                <w:sz w:val="22"/>
+              </w:rPr>
+              <w:t>Saya berpikir akan menggunakan sistem SecSent ini lagi secara rutin.</w:t>
+            </w:r>
+          </w:p>
+        </w:tc>
+        <w:tc>
+          <w:tcPr>
+            <w:tcW w:type="dxa" w:w="2160"/>
+          </w:tcPr>
+          <w:p>
+            <w:pPr>
+              <w:spacing w:before="40" w:after="40"/>
+              <w:jc w:val="center"/>
+            </w:pPr>
+            <w:r/>
+            <w:r>
+              <w:rPr>
+                <w:rFonts w:ascii="Times New Roman" w:hAnsi="Times New Roman"/>
+                <w:b w:val="0"/>
+                <w:i w:val="0"/>
+                <w:sz w:val="22"/>
+              </w:rPr>
+              <w:t>1 (Sangat Tidak Setuju) s.d. 5 (Sangat Setuju)</w:t>
+            </w:r>
+          </w:p>
+        </w:tc>
+      </w:tr>
+      <w:tr>
+        <w:tc>
+          <w:tcPr>
+            <w:tcW w:type="dxa" w:w="576"/>
+          </w:tcPr>
+          <w:p>
+            <w:pPr>
+              <w:spacing w:before="40" w:after="40"/>
+              <w:jc w:val="center"/>
+            </w:pPr>
+            <w:r/>
+            <w:r>
+              <w:rPr>
+                <w:rFonts w:ascii="Times New Roman" w:hAnsi="Times New Roman"/>
+                <w:b w:val="0"/>
+                <w:i w:val="0"/>
+                <w:sz w:val="22"/>
+              </w:rPr>
+              <w:t>2</w:t>
+            </w:r>
+          </w:p>
+        </w:tc>
+        <w:tc>
+          <w:tcPr>
+            <w:tcW w:type="dxa" w:w="5184"/>
+          </w:tcPr>
+          <w:p>
+            <w:pPr>
+              <w:spacing w:before="40" w:after="40"/>
+              <w:jc w:val="left"/>
+            </w:pPr>
+            <w:r/>
+            <w:r>
+              <w:rPr>
+                <w:rFonts w:ascii="Times New Roman" w:hAnsi="Times New Roman"/>
+                <w:b w:val="0"/>
+                <w:i w:val="0"/>
+                <w:sz w:val="22"/>
+              </w:rPr>
+              <w:t>Saya merasa sistem ini terlalu rumit, padahal bisa dibuat lebih sederhana.</w:t>
+            </w:r>
+          </w:p>
+        </w:tc>
+        <w:tc>
+          <w:tcPr>
+            <w:tcW w:type="dxa" w:w="2160"/>
+          </w:tcPr>
+          <w:p>
+            <w:pPr>
+              <w:spacing w:before="40" w:after="40"/>
+              <w:jc w:val="center"/>
+            </w:pPr>
+            <w:r/>
+            <w:r>
+              <w:rPr>
+                <w:rFonts w:ascii="Times New Roman" w:hAnsi="Times New Roman"/>
+                <w:b w:val="0"/>
+                <w:i w:val="0"/>
+                <w:sz w:val="22"/>
+              </w:rPr>
+              <w:t>1 (Sangat Tidak Setuju) s.d. 5 (Sangat Setuju)</w:t>
+            </w:r>
+          </w:p>
+        </w:tc>
+      </w:tr>
+      <w:tr>
+        <w:tc>
+          <w:tcPr>
+            <w:tcW w:type="dxa" w:w="576"/>
+          </w:tcPr>
+          <w:p>
+            <w:pPr>
+              <w:spacing w:before="40" w:after="40"/>
+              <w:jc w:val="center"/>
+            </w:pPr>
+            <w:r/>
+            <w:r>
+              <w:rPr>
+                <w:rFonts w:ascii="Times New Roman" w:hAnsi="Times New Roman"/>
+                <w:b w:val="0"/>
+                <w:i w:val="0"/>
+                <w:sz w:val="22"/>
+              </w:rPr>
+              <w:t>3</w:t>
+            </w:r>
+          </w:p>
+        </w:tc>
+        <w:tc>
+          <w:tcPr>
+            <w:tcW w:type="dxa" w:w="5184"/>
+          </w:tcPr>
+          <w:p>
+            <w:pPr>
+              <w:spacing w:before="40" w:after="40"/>
+              <w:jc w:val="left"/>
+            </w:pPr>
+            <w:r/>
+            <w:r>
+              <w:rPr>
+                <w:rFonts w:ascii="Times New Roman" w:hAnsi="Times New Roman"/>
+                <w:b w:val="0"/>
+                <w:i w:val="0"/>
+                <w:sz w:val="22"/>
+              </w:rPr>
+              <w:t>Saya merasa sistem SecSent mudah digunakan untuk mengirim/menerima surat terenkripsi.</w:t>
+            </w:r>
+          </w:p>
+        </w:tc>
+        <w:tc>
+          <w:tcPr>
+            <w:tcW w:type="dxa" w:w="2160"/>
+          </w:tcPr>
+          <w:p>
+            <w:pPr>
+              <w:spacing w:before="40" w:after="40"/>
+              <w:jc w:val="center"/>
+            </w:pPr>
+            <w:r/>
+            <w:r>
+              <w:rPr>
+                <w:rFonts w:ascii="Times New Roman" w:hAnsi="Times New Roman"/>
+                <w:b w:val="0"/>
+                <w:i w:val="0"/>
+                <w:sz w:val="22"/>
+              </w:rPr>
+              <w:t>1 (Sangat Tidak Setuju) s.d. 5 (Sangat Setuju)</w:t>
+            </w:r>
+          </w:p>
+        </w:tc>
+      </w:tr>
+      <w:tr>
+        <w:tc>
+          <w:tcPr>
+            <w:tcW w:type="dxa" w:w="576"/>
+          </w:tcPr>
+          <w:p>
+            <w:pPr>
+              <w:spacing w:before="40" w:after="40"/>
+              <w:jc w:val="center"/>
+            </w:pPr>
+            <w:r/>
+            <w:r>
+              <w:rPr>
+                <w:rFonts w:ascii="Times New Roman" w:hAnsi="Times New Roman"/>
+                <w:b w:val="0"/>
+                <w:i w:val="0"/>
+                <w:sz w:val="22"/>
+              </w:rPr>
+              <w:t>4</w:t>
+            </w:r>
+          </w:p>
+        </w:tc>
+        <w:tc>
+          <w:tcPr>
+            <w:tcW w:type="dxa" w:w="5184"/>
+          </w:tcPr>
+          <w:p>
+            <w:pPr>
+              <w:spacing w:before="40" w:after="40"/>
+              <w:jc w:val="left"/>
+            </w:pPr>
+            <w:r/>
+            <w:r>
+              <w:rPr>
+                <w:rFonts w:ascii="Times New Roman" w:hAnsi="Times New Roman"/>
+                <w:b w:val="0"/>
+                <w:i w:val="0"/>
+                <w:sz w:val="22"/>
+              </w:rPr>
+              <w:t>Saya rasa saya membutuhkan bantuan orang teknis untuk dapat menggunakan sistem ini.</w:t>
+            </w:r>
+          </w:p>
+        </w:tc>
+        <w:tc>
+          <w:tcPr>
+            <w:tcW w:type="dxa" w:w="2160"/>
+          </w:tcPr>
+          <w:p>
+            <w:pPr>
+              <w:spacing w:before="40" w:after="40"/>
+              <w:jc w:val="center"/>
+            </w:pPr>
+            <w:r/>
+            <w:r>
+              <w:rPr>
+                <w:rFonts w:ascii="Times New Roman" w:hAnsi="Times New Roman"/>
+                <w:b w:val="0"/>
+                <w:i w:val="0"/>
+                <w:sz w:val="22"/>
+              </w:rPr>
+              <w:t>1 (Sangat Tidak Setuju) s.d. 5 (Sangat Setuju)</w:t>
+            </w:r>
+          </w:p>
+        </w:tc>
+      </w:tr>
+      <w:tr>
+        <w:tc>
+          <w:tcPr>
+            <w:tcW w:type="dxa" w:w="576"/>
+          </w:tcPr>
+          <w:p>
+            <w:pPr>
+              <w:spacing w:before="40" w:after="40"/>
+              <w:jc w:val="center"/>
+            </w:pPr>
+            <w:r/>
+            <w:r>
+              <w:rPr>
+                <w:rFonts w:ascii="Times New Roman" w:hAnsi="Times New Roman"/>
+                <w:b w:val="0"/>
+                <w:i w:val="0"/>
+                <w:sz w:val="22"/>
+              </w:rPr>
+              <w:t>5</w:t>
+            </w:r>
+          </w:p>
+        </w:tc>
+        <w:tc>
+          <w:tcPr>
+            <w:tcW w:type="dxa" w:w="5184"/>
+          </w:tcPr>
+          <w:p>
+            <w:pPr>
+              <w:spacing w:before="40" w:after="40"/>
+              <w:jc w:val="left"/>
+            </w:pPr>
+            <w:r/>
+            <w:r>
+              <w:rPr>
+                <w:rFonts w:ascii="Times New Roman" w:hAnsi="Times New Roman"/>
+                <w:b w:val="0"/>
+                <w:i w:val="0"/>
+                <w:sz w:val="22"/>
+              </w:rPr>
+              <w:t>Saya merasa fitur-fitur keamanan persuratan pada sistem ini terintegrasi dengan baik.</w:t>
+            </w:r>
+          </w:p>
+        </w:tc>
+        <w:tc>
+          <w:tcPr>
+            <w:tcW w:type="dxa" w:w="2160"/>
+          </w:tcPr>
+          <w:p>
+            <w:pPr>
+              <w:spacing w:before="40" w:after="40"/>
+              <w:jc w:val="center"/>
+            </w:pPr>
+            <w:r/>
+            <w:r>
+              <w:rPr>
+                <w:rFonts w:ascii="Times New Roman" w:hAnsi="Times New Roman"/>
+                <w:b w:val="0"/>
+                <w:i w:val="0"/>
+                <w:sz w:val="22"/>
+              </w:rPr>
+              <w:t>1 (Sangat Tidak Setuju) s.d. 5 (Sangat Setuju)</w:t>
+            </w:r>
+          </w:p>
+        </w:tc>
+      </w:tr>
+      <w:tr>
+        <w:tc>
+          <w:tcPr>
+            <w:tcW w:type="dxa" w:w="576"/>
+          </w:tcPr>
+          <w:p>
+            <w:pPr>
+              <w:spacing w:before="40" w:after="40"/>
+              <w:jc w:val="center"/>
+            </w:pPr>
+            <w:r/>
+            <w:r>
+              <w:rPr>
+                <w:rFonts w:ascii="Times New Roman" w:hAnsi="Times New Roman"/>
+                <w:b w:val="0"/>
+                <w:i w:val="0"/>
+                <w:sz w:val="22"/>
+              </w:rPr>
+              <w:t>6</w:t>
+            </w:r>
+          </w:p>
+        </w:tc>
+        <w:tc>
+          <w:tcPr>
+            <w:tcW w:type="dxa" w:w="5184"/>
+          </w:tcPr>
+          <w:p>
+            <w:pPr>
+              <w:spacing w:before="40" w:after="40"/>
+              <w:jc w:val="left"/>
+            </w:pPr>
+            <w:r/>
+            <w:r>
+              <w:rPr>
+                <w:rFonts w:ascii="Times New Roman" w:hAnsi="Times New Roman"/>
+                <w:b w:val="0"/>
+                <w:i w:val="0"/>
+                <w:sz w:val="22"/>
+              </w:rPr>
+              <w:t>Saya merasa ada banyak inkonsistensi (ketidakselarasan) pada sistem ini.</w:t>
+            </w:r>
+          </w:p>
+        </w:tc>
+        <w:tc>
+          <w:tcPr>
+            <w:tcW w:type="dxa" w:w="2160"/>
+          </w:tcPr>
+          <w:p>
+            <w:pPr>
+              <w:spacing w:before="40" w:after="40"/>
+              <w:jc w:val="center"/>
+            </w:pPr>
+            <w:r/>
+            <w:r>
+              <w:rPr>
+                <w:rFonts w:ascii="Times New Roman" w:hAnsi="Times New Roman"/>
+                <w:b w:val="0"/>
+                <w:i w:val="0"/>
+                <w:sz w:val="22"/>
+              </w:rPr>
+              <w:t>1 (Sangat Tidak Setuju) s.d. 5 (Sangat Setuju)</w:t>
+            </w:r>
+          </w:p>
+        </w:tc>
+      </w:tr>
+      <w:tr>
+        <w:tc>
+          <w:tcPr>
+            <w:tcW w:type="dxa" w:w="576"/>
+          </w:tcPr>
+          <w:p>
+            <w:pPr>
+              <w:spacing w:before="40" w:after="40"/>
+              <w:jc w:val="center"/>
+            </w:pPr>
+            <w:r/>
+            <w:r>
+              <w:rPr>
+                <w:rFonts w:ascii="Times New Roman" w:hAnsi="Times New Roman"/>
+                <w:b w:val="0"/>
+                <w:i w:val="0"/>
+                <w:sz w:val="22"/>
+              </w:rPr>
+              <w:t>7</w:t>
+            </w:r>
+          </w:p>
+        </w:tc>
+        <w:tc>
+          <w:tcPr>
+            <w:tcW w:type="dxa" w:w="5184"/>
+          </w:tcPr>
+          <w:p>
+            <w:pPr>
+              <w:spacing w:before="40" w:after="40"/>
+              <w:jc w:val="left"/>
+            </w:pPr>
+            <w:r/>
+            <w:r>
+              <w:rPr>
+                <w:rFonts w:ascii="Times New Roman" w:hAnsi="Times New Roman"/>
+                <w:b w:val="0"/>
+                <w:i w:val="0"/>
+                <w:sz w:val="22"/>
+              </w:rPr>
+              <w:t>Saya memperkirakan kebanyakan orang akan cepat belajar menggunakan sistem SecSent ini.</w:t>
+            </w:r>
+          </w:p>
+        </w:tc>
+        <w:tc>
+          <w:tcPr>
+            <w:tcW w:type="dxa" w:w="2160"/>
+          </w:tcPr>
+          <w:p>
+            <w:pPr>
+              <w:spacing w:before="40" w:after="40"/>
+              <w:jc w:val="center"/>
+            </w:pPr>
+            <w:r/>
+            <w:r>
+              <w:rPr>
+                <w:rFonts w:ascii="Times New Roman" w:hAnsi="Times New Roman"/>
+                <w:b w:val="0"/>
+                <w:i w:val="0"/>
+                <w:sz w:val="22"/>
+              </w:rPr>
+              <w:t>1 (Sangat Tidak Setuju) s.d. 5 (Sangat Setuju)</w:t>
+            </w:r>
+          </w:p>
+        </w:tc>
+      </w:tr>
+      <w:tr>
+        <w:tc>
+          <w:tcPr>
+            <w:tcW w:type="dxa" w:w="576"/>
+          </w:tcPr>
+          <w:p>
+            <w:pPr>
+              <w:spacing w:before="40" w:after="40"/>
+              <w:jc w:val="center"/>
+            </w:pPr>
+            <w:r/>
+            <w:r>
+              <w:rPr>
+                <w:rFonts w:ascii="Times New Roman" w:hAnsi="Times New Roman"/>
+                <w:b w:val="0"/>
+                <w:i w:val="0"/>
+                <w:sz w:val="22"/>
+              </w:rPr>
+              <w:t>8</w:t>
+            </w:r>
+          </w:p>
+        </w:tc>
+        <w:tc>
+          <w:tcPr>
+            <w:tcW w:type="dxa" w:w="5184"/>
+          </w:tcPr>
+          <w:p>
+            <w:pPr>
+              <w:spacing w:before="40" w:after="40"/>
+              <w:jc w:val="left"/>
+            </w:pPr>
+            <w:r/>
+            <w:r>
+              <w:rPr>
+                <w:rFonts w:ascii="Times New Roman" w:hAnsi="Times New Roman"/>
+                <w:b w:val="0"/>
+                <w:i w:val="0"/>
+                <w:sz w:val="22"/>
+              </w:rPr>
+              <w:t>Saya merasa sistem ini sangat membingungkan saat proses enkripsi/tanda tangan lokal.</w:t>
+            </w:r>
+          </w:p>
+        </w:tc>
+        <w:tc>
+          <w:tcPr>
+            <w:tcW w:type="dxa" w:w="2160"/>
+          </w:tcPr>
+          <w:p>
+            <w:pPr>
+              <w:spacing w:before="40" w:after="40"/>
+              <w:jc w:val="center"/>
+            </w:pPr>
+            <w:r/>
+            <w:r>
+              <w:rPr>
+                <w:rFonts w:ascii="Times New Roman" w:hAnsi="Times New Roman"/>
+                <w:b w:val="0"/>
+                <w:i w:val="0"/>
+                <w:sz w:val="22"/>
+              </w:rPr>
+              <w:t>1 (Sangat Tidak Setuju) s.d. 5 (Sangat Setuju)</w:t>
+            </w:r>
+          </w:p>
+        </w:tc>
+      </w:tr>
+      <w:tr>
+        <w:tc>
+          <w:tcPr>
+            <w:tcW w:type="dxa" w:w="576"/>
+          </w:tcPr>
+          <w:p>
+            <w:pPr>
+              <w:spacing w:before="40" w:after="40"/>
+              <w:jc w:val="center"/>
+            </w:pPr>
+            <w:r/>
+            <w:r>
+              <w:rPr>
+                <w:rFonts w:ascii="Times New Roman" w:hAnsi="Times New Roman"/>
+                <w:b w:val="0"/>
+                <w:i w:val="0"/>
+                <w:sz w:val="22"/>
+              </w:rPr>
+              <w:t>9</w:t>
+            </w:r>
+          </w:p>
+        </w:tc>
+        <w:tc>
+          <w:tcPr>
+            <w:tcW w:type="dxa" w:w="5184"/>
+          </w:tcPr>
+          <w:p>
+            <w:pPr>
+              <w:spacing w:before="40" w:after="40"/>
+              <w:jc w:val="left"/>
+            </w:pPr>
+            <w:r/>
+            <w:r>
+              <w:rPr>
+                <w:rFonts w:ascii="Times New Roman" w:hAnsi="Times New Roman"/>
+                <w:b w:val="0"/>
+                <w:i w:val="0"/>
+                <w:sz w:val="22"/>
+              </w:rPr>
+              <w:t>Saya merasa sangat percaya diri menggunakan sistem SecSent ini.</w:t>
+            </w:r>
+          </w:p>
+        </w:tc>
+        <w:tc>
+          <w:tcPr>
+            <w:tcW w:type="dxa" w:w="2160"/>
+          </w:tcPr>
+          <w:p>
+            <w:pPr>
+              <w:spacing w:before="40" w:after="40"/>
+              <w:jc w:val="center"/>
+            </w:pPr>
+            <w:r/>
+            <w:r>
+              <w:rPr>
+                <w:rFonts w:ascii="Times New Roman" w:hAnsi="Times New Roman"/>
+                <w:b w:val="0"/>
+                <w:i w:val="0"/>
+                <w:sz w:val="22"/>
+              </w:rPr>
+              <w:t>1 (Sangat Tidak Setuju) s.d. 5 (Sangat Setuju)</w:t>
+            </w:r>
+          </w:p>
+        </w:tc>
+      </w:tr>
+      <w:tr>
+        <w:tc>
+          <w:tcPr>
+            <w:tcW w:type="dxa" w:w="576"/>
+          </w:tcPr>
+          <w:p>
+            <w:pPr>
+              <w:spacing w:before="40" w:after="40"/>
+              <w:jc w:val="center"/>
+            </w:pPr>
+            <w:r/>
+            <w:r>
+              <w:rPr>
+                <w:rFonts w:ascii="Times New Roman" w:hAnsi="Times New Roman"/>
+                <w:b w:val="0"/>
+                <w:i w:val="0"/>
+                <w:sz w:val="22"/>
+              </w:rPr>
+              <w:t>10</w:t>
+            </w:r>
+          </w:p>
+        </w:tc>
+        <w:tc>
+          <w:tcPr>
+            <w:tcW w:type="dxa" w:w="5184"/>
+          </w:tcPr>
+          <w:p>
+            <w:pPr>
+              <w:spacing w:before="40" w:after="40"/>
+              <w:jc w:val="left"/>
+            </w:pPr>
+            <w:r/>
+            <w:r>
+              <w:rPr>
+                <w:rFonts w:ascii="Times New Roman" w:hAnsi="Times New Roman"/>
+                <w:b w:val="0"/>
+                <w:i w:val="0"/>
+                <w:sz w:val="22"/>
+              </w:rPr>
+              <w:t>Saya butuh membiasakan diri terlebih dahulu sebelum lancar menggunakan sistem ini.</w:t>
+            </w:r>
+          </w:p>
+        </w:tc>
+        <w:tc>
+          <w:tcPr>
+            <w:tcW w:type="dxa" w:w="2160"/>
+          </w:tcPr>
+          <w:p>
+            <w:pPr>
+              <w:spacing w:before="40" w:after="40"/>
+              <w:jc w:val="center"/>
+            </w:pPr>
+            <w:r/>
+            <w:r>
+              <w:rPr>
+                <w:rFonts w:ascii="Times New Roman" w:hAnsi="Times New Roman"/>
+                <w:b w:val="0"/>
+                <w:i w:val="0"/>
+                <w:sz w:val="22"/>
+              </w:rPr>
+              <w:t>1 (Sangat Tidak Setuju) s.d. 5 (Sangat Setuju)</w:t>
+            </w:r>
+          </w:p>
+        </w:tc>
+      </w:tr>
+    </w:tbl>
     <w:p>
       <w:pPr>
         <w:spacing w:after="0" w:line="276" w:lineRule="auto"/>
@@ -17754,7 +19572,43 @@
     <w:p>
       <w:pPr>
         <w:pStyle w:val="Caption"/>
-      </w:pPr>
+        <w:jc w:val="center"/>
+      </w:pPr>
+      <w:r/>
+      <w:r>
+        <w:drawing>
+          <wp:inline xmlns:a="http://schemas.openxmlformats.org/drawingml/2006/main" xmlns:pic="http://schemas.openxmlformats.org/drawingml/2006/picture">
+            <wp:extent cx="5029200" cy="1508760"/>
+            <wp:docPr id="2040411923" name="Picture 2040411923"/>
+            <wp:cNvGraphicFramePr>
+              <a:graphicFrameLocks noChangeAspect="1"/>
+            </wp:cNvGraphicFramePr>
+            <a:graphic>
+              <a:graphicData uri="http://schemas.openxmlformats.org/drawingml/2006/picture">
+                <pic:pic>
+                  <pic:nvPicPr>
+                    <pic:cNvPr id="0" name="dsrm_framework.png"/>
+                    <pic:cNvPicPr/>
+                  </pic:nvPicPr>
+                  <pic:blipFill>
+                    <a:blip r:embed="rId14"/>
+                    <a:stretch>
+                      <a:fillRect/>
+                    </a:stretch>
+                  </pic:blipFill>
+                  <pic:spPr>
+                    <a:xfrm>
+                      <a:off x="0" y="0"/>
+                      <a:ext cx="5029200" cy="1508760"/>
+                    </a:xfrm>
+                    <a:prstGeom prst="rect"/>
+                  </pic:spPr>
+                </pic:pic>
+              </a:graphicData>
+            </a:graphic>
+          </wp:inline>
+        </w:drawing>
+      </w:r>
     </w:p>
     <w:p>
       <w:pPr>
@@ -19515,6 +21369,60 @@
     </w:p>
     <w:p>
       <w:pPr>
+        <w:spacing w:before="240"/>
+        <w:jc w:val="center"/>
+      </w:pPr>
+      <w:r>
+        <w:drawing>
+          <wp:inline xmlns:a="http://schemas.openxmlformats.org/drawingml/2006/main" xmlns:pic="http://schemas.openxmlformats.org/drawingml/2006/picture">
+            <wp:extent cx="5029200" cy="2766060"/>
+            <wp:docPr id="2040411924" name="Picture 2040411924"/>
+            <wp:cNvGraphicFramePr>
+              <a:graphicFrameLocks noChangeAspect="1"/>
+            </wp:cNvGraphicFramePr>
+            <a:graphic>
+              <a:graphicData uri="http://schemas.openxmlformats.org/drawingml/2006/picture">
+                <pic:pic>
+                  <pic:nvPicPr>
+                    <pic:cNvPr id="0" name="system_architecture.png"/>
+                    <pic:cNvPicPr/>
+                  </pic:nvPicPr>
+                  <pic:blipFill>
+                    <a:blip r:embed="rId15"/>
+                    <a:stretch>
+                      <a:fillRect/>
+                    </a:stretch>
+                  </pic:blipFill>
+                  <pic:spPr>
+                    <a:xfrm>
+                      <a:off x="0" y="0"/>
+                      <a:ext cx="5029200" cy="2766060"/>
+                    </a:xfrm>
+                    <a:prstGeom prst="rect"/>
+                  </pic:spPr>
+                </pic:pic>
+              </a:graphicData>
+            </a:graphic>
+          </wp:inline>
+        </w:drawing>
+      </w:r>
+    </w:p>
+    <w:p>
+      <w:pPr>
+        <w:spacing w:after="240"/>
+        <w:jc w:val="center"/>
+      </w:pPr>
+      <w:r>
+        <w:rPr>
+          <w:rFonts w:ascii="Times New Roman" w:hAnsi="Times New Roman"/>
+          <w:b/>
+          <w:sz w:val="24"/>
+        </w:rPr>
+        <w:t>Gambar 3.2 Arsitektur Sistem 4-Tier SecSent</w:t>
+      </w:r>
+    </w:p>
+    <w:p>
+      <w:pPr>
         <w:numPr>
           <w:ilvl w:val="0"/>
           <w:numId w:val="21"/>
@@ -20742,6 +22650,60 @@
           <w:lang w:val="en-US"/>
         </w:rPr>
         <w:t xml:space="preserve"> RBAC/Clearance Level.</w:t>
+      </w:r>
+    </w:p>
+    <w:p>
+      <w:pPr>
+        <w:spacing w:before="240"/>
+        <w:jc w:val="center"/>
+      </w:pPr>
+      <w:r>
+        <w:drawing>
+          <wp:inline xmlns:a="http://schemas.openxmlformats.org/drawingml/2006/main" xmlns:pic="http://schemas.openxmlformats.org/drawingml/2006/picture">
+            <wp:extent cx="5029200" cy="2263140"/>
+            <wp:docPr id="2040411925" name="Picture 2040411925"/>
+            <wp:cNvGraphicFramePr>
+              <a:graphicFrameLocks noChangeAspect="1"/>
+            </wp:cNvGraphicFramePr>
+            <a:graphic>
+              <a:graphicData uri="http://schemas.openxmlformats.org/drawingml/2006/picture">
+                <pic:pic>
+                  <pic:nvPicPr>
+                    <pic:cNvPr id="0" name="crypto_flow.png"/>
+                    <pic:cNvPicPr/>
+                  </pic:nvPicPr>
+                  <pic:blipFill>
+                    <a:blip r:embed="rId16"/>
+                    <a:stretch>
+                      <a:fillRect/>
+                    </a:stretch>
+                  </pic:blipFill>
+                  <pic:spPr>
+                    <a:xfrm>
+                      <a:off x="0" y="0"/>
+                      <a:ext cx="5029200" cy="2263140"/>
+                    </a:xfrm>
+                    <a:prstGeom prst="rect"/>
+                  </pic:spPr>
+                </pic:pic>
+              </a:graphicData>
+            </a:graphic>
+          </wp:inline>
+        </w:drawing>
+      </w:r>
+    </w:p>
+    <w:p>
+      <w:pPr>
+        <w:spacing w:after="240"/>
+        <w:jc w:val="center"/>
+      </w:pPr>
+      <w:r>
+        <w:rPr>
+          <w:rFonts w:ascii="Times New Roman" w:hAnsi="Times New Roman"/>
+          <w:b/>
+          <w:sz w:val="24"/>
+        </w:rPr>
+        <w:t>Gambar 3.3 Alur Kriptografi Hibrida SecSent</w:t>
       </w:r>
     </w:p>
     <w:p>

</xml_diff>

<commit_message>
test(audit): verify real-time serverless API function logic and install root neon package
</commit_message>
<xml_diff>
--- a/Proposal_Satria Alba Pramasha.docx
+++ b/Proposal_Satria Alba Pramasha.docx
@@ -7635,6 +7635,10 @@
     </w:p>
     <w:p>
       <w:pPr>
+        <w:tabs>
+          <w:tab w:pos="7920" w:val="right" w:leader="dot"/>
+        </w:tabs>
+        <w:spacing w:before="80" w:after="80"/>
         <w:rPr>
           <w:rFonts w:ascii="Times New Roman" w:hAnsi="Times New Roman" w:cs="Times New Roman"/>
           <w:b/>
@@ -7644,21 +7648,23 @@
           <w:lang w:val="pt-BR"/>
         </w:rPr>
       </w:pPr>
-      <w:r>
-        <w:rPr>
-          <w:rFonts w:ascii="Times New Roman" w:hAnsi="Times New Roman" w:cs="Times New Roman" w:eastAsia="Times New Roman"/>
-          <w:b/>
-          <w:bCs/>
-          <w:sz w:val="24"/>
-          <w:szCs w:val="24"/>
-          <w:lang w:val="pt-BR"/>
-        </w:rPr>
-        <w:br w:type="page"/>
+      <w:r/>
+      <w:r>
+        <w:rPr>
+          <w:rFonts w:ascii="Times New Roman" w:hAnsi="Times New Roman"/>
+          <w:sz w:val="24"/>
+        </w:rPr>
+        <w:t>Gambar 2.2 Kerangka Konseptual</w:t>
+        <w:tab/>
+        <w:t>20</w:t>
       </w:r>
     </w:p>
     <w:p>
       <w:pPr>
-        <w:spacing w:after="0" w:line="276" w:lineRule="auto"/>
+        <w:tabs>
+          <w:tab w:pos="7920" w:val="right" w:leader="dot"/>
+        </w:tabs>
+        <w:spacing w:after="80" w:line="276" w:lineRule="auto" w:before="80"/>
         <w:jc w:val="center"/>
         <w:rPr>
           <w:rFonts w:ascii="Times New Roman" w:hAnsi="Times New Roman" w:cs="Times New Roman"/>
@@ -7667,10 +7673,23 @@
           <w:lang w:val="pt-BR"/>
         </w:rPr>
       </w:pPr>
+      <w:r/>
+      <w:r>
+        <w:rPr>
+          <w:rFonts w:ascii="Times New Roman" w:hAnsi="Times New Roman"/>
+          <w:sz w:val="24"/>
+        </w:rPr>
+        <w:t>Gambar 3.1 Desain Kerangka Kerja</w:t>
+        <w:tab/>
+        <w:t>23</w:t>
+      </w:r>
     </w:p>
     <w:p>
       <w:pPr>
-        <w:spacing w:after="0" w:line="276" w:lineRule="auto"/>
+        <w:tabs>
+          <w:tab w:pos="7920" w:val="right" w:leader="dot"/>
+        </w:tabs>
+        <w:spacing w:after="80" w:line="276" w:lineRule="auto" w:before="80"/>
         <w:jc w:val="center"/>
         <w:rPr>
           <w:rFonts w:ascii="Times New Roman" w:hAnsi="Times New Roman" w:cs="Times New Roman"/>
@@ -7679,10 +7698,23 @@
           <w:lang w:val="pt-BR"/>
         </w:rPr>
       </w:pPr>
+      <w:r/>
+      <w:r>
+        <w:rPr>
+          <w:rFonts w:ascii="Times New Roman" w:hAnsi="Times New Roman"/>
+          <w:sz w:val="24"/>
+        </w:rPr>
+        <w:t>Gambar 3.2 Arsitektur Sistem 4-Tier SecSent</w:t>
+        <w:tab/>
+        <w:t>25</w:t>
+      </w:r>
     </w:p>
     <w:p>
       <w:pPr>
-        <w:spacing w:after="0" w:line="276" w:lineRule="auto"/>
+        <w:tabs>
+          <w:tab w:pos="7920" w:val="right" w:leader="dot"/>
+        </w:tabs>
+        <w:spacing w:after="80" w:line="276" w:lineRule="auto" w:before="80"/>
         <w:jc w:val="center"/>
         <w:rPr>
           <w:rFonts w:ascii="Times New Roman" w:hAnsi="Times New Roman" w:cs="Times New Roman"/>
@@ -7691,6 +7723,16 @@
           <w:lang w:val="pt-BR"/>
         </w:rPr>
       </w:pPr>
+      <w:r/>
+      <w:r>
+        <w:rPr>
+          <w:rFonts w:ascii="Times New Roman" w:hAnsi="Times New Roman"/>
+          <w:sz w:val="24"/>
+        </w:rPr>
+        <w:t>Gambar 3.3 Alur Kriptografi Hibrida SecSent</w:t>
+        <w:tab/>
+        <w:t>26</w:t>
+      </w:r>
     </w:p>
     <w:p>
       <w:pPr>
@@ -7719,6 +7761,10 @@
     </w:p>
     <w:p>
       <w:pPr>
+        <w:tabs>
+          <w:tab w:pos="7920" w:val="right" w:leader="dot"/>
+        </w:tabs>
+        <w:spacing w:before="80" w:after="80"/>
         <w:rPr>
           <w:rFonts w:ascii="Times New Roman" w:hAnsi="Times New Roman" w:cs="Times New Roman"/>
           <w:b/>
@@ -7728,21 +7774,23 @@
           <w:lang w:val="pt-BR"/>
         </w:rPr>
       </w:pPr>
-      <w:r>
-        <w:rPr>
-          <w:rFonts w:ascii="Times New Roman" w:hAnsi="Times New Roman" w:cs="Times New Roman" w:eastAsia="Times New Roman"/>
-          <w:b/>
-          <w:bCs/>
-          <w:sz w:val="24"/>
-          <w:szCs w:val="24"/>
-          <w:lang w:val="pt-BR"/>
-        </w:rPr>
-        <w:br w:type="page"/>
+      <w:r/>
+      <w:r>
+        <w:rPr>
+          <w:rFonts w:ascii="Times New Roman" w:hAnsi="Times New Roman"/>
+          <w:sz w:val="24"/>
+        </w:rPr>
+        <w:t>Tabel 2.5 Penelitian Terkait</w:t>
+        <w:tab/>
+        <w:t>19</w:t>
       </w:r>
     </w:p>
     <w:p>
       <w:pPr>
-        <w:spacing w:after="0" w:line="276" w:lineRule="auto"/>
+        <w:tabs>
+          <w:tab w:pos="7920" w:val="right" w:leader="dot"/>
+        </w:tabs>
+        <w:spacing w:after="80" w:line="276" w:lineRule="auto" w:before="80"/>
         <w:jc w:val="center"/>
         <w:rPr>
           <w:rFonts w:ascii="Times New Roman" w:hAnsi="Times New Roman" w:cs="Times New Roman"/>
@@ -7751,10 +7799,23 @@
           <w:lang w:val="pt-BR"/>
         </w:rPr>
       </w:pPr>
+      <w:r/>
+      <w:r>
+        <w:rPr>
+          <w:rFonts w:ascii="Times New Roman" w:hAnsi="Times New Roman"/>
+          <w:sz w:val="24"/>
+        </w:rPr>
+        <w:t>Tabel 2.6 Matriks Keamanan STRIDE dan Mitigasi Keamanan SecSent</w:t>
+        <w:tab/>
+        <w:t>19</w:t>
+      </w:r>
     </w:p>
     <w:p>
       <w:pPr>
-        <w:spacing w:after="0" w:line="276" w:lineRule="auto"/>
+        <w:tabs>
+          <w:tab w:pos="7920" w:val="right" w:leader="dot"/>
+        </w:tabs>
+        <w:spacing w:after="80" w:line="276" w:lineRule="auto" w:before="80"/>
         <w:jc w:val="center"/>
         <w:rPr>
           <w:rFonts w:ascii="Times New Roman" w:hAnsi="Times New Roman" w:cs="Times New Roman"/>
@@ -7763,10 +7824,23 @@
           <w:lang w:val="pt-BR"/>
         </w:rPr>
       </w:pPr>
+      <w:r/>
+      <w:r>
+        <w:rPr>
+          <w:rFonts w:ascii="Times New Roman" w:hAnsi="Times New Roman"/>
+          <w:sz w:val="24"/>
+        </w:rPr>
+        <w:t>Tabel 2.7 Matriks Otorisasi RBAC dan Clearance Level SecSent</w:t>
+        <w:tab/>
+        <w:t>20</w:t>
+      </w:r>
     </w:p>
     <w:p>
       <w:pPr>
-        <w:spacing w:after="0" w:line="276" w:lineRule="auto"/>
+        <w:tabs>
+          <w:tab w:pos="7920" w:val="right" w:leader="dot"/>
+        </w:tabs>
+        <w:spacing w:after="80" w:line="276" w:lineRule="auto" w:before="80"/>
         <w:jc w:val="center"/>
         <w:rPr>
           <w:rFonts w:ascii="Times New Roman" w:hAnsi="Times New Roman" w:cs="Times New Roman"/>
@@ -7775,6 +7849,16 @@
           <w:lang w:val="pt-BR"/>
         </w:rPr>
       </w:pPr>
+      <w:r/>
+      <w:r>
+        <w:rPr>
+          <w:rFonts w:ascii="Times New Roman" w:hAnsi="Times New Roman"/>
+          <w:sz w:val="24"/>
+        </w:rPr>
+        <w:t>Tabel 3.2 Kuesioner Pengukuran Usability System Usability Scale (SUS)</w:t>
+        <w:tab/>
+        <w:t>23</w:t>
+      </w:r>
     </w:p>
     <w:p>
       <w:pPr>
@@ -7812,18 +7896,499 @@
           <w:lang w:val="pt-BR"/>
         </w:rPr>
       </w:pPr>
-      <w:r>
-        <w:rPr>
-          <w:rFonts w:ascii="Times New Roman" w:hAnsi="Times New Roman" w:cs="Times New Roman" w:eastAsia="Times New Roman"/>
-          <w:b/>
-          <w:bCs/>
-          <w:sz w:val="24"/>
-          <w:szCs w:val="24"/>
-          <w:lang w:val="pt-BR"/>
-        </w:rPr>
-        <w:br w:type="page"/>
-      </w:r>
+      <w:r/>
     </w:p>
+    <w:tbl>
+      <w:tblPr>
+        <w:tblW w:type="auto" w:w="0"/>
+        <w:tblLook w:firstColumn="1" w:firstRow="1" w:lastColumn="0" w:lastRow="0" w:noHBand="0" w:noVBand="1" w:val="04A0"/>
+      </w:tblPr>
+      <w:tblGrid>
+        <w:gridCol w:w="6718"/>
+        <w:gridCol w:w="6718"/>
+      </w:tblGrid>
+      <w:tr>
+        <w:tc>
+          <w:tcPr>
+            <w:tcW w:type="dxa" w:w="2160"/>
+          </w:tcPr>
+          <w:p>
+            <w:pPr>
+              <w:spacing w:before="80" w:after="80"/>
+            </w:pPr>
+            <w:r>
+              <w:rPr>
+                <w:rFonts w:ascii="Times New Roman" w:hAnsi="Times New Roman"/>
+                <w:b/>
+                <w:sz w:val="22"/>
+              </w:rPr>
+              <w:t>AES-256-GCM</w:t>
+            </w:r>
+          </w:p>
+        </w:tc>
+        <w:tc>
+          <w:tcPr>
+            <w:tcW w:type="dxa" w:w="5760"/>
+          </w:tcPr>
+          <w:p>
+            <w:pPr>
+              <w:spacing w:before="80" w:after="80"/>
+            </w:pPr>
+            <w:r>
+              <w:rPr>
+                <w:rFonts w:ascii="Times New Roman" w:hAnsi="Times New Roman"/>
+                <w:sz w:val="22"/>
+              </w:rPr>
+              <w:t>Advanced Encryption Standard dengan panjang kunci 256-bit dalam mode Galois/Counter Mode (kriptografi simetris untuk payload dokumen).</w:t>
+            </w:r>
+          </w:p>
+        </w:tc>
+      </w:tr>
+      <w:tr>
+        <w:tc>
+          <w:tcPr>
+            <w:tcW w:type="dxa" w:w="2160"/>
+          </w:tcPr>
+          <w:p>
+            <w:pPr>
+              <w:spacing w:before="80" w:after="80"/>
+            </w:pPr>
+            <w:r>
+              <w:rPr>
+                <w:rFonts w:ascii="Times New Roman" w:hAnsi="Times New Roman"/>
+                <w:b/>
+                <w:sz w:val="22"/>
+              </w:rPr>
+              <w:t>X25519</w:t>
+            </w:r>
+          </w:p>
+        </w:tc>
+        <w:tc>
+          <w:tcPr>
+            <w:tcW w:type="dxa" w:w="5760"/>
+          </w:tcPr>
+          <w:p>
+            <w:pPr>
+              <w:spacing w:before="80" w:after="80"/>
+            </w:pPr>
+            <w:r>
+              <w:rPr>
+                <w:rFonts w:ascii="Times New Roman" w:hAnsi="Times New Roman"/>
+                <w:sz w:val="22"/>
+              </w:rPr>
+              <w:t>Protokol pertukaran kunci Diffie-Hellman menggunakan Kurva Montgomery Curve25519 (digunakan untuk key wrapping / penyandian kunci amplop).</w:t>
+            </w:r>
+          </w:p>
+        </w:tc>
+      </w:tr>
+      <w:tr>
+        <w:tc>
+          <w:tcPr>
+            <w:tcW w:type="dxa" w:w="2160"/>
+          </w:tcPr>
+          <w:p>
+            <w:pPr>
+              <w:spacing w:before="80" w:after="80"/>
+            </w:pPr>
+            <w:r>
+              <w:rPr>
+                <w:rFonts w:ascii="Times New Roman" w:hAnsi="Times New Roman"/>
+                <w:b/>
+                <w:sz w:val="22"/>
+              </w:rPr>
+              <w:t>Ed25519</w:t>
+            </w:r>
+          </w:p>
+        </w:tc>
+        <w:tc>
+          <w:tcPr>
+            <w:tcW w:type="dxa" w:w="5760"/>
+          </w:tcPr>
+          <w:p>
+            <w:pPr>
+              <w:spacing w:before="80" w:after="80"/>
+            </w:pPr>
+            <w:r>
+              <w:rPr>
+                <w:rFonts w:ascii="Times New Roman" w:hAnsi="Times New Roman"/>
+                <w:sz w:val="22"/>
+              </w:rPr>
+              <w:t>Edwards-curve Digital Signature Algorithm menggunakan Curve25519 untuk pembuatan tanda tangan digital pejabat (nir-penyangkalan).</w:t>
+            </w:r>
+          </w:p>
+        </w:tc>
+      </w:tr>
+      <w:tr>
+        <w:tc>
+          <w:tcPr>
+            <w:tcW w:type="dxa" w:w="2160"/>
+          </w:tcPr>
+          <w:p>
+            <w:pPr>
+              <w:spacing w:before="80" w:after="80"/>
+            </w:pPr>
+            <w:r>
+              <w:rPr>
+                <w:rFonts w:ascii="Times New Roman" w:hAnsi="Times New Roman"/>
+                <w:b/>
+                <w:sz w:val="22"/>
+              </w:rPr>
+              <w:t>SHA-256</w:t>
+            </w:r>
+          </w:p>
+        </w:tc>
+        <w:tc>
+          <w:tcPr>
+            <w:tcW w:type="dxa" w:w="5760"/>
+          </w:tcPr>
+          <w:p>
+            <w:pPr>
+              <w:spacing w:before="80" w:after="80"/>
+            </w:pPr>
+            <w:r>
+              <w:rPr>
+                <w:rFonts w:ascii="Times New Roman" w:hAnsi="Times New Roman"/>
+                <w:sz w:val="22"/>
+              </w:rPr>
+              <w:t>Secure Hash Algorithm dengan panjang keluaran 256-bit untuk penjaminan integritas data dan rantai hash log audit.</w:t>
+            </w:r>
+          </w:p>
+        </w:tc>
+      </w:tr>
+      <w:tr>
+        <w:tc>
+          <w:tcPr>
+            <w:tcW w:type="dxa" w:w="2160"/>
+          </w:tcPr>
+          <w:p>
+            <w:pPr>
+              <w:spacing w:before="80" w:after="80"/>
+            </w:pPr>
+            <w:r>
+              <w:rPr>
+                <w:rFonts w:ascii="Times New Roman" w:hAnsi="Times New Roman"/>
+                <w:b/>
+                <w:sz w:val="22"/>
+              </w:rPr>
+              <w:t>PBKDF2</w:t>
+            </w:r>
+          </w:p>
+        </w:tc>
+        <w:tc>
+          <w:tcPr>
+            <w:tcW w:type="dxa" w:w="5760"/>
+          </w:tcPr>
+          <w:p>
+            <w:pPr>
+              <w:spacing w:before="80" w:after="80"/>
+            </w:pPr>
+            <w:r>
+              <w:rPr>
+                <w:rFonts w:ascii="Times New Roman" w:hAnsi="Times New Roman"/>
+                <w:sz w:val="22"/>
+              </w:rPr>
+              <w:t>Password-Based Key Derivation Function 2 untuk fungsi derivasi kunci lokal dari PIN pertahanan pengguna.</w:t>
+            </w:r>
+          </w:p>
+        </w:tc>
+      </w:tr>
+      <w:tr>
+        <w:tc>
+          <w:tcPr>
+            <w:tcW w:type="dxa" w:w="2160"/>
+          </w:tcPr>
+          <w:p>
+            <w:pPr>
+              <w:spacing w:before="80" w:after="80"/>
+            </w:pPr>
+            <w:r>
+              <w:rPr>
+                <w:rFonts w:ascii="Times New Roman" w:hAnsi="Times New Roman"/>
+                <w:b/>
+                <w:sz w:val="22"/>
+              </w:rPr>
+              <w:t>TOTP</w:t>
+            </w:r>
+          </w:p>
+        </w:tc>
+        <w:tc>
+          <w:tcPr>
+            <w:tcW w:type="dxa" w:w="5760"/>
+          </w:tcPr>
+          <w:p>
+            <w:pPr>
+              <w:spacing w:before="80" w:after="80"/>
+            </w:pPr>
+            <w:r>
+              <w:rPr>
+                <w:rFonts w:ascii="Times New Roman" w:hAnsi="Times New Roman"/>
+                <w:sz w:val="22"/>
+              </w:rPr>
+              <w:t>Time-Based One-Time Password (RFC 6238) sebagai faktor autentikasi ganda (MFA).</w:t>
+            </w:r>
+          </w:p>
+        </w:tc>
+      </w:tr>
+      <w:tr>
+        <w:tc>
+          <w:tcPr>
+            <w:tcW w:type="dxa" w:w="2160"/>
+          </w:tcPr>
+          <w:p>
+            <w:pPr>
+              <w:spacing w:before="80" w:after="80"/>
+            </w:pPr>
+            <w:r>
+              <w:rPr>
+                <w:rFonts w:ascii="Times New Roman" w:hAnsi="Times New Roman"/>
+                <w:b/>
+                <w:sz w:val="22"/>
+              </w:rPr>
+              <w:t>||</w:t>
+            </w:r>
+          </w:p>
+        </w:tc>
+        <w:tc>
+          <w:tcPr>
+            <w:tcW w:type="dxa" w:w="5760"/>
+          </w:tcPr>
+          <w:p>
+            <w:pPr>
+              <w:spacing w:before="80" w:after="80"/>
+            </w:pPr>
+            <w:r>
+              <w:rPr>
+                <w:rFonts w:ascii="Times New Roman" w:hAnsi="Times New Roman"/>
+                <w:sz w:val="22"/>
+              </w:rPr>
+              <w:t>Operator konkatenasi (penggabungan string/biner) pada perhitungan rantai jejak audit.</w:t>
+            </w:r>
+          </w:p>
+        </w:tc>
+      </w:tr>
+      <w:tr>
+        <w:tc>
+          <w:tcPr>
+            <w:tcW w:type="dxa" w:w="2160"/>
+          </w:tcPr>
+          <w:p>
+            <w:pPr>
+              <w:spacing w:before="80" w:after="80"/>
+            </w:pPr>
+            <w:r>
+              <w:rPr>
+                <w:rFonts w:ascii="Times New Roman" w:hAnsi="Times New Roman"/>
+                <w:b/>
+                <w:sz w:val="22"/>
+              </w:rPr>
+              <w:t>Zero-Trust</w:t>
+            </w:r>
+          </w:p>
+        </w:tc>
+        <w:tc>
+          <w:tcPr>
+            <w:tcW w:type="dxa" w:w="5760"/>
+          </w:tcPr>
+          <w:p>
+            <w:pPr>
+              <w:spacing w:before="80" w:after="80"/>
+            </w:pPr>
+            <w:r>
+              <w:rPr>
+                <w:rFonts w:ascii="Times New Roman" w:hAnsi="Times New Roman"/>
+                <w:sz w:val="22"/>
+              </w:rPr>
+              <w:t>Paradigma keamanan jaringan yang berasumsi bahwa tidak ada entitas yang dipercaya secara default baik di dalam maupun di luar perimeter.</w:t>
+            </w:r>
+          </w:p>
+        </w:tc>
+      </w:tr>
+      <w:tr>
+        <w:tc>
+          <w:tcPr>
+            <w:tcW w:type="dxa" w:w="2160"/>
+          </w:tcPr>
+          <w:p>
+            <w:pPr>
+              <w:spacing w:before="80" w:after="80"/>
+            </w:pPr>
+            <w:r>
+              <w:rPr>
+                <w:rFonts w:ascii="Times New Roman" w:hAnsi="Times New Roman"/>
+                <w:b/>
+                <w:sz w:val="22"/>
+              </w:rPr>
+              <w:t>OLE</w:t>
+            </w:r>
+          </w:p>
+        </w:tc>
+        <w:tc>
+          <w:tcPr>
+            <w:tcW w:type="dxa" w:w="5760"/>
+          </w:tcPr>
+          <w:p>
+            <w:pPr>
+              <w:spacing w:before="80" w:after="80"/>
+            </w:pPr>
+            <w:r>
+              <w:rPr>
+                <w:rFonts w:ascii="Times New Roman" w:hAnsi="Times New Roman"/>
+                <w:sz w:val="22"/>
+              </w:rPr>
+              <w:t>Object-Level Encryption (enkripsi dokumen pada level objek secara individu sebelum masuk ke penyimpanan).</w:t>
+            </w:r>
+          </w:p>
+        </w:tc>
+      </w:tr>
+      <w:tr>
+        <w:tc>
+          <w:tcPr>
+            <w:tcW w:type="dxa" w:w="2160"/>
+          </w:tcPr>
+          <w:p>
+            <w:pPr>
+              <w:spacing w:before="80" w:after="80"/>
+            </w:pPr>
+            <w:r>
+              <w:rPr>
+                <w:rFonts w:ascii="Times New Roman" w:hAnsi="Times New Roman"/>
+                <w:b/>
+                <w:sz w:val="22"/>
+              </w:rPr>
+              <w:t>RBAC</w:t>
+            </w:r>
+          </w:p>
+        </w:tc>
+        <w:tc>
+          <w:tcPr>
+            <w:tcW w:type="dxa" w:w="5760"/>
+          </w:tcPr>
+          <w:p>
+            <w:pPr>
+              <w:spacing w:before="80" w:after="80"/>
+            </w:pPr>
+            <w:r>
+              <w:rPr>
+                <w:rFonts w:ascii="Times New Roman" w:hAnsi="Times New Roman"/>
+                <w:sz w:val="22"/>
+              </w:rPr>
+              <w:t>Role-Based Access Control (sistem kontrol akses berbasis peran/jabatan).</w:t>
+            </w:r>
+          </w:p>
+        </w:tc>
+      </w:tr>
+      <w:tr>
+        <w:tc>
+          <w:tcPr>
+            <w:tcW w:type="dxa" w:w="2160"/>
+          </w:tcPr>
+          <w:p>
+            <w:pPr>
+              <w:spacing w:before="80" w:after="80"/>
+            </w:pPr>
+            <w:r>
+              <w:rPr>
+                <w:rFonts w:ascii="Times New Roman" w:hAnsi="Times New Roman"/>
+                <w:b/>
+                <w:sz w:val="22"/>
+              </w:rPr>
+              <w:t>Clearance</w:t>
+            </w:r>
+          </w:p>
+        </w:tc>
+        <w:tc>
+          <w:tcPr>
+            <w:tcW w:type="dxa" w:w="5760"/>
+          </w:tcPr>
+          <w:p>
+            <w:pPr>
+              <w:spacing w:before="80" w:after="80"/>
+            </w:pPr>
+            <w:r>
+              <w:rPr>
+                <w:rFonts w:ascii="Times New Roman" w:hAnsi="Times New Roman"/>
+                <w:sz w:val="22"/>
+              </w:rPr>
+              <w:t>Klasifikasi tingkat kerahasiaan dokumen (Unclassified, Restricted, Confidential, Secret).</w:t>
+            </w:r>
+          </w:p>
+        </w:tc>
+      </w:tr>
+      <w:tr>
+        <w:tc>
+          <w:tcPr>
+            <w:tcW w:type="dxa" w:w="2160"/>
+          </w:tcPr>
+          <w:p>
+            <w:pPr>
+              <w:spacing w:before="80" w:after="80"/>
+            </w:pPr>
+            <w:r>
+              <w:rPr>
+                <w:rFonts w:ascii="Times New Roman" w:hAnsi="Times New Roman"/>
+                <w:b/>
+                <w:sz w:val="22"/>
+              </w:rPr>
+              <w:t>PII</w:t>
+            </w:r>
+          </w:p>
+        </w:tc>
+        <w:tc>
+          <w:tcPr>
+            <w:tcW w:type="dxa" w:w="5760"/>
+          </w:tcPr>
+          <w:p>
+            <w:pPr>
+              <w:spacing w:before="80" w:after="80"/>
+            </w:pPr>
+            <w:r>
+              <w:rPr>
+                <w:rFonts w:ascii="Times New Roman" w:hAnsi="Times New Roman"/>
+                <w:sz w:val="22"/>
+              </w:rPr>
+              <w:t>Personally Identifiable Information (data identitas pribadi sensitif seperti NIK, NIP, nama, nominal uang).</w:t>
+            </w:r>
+          </w:p>
+        </w:tc>
+      </w:tr>
+      <w:tr>
+        <w:tc>
+          <w:tcPr>
+            <w:tcW w:type="dxa" w:w="2160"/>
+          </w:tcPr>
+          <w:p>
+            <w:pPr>
+              <w:spacing w:before="80" w:after="80"/>
+            </w:pPr>
+            <w:r>
+              <w:rPr>
+                <w:rFonts w:ascii="Times New Roman" w:hAnsi="Times New Roman"/>
+                <w:b/>
+                <w:sz w:val="22"/>
+              </w:rPr>
+              <w:t>SUS</w:t>
+            </w:r>
+          </w:p>
+        </w:tc>
+        <w:tc>
+          <w:tcPr>
+            <w:tcW w:type="dxa" w:w="5760"/>
+          </w:tcPr>
+          <w:p>
+            <w:pPr>
+              <w:spacing w:before="80" w:after="80"/>
+            </w:pPr>
+            <w:r>
+              <w:rPr>
+                <w:rFonts w:ascii="Times New Roman" w:hAnsi="Times New Roman"/>
+                <w:sz w:val="22"/>
+              </w:rPr>
+              <w:t>System Usability Scale (kuesioner standar kegunaan antarmuka).</w:t>
+            </w:r>
+          </w:p>
+        </w:tc>
+      </w:tr>
+    </w:tbl>
     <w:p>
       <w:pPr>
         <w:spacing w:after="0" w:line="276" w:lineRule="auto"/>

</xml_diff>